<commit_message>
Release µFT 0.2.0 color webfonts and µCSS 2.5.18 manuals.
Package existing COLR/CPAL, SVG-in-OT, CBDT and sbix fonts as WOFF/WOFF2 without dropping color tables.
</commit_message>
<xml_diff>
--- a/gulp-mu-css/docs/microCSS-de.docx
+++ b/gulp-mu-css/docs/microCSS-de.docx
@@ -136,7 +136,7 @@
           <w:sz w:val="24"/>
           <w:szCs w:val="24"/>
         </w:rPr>
-        <w:t>Version 2.5.17</w:t>
+        <w:t>Version 2.5.18</w:t>
       </w:r>
     </w:p>
     <w:p>
@@ -151,7 +151,7 @@
           <w:sz w:val="24"/>
           <w:szCs w:val="24"/>
         </w:rPr>
-        <w:t>2026-09-18</w:t>
+        <w:t>2026-09-24</w:t>
       </w:r>
     </w:p>
     <w:p>
@@ -215,7 +215,7 @@
             </w:rPr>
             <w:fldChar w:fldCharType="separate"/>
           </w:r>
-          <w:hyperlink w:anchor="__RefHeading___Toc5389_825272777" w:tooltip="1 Einführung">
+          <w:hyperlink w:anchor="__RefHeading___Toc5444_2460123423" w:tooltip="1 Einführung">
             <w:r>
               <w:rPr>
                 <w:rStyle w:val="Verzeichnissprung"/>
@@ -235,7 +235,7 @@
             </w:tabs>
             <w:rPr/>
           </w:pPr>
-          <w:hyperlink w:anchor="__RefHeading___Toc5391_825272777" w:tooltip="1.1 Paketversionen und µGulp ready">
+          <w:hyperlink w:anchor="__RefHeading___Toc5446_2460123423" w:tooltip="1.1 Paketversionen und µGulp ready">
             <w:r>
               <w:rPr>
                 <w:rStyle w:val="Verzeichnissprung"/>
@@ -255,7 +255,7 @@
             </w:tabs>
             <w:rPr/>
           </w:pPr>
-          <w:hyperlink w:anchor="__RefHeading___Toc5393_825272777" w:tooltip="1.2 Werkzeuge und Kosten">
+          <w:hyperlink w:anchor="__RefHeading___Toc5448_2460123423" w:tooltip="1.2 Werkzeuge und Kosten">
             <w:r>
               <w:rPr>
                 <w:rStyle w:val="Verzeichnissprung"/>
@@ -275,7 +275,7 @@
             </w:tabs>
             <w:rPr/>
           </w:pPr>
-          <w:hyperlink w:anchor="__RefHeading___Toc5395_825272777" w:tooltip="1.3 Draft-Workflow (Authoring + Watch)">
+          <w:hyperlink w:anchor="__RefHeading___Toc5450_2460123423" w:tooltip="1.3 Draft-Workflow (Authoring + Watch)">
             <w:r>
               <w:rPr>
                 <w:rStyle w:val="Verzeichnissprung"/>
@@ -295,7 +295,7 @@
             </w:tabs>
             <w:rPr/>
           </w:pPr>
-          <w:hyperlink w:anchor="__RefHeading___Toc5397_825272777" w:tooltip="1.3.1 Photopea (Browser, optional)">
+          <w:hyperlink w:anchor="__RefHeading___Toc5452_2460123423" w:tooltip="1.3.1 Photopea (Browser, optional)">
             <w:r>
               <w:rPr>
                 <w:rStyle w:val="Verzeichnissprung"/>
@@ -315,7 +315,7 @@
             </w:tabs>
             <w:rPr/>
           </w:pPr>
-          <w:hyperlink w:anchor="__RefHeading___Toc5399_825272777" w:tooltip="1.4 Einordnung: Warum µCSS™?">
+          <w:hyperlink w:anchor="__RefHeading___Toc5454_2460123423" w:tooltip="1.4 Einordnung: Warum µCSS™?">
             <w:r>
               <w:rPr>
                 <w:rStyle w:val="Verzeichnissprung"/>
@@ -335,7 +335,7 @@
             </w:tabs>
             <w:rPr/>
           </w:pPr>
-          <w:hyperlink w:anchor="__RefHeading___Toc5401_825272777" w:tooltip="2 Installation und Start">
+          <w:hyperlink w:anchor="__RefHeading___Toc5456_2460123423" w:tooltip="2 Installation und Start">
             <w:r>
               <w:rPr>
                 <w:rStyle w:val="Verzeichnissprung"/>
@@ -355,7 +355,7 @@
             </w:tabs>
             <w:rPr/>
           </w:pPr>
-          <w:hyperlink w:anchor="__RefHeading___Toc5403_825272777" w:tooltip="3 Anwendungsfälle">
+          <w:hyperlink w:anchor="__RefHeading___Toc5458_2460123423" w:tooltip="3 Anwendungsfälle">
             <w:r>
               <w:rPr>
                 <w:rStyle w:val="Verzeichnissprung"/>
@@ -375,7 +375,7 @@
             </w:tabs>
             <w:rPr/>
           </w:pPr>
-          <w:hyperlink w:anchor="__RefHeading___Toc5405_825272777" w:tooltip="3.1 Benannte Eigenschaften (Variablen)">
+          <w:hyperlink w:anchor="__RefHeading___Toc5460_2460123423" w:tooltip="3.1 Benannte Eigenschaften (Variablen)">
             <w:r>
               <w:rPr>
                 <w:rStyle w:val="Verzeichnissprung"/>
@@ -395,7 +395,7 @@
             </w:tabs>
             <w:rPr/>
           </w:pPr>
-          <w:hyperlink w:anchor="__RefHeading___Toc5407_825272777" w:tooltip="3.2 Berechnungen und Ausdrücke">
+          <w:hyperlink w:anchor="__RefHeading___Toc5462_2460123423" w:tooltip="3.2 Berechnungen und Ausdrücke">
             <w:r>
               <w:rPr>
                 <w:rStyle w:val="Verzeichnissprung"/>
@@ -415,7 +415,7 @@
             </w:tabs>
             <w:rPr/>
           </w:pPr>
-          <w:hyperlink w:anchor="__RefHeading___Toc5409_825272777" w:tooltip="3.3 Mehrere Layouts über Skin-Manifeste">
+          <w:hyperlink w:anchor="__RefHeading___Toc5464_2460123423" w:tooltip="3.3 Mehrere Layouts über Skin-Manifeste">
             <w:r>
               <w:rPr>
                 <w:rStyle w:val="Verzeichnissprung"/>
@@ -435,7 +435,7 @@
             </w:tabs>
             <w:rPr/>
           </w:pPr>
-          <w:hyperlink w:anchor="__RefHeading___Toc5411_825272777" w:tooltip="3.4 Automatische Sprite-Generierung">
+          <w:hyperlink w:anchor="__RefHeading___Toc5466_2460123423" w:tooltip="3.4 Automatische Sprite-Generierung">
             <w:r>
               <w:rPr>
                 <w:rStyle w:val="Verzeichnissprung"/>
@@ -455,7 +455,7 @@
             </w:tabs>
             <w:rPr/>
           </w:pPr>
-          <w:hyperlink w:anchor="__RefHeading___Toc5413_825272777" w:tooltip="3.5 Data-URI-Inlining (DataUri)">
+          <w:hyperlink w:anchor="__RefHeading___Toc5468_2460123423" w:tooltip="3.5 Data-URI-Inlining (DataUri)">
             <w:r>
               <w:rPr>
                 <w:rStyle w:val="Verzeichnissprung"/>
@@ -475,7 +475,7 @@
             </w:tabs>
             <w:rPr/>
           </w:pPr>
-          <w:hyperlink w:anchor="__RefHeading___Toc5415_825272777" w:tooltip="3.6 Bilder vorladen (Preload)">
+          <w:hyperlink w:anchor="__RefHeading___Toc5470_2460123423" w:tooltip="3.6 Bilder vorladen (Preload)">
             <w:r>
               <w:rPr>
                 <w:rStyle w:val="Verzeichnissprung"/>
@@ -495,7 +495,7 @@
             </w:tabs>
             <w:rPr/>
           </w:pPr>
-          <w:hyperlink w:anchor="__RefHeading___Toc5417_825272777" w:tooltip="3.7 Cursor mit Hotspot und Fallback">
+          <w:hyperlink w:anchor="__RefHeading___Toc5472_2460123423" w:tooltip="3.7 Cursor mit Hotspot und Fallback">
             <w:r>
               <w:rPr>
                 <w:rStyle w:val="Verzeichnissprung"/>
@@ -515,7 +515,7 @@
             </w:tabs>
             <w:rPr/>
           </w:pPr>
-          <w:hyperlink w:anchor="__RefHeading___Toc5419_825272777" w:tooltip="3.8 Automatische Bilderzeugung (media-Steps)">
+          <w:hyperlink w:anchor="__RefHeading___Toc5474_2460123423" w:tooltip="3.8 Automatische Bilderzeugung (media-Steps)">
             <w:r>
               <w:rPr>
                 <w:rStyle w:val="Verzeichnissprung"/>
@@ -535,7 +535,7 @@
             </w:tabs>
             <w:rPr/>
           </w:pPr>
-          <w:hyperlink w:anchor="__RefHeading___Toc5421_825272777" w:tooltip="3.8.1 Eigene media-Steps (Plugins)">
+          <w:hyperlink w:anchor="__RefHeading___Toc5476_2460123423" w:tooltip="3.8.1 Eigene media-Steps (Plugins)">
             <w:r>
               <w:rPr>
                 <w:rStyle w:val="Verzeichnissprung"/>
@@ -555,7 +555,7 @@
             </w:tabs>
             <w:rPr/>
           </w:pPr>
-          <w:hyperlink w:anchor="__RefHeading___Toc5423_825272777" w:tooltip="4 microPS (µPS) — Bildgeneratoren">
+          <w:hyperlink w:anchor="__RefHeading___Toc5478_2460123423" w:tooltip="4 microPS (µPS) — Bildgeneratoren">
             <w:r>
               <w:rPr>
                 <w:rStyle w:val="Verzeichnissprung"/>
@@ -575,7 +575,7 @@
             </w:tabs>
             <w:rPr/>
           </w:pPr>
-          <w:hyperlink w:anchor="__RefHeading___Toc5425_825272777" w:tooltip="4.1 API-Übersicht">
+          <w:hyperlink w:anchor="__RefHeading___Toc5480_2460123423" w:tooltip="4.1 API-Übersicht">
             <w:r>
               <w:rPr>
                 <w:rStyle w:val="Verzeichnissprung"/>
@@ -595,7 +595,7 @@
             </w:tabs>
             <w:rPr/>
           </w:pPr>
-          <w:hyperlink w:anchor="__RefHeading___Toc5427_825272777" w:tooltip="4.2 ButtonAndIconCreator">
+          <w:hyperlink w:anchor="__RefHeading___Toc5482_2460123423" w:tooltip="4.2 ButtonAndIconCreator">
             <w:r>
               <w:rPr>
                 <w:rStyle w:val="Verzeichnissprung"/>
@@ -615,7 +615,7 @@
             </w:tabs>
             <w:rPr/>
           </w:pPr>
-          <w:hyperlink w:anchor="__RefHeading___Toc5429_825272777" w:tooltip="4.2.1 CreateByTopLayerSets — ein Bild pro Gruppe">
+          <w:hyperlink w:anchor="__RefHeading___Toc5484_2460123423" w:tooltip="4.2.1 CreateByTopLayerSets — ein Bild pro Gruppe">
             <w:r>
               <w:rPr>
                 <w:rStyle w:val="Verzeichnissprung"/>
@@ -635,7 +635,7 @@
             </w:tabs>
             <w:rPr/>
           </w:pPr>
-          <w:hyperlink w:anchor="__RefHeading___Toc5431_825272777" w:tooltip="4.3 AppIconMaker">
+          <w:hyperlink w:anchor="__RefHeading___Toc5486_2460123423" w:tooltip="4.3 AppIconMaker">
             <w:r>
               <w:rPr>
                 <w:rStyle w:val="Verzeichnissprung"/>
@@ -655,7 +655,7 @@
             </w:tabs>
             <w:rPr/>
           </w:pPr>
-          <w:hyperlink w:anchor="__RefHeading___Toc5433_825272777" w:tooltip="4.4 SpriteAtlas und TileSheet">
+          <w:hyperlink w:anchor="__RefHeading___Toc5488_2460123423" w:tooltip="4.4 SpriteAtlas und TileSheet">
             <w:r>
               <w:rPr>
                 <w:rStyle w:val="Verzeichnissprung"/>
@@ -675,7 +675,7 @@
             </w:tabs>
             <w:rPr/>
           </w:pPr>
-          <w:hyperlink w:anchor="__RefHeading___Toc5435_825272777" w:tooltip="4.5 SequenceStrip und DSD-Format">
+          <w:hyperlink w:anchor="__RefHeading___Toc5490_2460123423" w:tooltip="4.5 SequenceStrip und DSD-Format">
             <w:r>
               <w:rPr>
                 <w:rStyle w:val="Verzeichnissprung"/>
@@ -695,7 +695,7 @@
             </w:tabs>
             <w:rPr/>
           </w:pPr>
-          <w:hyperlink w:anchor="__RefHeading___Toc5437_825272777" w:tooltip="4.5.1 DSD erzeugen (`CreateDsdFromImages`)">
+          <w:hyperlink w:anchor="__RefHeading___Toc5492_2460123423" w:tooltip="4.5.1 DSD erzeugen (`CreateDsdFromImages`)">
             <w:r>
               <w:rPr>
                 <w:rStyle w:val="Verzeichnissprung"/>
@@ -715,7 +715,7 @@
             </w:tabs>
             <w:rPr/>
           </w:pPr>
-          <w:hyperlink w:anchor="__RefHeading___Toc5439_825272777" w:tooltip="4.5.2 PSD-Sequenzgruppen">
+          <w:hyperlink w:anchor="__RefHeading___Toc5494_2460123423" w:tooltip="4.5.2 PSD-Sequenzgruppen">
             <w:r>
               <w:rPr>
                 <w:rStyle w:val="Verzeichnissprung"/>
@@ -735,7 +735,7 @@
             </w:tabs>
             <w:rPr/>
           </w:pPr>
-          <w:hyperlink w:anchor="__RefHeading___Toc5441_825272777" w:tooltip="4.6 Raster-Modell, I/O und Arbeitsblatt">
+          <w:hyperlink w:anchor="__RefHeading___Toc5496_2460123423" w:tooltip="4.6 Raster-Modell, I/O und Arbeitsblatt">
             <w:r>
               <w:rPr>
                 <w:rStyle w:val="Verzeichnissprung"/>
@@ -755,7 +755,7 @@
             </w:tabs>
             <w:rPr/>
           </w:pPr>
-          <w:hyperlink w:anchor="__RefHeading___Toc5443_825272777" w:tooltip="4.7 Bildanpassungen und Masken">
+          <w:hyperlink w:anchor="__RefHeading___Toc5498_2460123423" w:tooltip="4.7 Bildanpassungen und Masken">
             <w:r>
               <w:rPr>
                 <w:rStyle w:val="Verzeichnissprung"/>
@@ -775,7 +775,7 @@
             </w:tabs>
             <w:rPr/>
           </w:pPr>
-          <w:hyperlink w:anchor="__RefHeading___Toc5445_825272777" w:tooltip="4.7.1 Masken">
+          <w:hyperlink w:anchor="__RefHeading___Toc5500_2460123423" w:tooltip="4.7.1 Masken">
             <w:r>
               <w:rPr>
                 <w:rStyle w:val="Verzeichnissprung"/>
@@ -795,7 +795,7 @@
             </w:tabs>
             <w:rPr/>
           </w:pPr>
-          <w:hyperlink w:anchor="__RefHeading___Toc5447_825272777" w:tooltip="4.7.2 Auswahl-Engine">
+          <w:hyperlink w:anchor="__RefHeading___Toc5502_2460123423" w:tooltip="4.7.2 Auswahl-Engine">
             <w:r>
               <w:rPr>
                 <w:rStyle w:val="Verzeichnissprung"/>
@@ -815,7 +815,7 @@
             </w:tabs>
             <w:rPr/>
           </w:pPr>
-          <w:hyperlink w:anchor="__RefHeading___Toc5449_825272777" w:tooltip="4.7.3 ApplyGamma">
+          <w:hyperlink w:anchor="__RefHeading___Toc5504_2460123423" w:tooltip="4.7.3 ApplyGamma">
             <w:r>
               <w:rPr>
                 <w:rStyle w:val="Verzeichnissprung"/>
@@ -835,7 +835,7 @@
             </w:tabs>
             <w:rPr/>
           </w:pPr>
-          <w:hyperlink w:anchor="__RefHeading___Toc5451_825272777" w:tooltip="4.7.4 ApplyBrightnessContrast">
+          <w:hyperlink w:anchor="__RefHeading___Toc5506_2460123423" w:tooltip="4.7.4 ApplyBrightnessContrast">
             <w:r>
               <w:rPr>
                 <w:rStyle w:val="Verzeichnissprung"/>
@@ -855,7 +855,7 @@
             </w:tabs>
             <w:rPr/>
           </w:pPr>
-          <w:hyperlink w:anchor="__RefHeading___Toc5453_825272777" w:tooltip="4.7.5 ApplyHueSaturation">
+          <w:hyperlink w:anchor="__RefHeading___Toc5508_2460123423" w:tooltip="4.7.5 ApplyHueSaturation">
             <w:r>
               <w:rPr>
                 <w:rStyle w:val="Verzeichnissprung"/>
@@ -875,7 +875,7 @@
             </w:tabs>
             <w:rPr/>
           </w:pPr>
-          <w:hyperlink w:anchor="__RefHeading___Toc5455_825272777" w:tooltip="4.7.6 ApplyAdjustmentStack">
+          <w:hyperlink w:anchor="__RefHeading___Toc5510_2460123423" w:tooltip="4.7.6 ApplyAdjustmentStack">
             <w:r>
               <w:rPr>
                 <w:rStyle w:val="Verzeichnissprung"/>
@@ -895,7 +895,7 @@
             </w:tabs>
             <w:rPr/>
           </w:pPr>
-          <w:hyperlink w:anchor="__RefHeading___Toc5457_825272777" w:tooltip="4.8 Raster-Transformationen">
+          <w:hyperlink w:anchor="__RefHeading___Toc5512_2460123423" w:tooltip="4.8 Raster-Transformationen">
             <w:r>
               <w:rPr>
                 <w:rStyle w:val="Verzeichnissprung"/>
@@ -915,7 +915,7 @@
             </w:tabs>
             <w:rPr/>
           </w:pPr>
-          <w:hyperlink w:anchor="__RefHeading___Toc5459_825272777" w:tooltip="4.9 ExtendScript-Einstieg (`MuPsDoc`)">
+          <w:hyperlink w:anchor="__RefHeading___Toc5514_2460123423" w:tooltip="4.9 ExtendScript-Einstieg (`MuPsDoc`)">
             <w:r>
               <w:rPr>
                 <w:rStyle w:val="Verzeichnissprung"/>
@@ -935,7 +935,7 @@
             </w:tabs>
             <w:rPr/>
           </w:pPr>
-          <w:hyperlink w:anchor="__RefHeading___Toc5461_825272777" w:tooltip="4.10 PSD-Compositor und Ebenenzusammenführung">
+          <w:hyperlink w:anchor="__RefHeading___Toc5516_2460123423" w:tooltip="4.10 PSD-Compositor und Ebenenzusammenführung">
             <w:r>
               <w:rPr>
                 <w:rStyle w:val="Verzeichnissprung"/>
@@ -955,7 +955,7 @@
             </w:tabs>
             <w:rPr/>
           </w:pPr>
-          <w:hyperlink w:anchor="__RefHeading___Toc5463_825272777" w:tooltip="4.10.1 Nachgebildete Fülloptionen (Layer Styles)">
+          <w:hyperlink w:anchor="__RefHeading___Toc5518_2460123423" w:tooltip="4.10.1 Nachgebildete Fülloptionen (Layer Styles)">
             <w:r>
               <w:rPr>
                 <w:rStyle w:val="Verzeichnissprung"/>
@@ -975,7 +975,7 @@
             </w:tabs>
             <w:rPr/>
           </w:pPr>
-          <w:hyperlink w:anchor="__RefHeading___Toc5465_825272777" w:tooltip="4.10.2 Stilübertragung (ButtonAndIconCreator) vs. Ebenenverknüpfung">
+          <w:hyperlink w:anchor="__RefHeading___Toc5520_2460123423" w:tooltip="4.10.2 Stilübertragung (ButtonAndIconCreator) vs. Ebenenverknüpfung">
             <w:r>
               <w:rPr>
                 <w:rStyle w:val="Verzeichnissprung"/>
@@ -995,7 +995,7 @@
             </w:tabs>
             <w:rPr/>
           </w:pPr>
-          <w:hyperlink w:anchor="__RefHeading___Toc5467_825272777" w:tooltip="4.10.3 Deckkraft-Modell (drei getrennte Stellschrauben)">
+          <w:hyperlink w:anchor="__RefHeading___Toc5522_2460123423" w:tooltip="4.10.3 Deckkraft-Modell (drei getrennte Stellschrauben)">
             <w:r>
               <w:rPr>
                 <w:rStyle w:val="Verzeichnissprung"/>
@@ -1015,7 +1015,7 @@
             </w:tabs>
             <w:rPr/>
           </w:pPr>
-          <w:hyperlink w:anchor="__RefHeading___Toc5469_825272777" w:tooltip="4.10.4 Referenz-PSD und Adobe-Ground-Truth">
+          <w:hyperlink w:anchor="__RefHeading___Toc5524_2460123423" w:tooltip="4.10.4 Referenz-PSD und Adobe-Ground-Truth">
             <w:r>
               <w:rPr>
                 <w:rStyle w:val="Verzeichnissprung"/>
@@ -1035,7 +1035,7 @@
             </w:tabs>
             <w:rPr/>
           </w:pPr>
-          <w:hyperlink w:anchor="__RefHeading___Toc5471_825272777" w:tooltip="4.10.5 Werkzeuge (µPS-Entwicklung)">
+          <w:hyperlink w:anchor="__RefHeading___Toc5526_2460123423" w:tooltip="4.10.5 Werkzeuge (µPS-Entwicklung)">
             <w:r>
               <w:rPr>
                 <w:rStyle w:val="Verzeichnissprung"/>
@@ -1055,7 +1055,7 @@
             </w:tabs>
             <w:rPr/>
           </w:pPr>
-          <w:hyperlink w:anchor="__RefHeading___Toc5473_825272777" w:tooltip="4.11 Draft-Workflow (Authoring + Watch)">
+          <w:hyperlink w:anchor="__RefHeading___Toc5528_2460123423" w:tooltip="4.11 Draft-Workflow (Authoring + Watch)">
             <w:r>
               <w:rPr>
                 <w:rStyle w:val="Verzeichnissprung"/>
@@ -1075,7 +1075,7 @@
             </w:tabs>
             <w:rPr/>
           </w:pPr>
-          <w:hyperlink w:anchor="__RefHeading___Toc5475_825272777" w:tooltip="4.11.1 Zwischenschritte raw → final (`outputBase`)">
+          <w:hyperlink w:anchor="__RefHeading___Toc5530_2460123423" w:tooltip="4.11.1 Zwischenschritte raw → final (`outputBase`)">
             <w:r>
               <w:rPr>
                 <w:rStyle w:val="Verzeichnissprung"/>
@@ -1095,7 +1095,7 @@
             </w:tabs>
             <w:rPr/>
           </w:pPr>
-          <w:hyperlink w:anchor="__RefHeading___Toc5477_825272777" w:tooltip="5 microAU (µAU) — Sound-Atlas">
+          <w:hyperlink w:anchor="__RefHeading___Toc5532_2460123423" w:tooltip="5 microAU (µAU) — Sound-Atlas">
             <w:r>
               <w:rPr>
                 <w:rStyle w:val="Verzeichnissprung"/>
@@ -1115,7 +1115,7 @@
             </w:tabs>
             <w:rPr/>
           </w:pPr>
-          <w:hyperlink w:anchor="__RefHeading___Toc5479_825272777" w:tooltip="5.1 API-Übersicht">
+          <w:hyperlink w:anchor="__RefHeading___Toc5534_2460123423" w:tooltip="5.1 API-Übersicht">
             <w:r>
               <w:rPr>
                 <w:rStyle w:val="Verzeichnissprung"/>
@@ -1135,7 +1135,7 @@
             </w:tabs>
             <w:rPr/>
           </w:pPr>
-          <w:hyperlink w:anchor="__RefHeading___Toc5481_825272777" w:tooltip="5.2 SoundAtlasMaker">
+          <w:hyperlink w:anchor="__RefHeading___Toc5536_2460123423" w:tooltip="5.2 SoundAtlasMaker">
             <w:r>
               <w:rPr>
                 <w:rStyle w:val="Verzeichnissprung"/>
@@ -1155,7 +1155,7 @@
             </w:tabs>
             <w:rPr/>
           </w:pPr>
-          <w:hyperlink w:anchor="__RefHeading___Toc5483_825272777" w:tooltip="5.2.1 Loop-Punkte im Dateinamen">
+          <w:hyperlink w:anchor="__RefHeading___Toc5538_2460123423" w:tooltip="5.2.1 Loop-Punkte im Dateinamen">
             <w:r>
               <w:rPr>
                 <w:rStyle w:val="Verzeichnissprung"/>
@@ -1175,7 +1175,7 @@
             </w:tabs>
             <w:rPr/>
           </w:pPr>
-          <w:hyperlink w:anchor="__RefHeading___Toc5485_825272777" w:tooltip="5.2.2 JSON-Format">
+          <w:hyperlink w:anchor="__RefHeading___Toc5540_2460123423" w:tooltip="5.2.2 JSON-Format">
             <w:r>
               <w:rPr>
                 <w:rStyle w:val="Verzeichnissprung"/>
@@ -1195,7 +1195,7 @@
             </w:tabs>
             <w:rPr/>
           </w:pPr>
-          <w:hyperlink w:anchor="__RefHeading___Toc5487_825272777" w:tooltip="5.2.3 MP3-Eingaben">
+          <w:hyperlink w:anchor="__RefHeading___Toc5542_2460123423" w:tooltip="5.2.3 MP3-Eingaben">
             <w:r>
               <w:rPr>
                 <w:rStyle w:val="Verzeichnissprung"/>
@@ -1215,7 +1215,7 @@
             </w:tabs>
             <w:rPr/>
           </w:pPr>
-          <w:hyperlink w:anchor="__RefHeading___Toc5489_825272777" w:tooltip="5.3 Anbindung an µCSS™ (Manifest `sounds`)">
+          <w:hyperlink w:anchor="__RefHeading___Toc5544_2460123423" w:tooltip="5.3 Anbindung an µCSS™ (Manifest `sounds`)">
             <w:r>
               <w:rPr>
                 <w:rStyle w:val="Verzeichnissprung"/>
@@ -1235,7 +1235,7 @@
             </w:tabs>
             <w:rPr/>
           </w:pPr>
-          <w:hyperlink w:anchor="__RefHeading___Toc5491_825272777" w:tooltip="5.3.1 Geplant: CSS-Sounds, Auto-Wiring &amp; Handler-Overrides">
+          <w:hyperlink w:anchor="__RefHeading___Toc5546_2460123423" w:tooltip="5.3.1 Geplant: CSS-Sounds, Auto-Wiring &amp; Handler-Overrides">
             <w:r>
               <w:rPr>
                 <w:rStyle w:val="Verzeichnissprung"/>
@@ -1255,7 +1255,7 @@
             </w:tabs>
             <w:rPr/>
           </w:pPr>
-          <w:hyperlink w:anchor="__RefHeading___Toc5493_825272777" w:tooltip="6 microFT (µFT) — Icon-Font">
+          <w:hyperlink w:anchor="__RefHeading___Toc5548_2460123423" w:tooltip="6 microFT (µFT) — Icon-Font">
             <w:r>
               <w:rPr>
                 <w:rStyle w:val="Verzeichnissprung"/>
@@ -1275,7 +1275,7 @@
             </w:tabs>
             <w:rPr/>
           </w:pPr>
-          <w:hyperlink w:anchor="__RefHeading___Toc5495_825272777" w:tooltip="6.1 Glyphen-Benennung">
+          <w:hyperlink w:anchor="__RefHeading___Toc5550_2460123423" w:tooltip="6.1 Glyphen-Benennung">
             <w:r>
               <w:rPr>
                 <w:rStyle w:val="Verzeichnissprung"/>
@@ -1295,7 +1295,7 @@
             </w:tabs>
             <w:rPr/>
           </w:pPr>
-          <w:hyperlink w:anchor="__RefHeading___Toc5497_825272777" w:tooltip="6.2 FontGenerator">
+          <w:hyperlink w:anchor="__RefHeading___Toc5552_2460123423" w:tooltip="6.2 FontGenerator">
             <w:r>
               <w:rPr>
                 <w:rStyle w:val="Verzeichnissprung"/>
@@ -1315,7 +1315,7 @@
             </w:tabs>
             <w:rPr/>
           </w:pPr>
-          <w:hyperlink w:anchor="__RefHeading___Toc5499_825272777" w:tooltip="6.3 API-Bausteine">
+          <w:hyperlink w:anchor="__RefHeading___Toc5554_2460123423" w:tooltip="6.3 API-Bausteine">
             <w:r>
               <w:rPr>
                 <w:rStyle w:val="Verzeichnissprung"/>
@@ -1335,12 +1335,32 @@
             </w:tabs>
             <w:rPr/>
           </w:pPr>
-          <w:hyperlink w:anchor="__RefHeading___Toc5501_825272777" w:tooltip="6.4 Anbindung an µCSS™">
+          <w:hyperlink w:anchor="__RefHeading___Toc5556_2460123423" w:tooltip="6.4 Color Fonts und Emoji-Fonts">
             <w:r>
               <w:rPr>
                 <w:rStyle w:val="Verzeichnissprung"/>
               </w:rPr>
-              <w:t>6.4 Anbindung an µCSS™</w:t>
+              <w:t>6.4 Color Fonts und Emoji-Fonts</w:t>
+              <w:tab/>
+              <w:t>31</w:t>
+            </w:r>
+          </w:hyperlink>
+        </w:p>
+        <w:p>
+          <w:pPr>
+            <w:pStyle w:val="TOC2"/>
+            <w:tabs>
+              <w:tab w:val="clear" w:pos="8743"/>
+              <w:tab w:val="right" w:pos="9025" w:leader="dot"/>
+            </w:tabs>
+            <w:rPr/>
+          </w:pPr>
+          <w:hyperlink w:anchor="__RefHeading___Toc5558_2460123423" w:tooltip="6.5 Anbindung an µCSS™">
+            <w:r>
+              <w:rPr>
+                <w:rStyle w:val="Verzeichnissprung"/>
+              </w:rPr>
+              <w:t>6.5 Anbindung an µCSS™</w:t>
               <w:tab/>
               <w:t>31</w:t>
             </w:r>
@@ -1355,14 +1375,14 @@
             </w:tabs>
             <w:rPr/>
           </w:pPr>
-          <w:hyperlink w:anchor="__RefHeading___Toc5503_825272777" w:tooltip="7 Vue und Komponenten-Co-Location">
+          <w:hyperlink w:anchor="__RefHeading___Toc5560_2460123423" w:tooltip="7 Vue und Komponenten-Co-Location">
             <w:r>
               <w:rPr>
                 <w:rStyle w:val="Verzeichnissprung"/>
               </w:rPr>
               <w:t>7 Vue und Komponenten-Co-Location</w:t>
               <w:tab/>
-              <w:t>32</w:t>
+              <w:t>33</w:t>
             </w:r>
           </w:hyperlink>
         </w:p>
@@ -1375,14 +1395,14 @@
             </w:tabs>
             <w:rPr/>
           </w:pPr>
-          <w:hyperlink w:anchor="__RefHeading___Toc5505_825272777" w:tooltip="7.1 Ablauf">
+          <w:hyperlink w:anchor="__RefHeading___Toc5562_2460123423" w:tooltip="7.1 Ablauf">
             <w:r>
               <w:rPr>
                 <w:rStyle w:val="Verzeichnissprung"/>
               </w:rPr>
               <w:t>7.1 Ablauf</w:t>
               <w:tab/>
-              <w:t>32</w:t>
+              <w:t>33</w:t>
             </w:r>
           </w:hyperlink>
         </w:p>
@@ -1395,14 +1415,14 @@
             </w:tabs>
             <w:rPr/>
           </w:pPr>
-          <w:hyperlink w:anchor="__RefHeading___Toc5507_825272777" w:tooltip="7.2 Namespaces und globale State-Klassen">
+          <w:hyperlink w:anchor="__RefHeading___Toc5564_2460123423" w:tooltip="7.2 Namespaces und globale State-Klassen">
             <w:r>
               <w:rPr>
                 <w:rStyle w:val="Verzeichnissprung"/>
               </w:rPr>
               <w:t>7.2 Namespaces und globale State-Klassen</w:t>
               <w:tab/>
-              <w:t>32</w:t>
+              <w:t>33</w:t>
             </w:r>
           </w:hyperlink>
         </w:p>
@@ -1415,14 +1435,14 @@
             </w:tabs>
             <w:rPr/>
           </w:pPr>
-          <w:hyperlink w:anchor="__RefHeading___Toc5509_825272777" w:tooltip="7.3 Bestehende Vue-SFCs migrieren">
+          <w:hyperlink w:anchor="__RefHeading___Toc5566_2460123423" w:tooltip="7.3 Bestehende Vue-SFCs migrieren">
             <w:r>
               <w:rPr>
                 <w:rStyle w:val="Verzeichnissprung"/>
               </w:rPr>
               <w:t>7.3 Bestehende Vue-SFCs migrieren</w:t>
               <w:tab/>
-              <w:t>32</w:t>
+              <w:t>33</w:t>
             </w:r>
           </w:hyperlink>
         </w:p>
@@ -1435,14 +1455,14 @@
             </w:tabs>
             <w:rPr/>
           </w:pPr>
-          <w:hyperlink w:anchor="__RefHeading___Toc5511_825272777" w:tooltip="8 Grundideen von µCSS™">
+          <w:hyperlink w:anchor="__RefHeading___Toc5568_2460123423" w:tooltip="8 Grundideen von µCSS™">
             <w:r>
               <w:rPr>
                 <w:rStyle w:val="Verzeichnissprung"/>
               </w:rPr>
               <w:t>8 Grundideen von µCSS™</w:t>
               <w:tab/>
-              <w:t>33</w:t>
+              <w:t>34</w:t>
             </w:r>
           </w:hyperlink>
         </w:p>
@@ -1455,14 +1475,14 @@
             </w:tabs>
             <w:rPr/>
           </w:pPr>
-          <w:hyperlink w:anchor="__RefHeading___Toc5513_825272777" w:tooltip="8.1 Das .µ.css-Format">
+          <w:hyperlink w:anchor="__RefHeading___Toc5570_2460123423" w:tooltip="8.1 Das .µ.css-Format">
             <w:r>
               <w:rPr>
                 <w:rStyle w:val="Verzeichnissprung"/>
               </w:rPr>
               <w:t>8.1 Das .µ.css-Format</w:t>
               <w:tab/>
-              <w:t>33</w:t>
+              <w:t>34</w:t>
             </w:r>
           </w:hyperlink>
         </w:p>
@@ -1475,14 +1495,14 @@
             </w:tabs>
             <w:rPr/>
           </w:pPr>
-          <w:hyperlink w:anchor="__RefHeading___Toc5515_825272777" w:tooltip="8.2 Werte-Interpolation µ(Ausdruck)">
+          <w:hyperlink w:anchor="__RefHeading___Toc5572_2460123423" w:tooltip="8.2 Werte-Interpolation µ(Ausdruck)">
             <w:r>
               <w:rPr>
                 <w:rStyle w:val="Verzeichnissprung"/>
               </w:rPr>
               <w:t>8.2 Werte-Interpolation µ(Ausdruck)</w:t>
               <w:tab/>
-              <w:t>33</w:t>
+              <w:t>34</w:t>
             </w:r>
           </w:hyperlink>
         </w:p>
@@ -1495,14 +1515,14 @@
             </w:tabs>
             <w:rPr/>
           </w:pPr>
-          <w:hyperlink w:anchor="__RefHeading___Toc5517_825272777" w:tooltip="8.3 Direktiven -µ: Ausdruck">
+          <w:hyperlink w:anchor="__RefHeading___Toc5574_2460123423" w:tooltip="8.3 Direktiven -µ: Ausdruck">
             <w:r>
               <w:rPr>
                 <w:rStyle w:val="Verzeichnissprung"/>
               </w:rPr>
               <w:t>8.3 Direktiven -µ: Ausdruck</w:t>
               <w:tab/>
-              <w:t>33</w:t>
+              <w:t>34</w:t>
             </w:r>
           </w:hyperlink>
         </w:p>
@@ -1515,14 +1535,14 @@
             </w:tabs>
             <w:rPr/>
           </w:pPr>
-          <w:hyperlink w:anchor="__RefHeading___Toc5519_825272777" w:tooltip="8.4 Das Skin-Manifest">
+          <w:hyperlink w:anchor="__RefHeading___Toc5576_2460123423" w:tooltip="8.4 Das Skin-Manifest">
             <w:r>
               <w:rPr>
                 <w:rStyle w:val="Verzeichnissprung"/>
               </w:rPr>
               <w:t>8.4 Das Skin-Manifest</w:t>
               <w:tab/>
-              <w:t>34</w:t>
+              <w:t>35</w:t>
             </w:r>
           </w:hyperlink>
         </w:p>
@@ -1535,14 +1555,14 @@
             </w:tabs>
             <w:rPr/>
           </w:pPr>
-          <w:hyperlink w:anchor="__RefHeading___Toc5521_825272777" w:tooltip="8.5 JavaScript ohne Ersatzzeichen">
+          <w:hyperlink w:anchor="__RefHeading___Toc5578_2460123423" w:tooltip="8.5 JavaScript ohne Ersatzzeichen">
             <w:r>
               <w:rPr>
                 <w:rStyle w:val="Verzeichnissprung"/>
               </w:rPr>
               <w:t>8.5 JavaScript ohne Ersatzzeichen</w:t>
               <w:tab/>
-              <w:t>34</w:t>
+              <w:t>35</w:t>
             </w:r>
           </w:hyperlink>
         </w:p>
@@ -1555,14 +1575,14 @@
             </w:tabs>
             <w:rPr/>
           </w:pPr>
-          <w:hyperlink w:anchor="__RefHeading___Toc5523_825272777" w:tooltip="9 Build-Ablauf und Gulp-Integration">
+          <w:hyperlink w:anchor="__RefHeading___Toc5580_2460123423" w:tooltip="9 Build-Ablauf und Gulp-Integration">
             <w:r>
               <w:rPr>
                 <w:rStyle w:val="Verzeichnissprung"/>
               </w:rPr>
               <w:t>9 Build-Ablauf und Gulp-Integration</w:t>
               <w:tab/>
-              <w:t>35</w:t>
+              <w:t>36</w:t>
             </w:r>
           </w:hyperlink>
         </w:p>
@@ -1575,14 +1595,14 @@
             </w:tabs>
             <w:rPr/>
           </w:pPr>
-          <w:hyperlink w:anchor="__RefHeading___Toc5525_825272777" w:tooltip="9.1 Verzeichniskonventionen">
+          <w:hyperlink w:anchor="__RefHeading___Toc5582_2460123423" w:tooltip="9.1 Verzeichniskonventionen">
             <w:r>
               <w:rPr>
                 <w:rStyle w:val="Verzeichnissprung"/>
               </w:rPr>
               <w:t>9.1 Verzeichniskonventionen</w:t>
               <w:tab/>
-              <w:t>35</w:t>
+              <w:t>36</w:t>
             </w:r>
           </w:hyperlink>
         </w:p>
@@ -1595,14 +1615,14 @@
             </w:tabs>
             <w:rPr/>
           </w:pPr>
-          <w:hyperlink w:anchor="__RefHeading___Toc5527_825272777" w:tooltip="9.2 Kompilierungs-Ablauf">
+          <w:hyperlink w:anchor="__RefHeading___Toc5584_2460123423" w:tooltip="9.2 Kompilierungs-Ablauf">
             <w:r>
               <w:rPr>
                 <w:rStyle w:val="Verzeichnissprung"/>
               </w:rPr>
               <w:t>9.2 Kompilierungs-Ablauf</w:t>
               <w:tab/>
-              <w:t>35</w:t>
+              <w:t>36</w:t>
             </w:r>
           </w:hyperlink>
         </w:p>
@@ -1615,14 +1635,14 @@
             </w:tabs>
             <w:rPr/>
           </w:pPr>
-          <w:hyperlink w:anchor="__RefHeading___Toc5529_825272777" w:tooltip="9.3 Inkrementeller Build und Cache">
+          <w:hyperlink w:anchor="__RefHeading___Toc5586_2460123423" w:tooltip="9.3 Inkrementeller Build und Cache">
             <w:r>
               <w:rPr>
                 <w:rStyle w:val="Verzeichnissprung"/>
               </w:rPr>
               <w:t>9.3 Inkrementeller Build und Cache</w:t>
               <w:tab/>
-              <w:t>35</w:t>
+              <w:t>36</w:t>
             </w:r>
           </w:hyperlink>
         </w:p>
@@ -1635,14 +1655,14 @@
             </w:tabs>
             <w:rPr/>
           </w:pPr>
-          <w:hyperlink w:anchor="__RefHeading___Toc5531_825272777" w:tooltip="9.4 Gulp-Tasks und Watch">
+          <w:hyperlink w:anchor="__RefHeading___Toc5588_2460123423" w:tooltip="9.4 Gulp-Tasks und Watch">
             <w:r>
               <w:rPr>
                 <w:rStyle w:val="Verzeichnissprung"/>
               </w:rPr>
               <w:t>9.4 Gulp-Tasks und Watch</w:t>
               <w:tab/>
-              <w:t>36</w:t>
+              <w:t>37</w:t>
             </w:r>
           </w:hyperlink>
         </w:p>
@@ -1655,14 +1675,14 @@
             </w:tabs>
             <w:rPr/>
           </w:pPr>
-          <w:hyperlink w:anchor="__RefHeading___Toc5533_825272777" w:tooltip="10 Manifest-Referenz (DefineSkin)">
+          <w:hyperlink w:anchor="__RefHeading___Toc5590_2460123423" w:tooltip="10 Manifest-Referenz (DefineSkin)">
             <w:r>
               <w:rPr>
                 <w:rStyle w:val="Verzeichnissprung"/>
               </w:rPr>
               <w:t>10 Manifest-Referenz (DefineSkin)</w:t>
               <w:tab/>
-              <w:t>37</w:t>
+              <w:t>38</w:t>
             </w:r>
           </w:hyperlink>
         </w:p>
@@ -1675,14 +1695,14 @@
             </w:tabs>
             <w:rPr/>
           </w:pPr>
-          <w:hyperlink w:anchor="__RefHeading___Toc5535_825272777" w:tooltip="10.1 vars">
+          <w:hyperlink w:anchor="__RefHeading___Toc5592_2460123423" w:tooltip="10.1 vars">
             <w:r>
               <w:rPr>
                 <w:rStyle w:val="Verzeichnissprung"/>
               </w:rPr>
               <w:t>10.1 vars</w:t>
               <w:tab/>
-              <w:t>37</w:t>
+              <w:t>38</w:t>
             </w:r>
           </w:hyperlink>
         </w:p>
@@ -1695,14 +1715,14 @@
             </w:tabs>
             <w:rPr/>
           </w:pPr>
-          <w:hyperlink w:anchor="__RefHeading___Toc5537_825272777" w:tooltip="10.2 helpers">
+          <w:hyperlink w:anchor="__RefHeading___Toc5594_2460123423" w:tooltip="10.2 helpers">
             <w:r>
               <w:rPr>
                 <w:rStyle w:val="Verzeichnissprung"/>
               </w:rPr>
               <w:t>10.2 helpers</w:t>
               <w:tab/>
-              <w:t>37</w:t>
+              <w:t>38</w:t>
             </w:r>
           </w:hyperlink>
         </w:p>
@@ -1715,14 +1735,14 @@
             </w:tabs>
             <w:rPr/>
           </w:pPr>
-          <w:hyperlink w:anchor="__RefHeading___Toc5539_825272777" w:tooltip="10.3 cursors">
+          <w:hyperlink w:anchor="__RefHeading___Toc5596_2460123423" w:tooltip="10.3 cursors">
             <w:r>
               <w:rPr>
                 <w:rStyle w:val="Verzeichnissprung"/>
               </w:rPr>
               <w:t>10.3 cursors</w:t>
               <w:tab/>
-              <w:t>37</w:t>
+              <w:t>38</w:t>
             </w:r>
           </w:hyperlink>
         </w:p>
@@ -1735,14 +1755,14 @@
             </w:tabs>
             <w:rPr/>
           </w:pPr>
-          <w:hyperlink w:anchor="__RefHeading___Toc5541_825272777" w:tooltip="10.4 media">
+          <w:hyperlink w:anchor="__RefHeading___Toc5598_2460123423" w:tooltip="10.4 media">
             <w:r>
               <w:rPr>
                 <w:rStyle w:val="Verzeichnissprung"/>
               </w:rPr>
               <w:t>10.4 media</w:t>
               <w:tab/>
-              <w:t>37</w:t>
+              <w:t>38</w:t>
             </w:r>
           </w:hyperlink>
         </w:p>
@@ -1755,14 +1775,14 @@
             </w:tabs>
             <w:rPr/>
           </w:pPr>
-          <w:hyperlink w:anchor="__RefHeading___Toc5543_825272777" w:tooltip="10.5 imageFormat">
+          <w:hyperlink w:anchor="__RefHeading___Toc5600_2460123423" w:tooltip="10.5 imageFormat">
             <w:r>
               <w:rPr>
                 <w:rStyle w:val="Verzeichnissprung"/>
               </w:rPr>
               <w:t>10.5 imageFormat</w:t>
               <w:tab/>
-              <w:t>38</w:t>
+              <w:t>39</w:t>
             </w:r>
           </w:hyperlink>
         </w:p>
@@ -1775,14 +1795,14 @@
             </w:tabs>
             <w:rPr/>
           </w:pPr>
-          <w:hyperlink w:anchor="__RefHeading___Toc5545_825272777" w:tooltip="10.6 sprites">
+          <w:hyperlink w:anchor="__RefHeading___Toc5602_2460123423" w:tooltip="10.6 sprites">
             <w:r>
               <w:rPr>
                 <w:rStyle w:val="Verzeichnissprung"/>
               </w:rPr>
               <w:t>10.6 sprites</w:t>
               <w:tab/>
-              <w:t>39</w:t>
+              <w:t>40</w:t>
             </w:r>
           </w:hyperlink>
         </w:p>
@@ -1795,14 +1815,14 @@
             </w:tabs>
             <w:rPr/>
           </w:pPr>
-          <w:hyperlink w:anchor="__RefHeading___Toc5547_825272777" w:tooltip="10.7 minify">
+          <w:hyperlink w:anchor="__RefHeading___Toc5604_2460123423" w:tooltip="10.7 minify">
             <w:r>
               <w:rPr>
                 <w:rStyle w:val="Verzeichnissprung"/>
               </w:rPr>
               <w:t>10.7 minify</w:t>
               <w:tab/>
-              <w:t>40</w:t>
+              <w:t>41</w:t>
             </w:r>
           </w:hyperlink>
         </w:p>
@@ -1815,14 +1835,14 @@
             </w:tabs>
             <w:rPr/>
           </w:pPr>
-          <w:hyperlink w:anchor="__RefHeading___Toc5549_825272777" w:tooltip="10.8 sounds">
+          <w:hyperlink w:anchor="__RefHeading___Toc5606_2460123423" w:tooltip="10.8 sounds">
             <w:r>
               <w:rPr>
                 <w:rStyle w:val="Verzeichnissprung"/>
               </w:rPr>
               <w:t>10.8 sounds</w:t>
               <w:tab/>
-              <w:t>40</w:t>
+              <w:t>41</w:t>
             </w:r>
           </w:hyperlink>
         </w:p>
@@ -1835,14 +1855,14 @@
             </w:tabs>
             <w:rPr/>
           </w:pPr>
-          <w:hyperlink w:anchor="__RefHeading___Toc5551_825272777" w:tooltip="10.9 font">
+          <w:hyperlink w:anchor="__RefHeading___Toc5608_2460123423" w:tooltip="10.9 font">
             <w:r>
               <w:rPr>
                 <w:rStyle w:val="Verzeichnissprung"/>
               </w:rPr>
               <w:t>10.9 font</w:t>
               <w:tab/>
-              <w:t>41</w:t>
+              <w:t>42</w:t>
             </w:r>
           </w:hyperlink>
         </w:p>
@@ -1855,14 +1875,14 @@
             </w:tabs>
             <w:rPr/>
           </w:pPr>
-          <w:hyperlink w:anchor="__RefHeading___Toc5553_825272777" w:tooltip="10.10 files">
+          <w:hyperlink w:anchor="__RefHeading___Toc5610_2460123423" w:tooltip="10.10 files">
             <w:r>
               <w:rPr>
                 <w:rStyle w:val="Verzeichnissprung"/>
               </w:rPr>
               <w:t>10.10 files</w:t>
               <w:tab/>
-              <w:t>42</w:t>
+              <w:t>43</w:t>
             </w:r>
           </w:hyperlink>
         </w:p>
@@ -1875,14 +1895,14 @@
             </w:tabs>
             <w:rPr/>
           </w:pPr>
-          <w:hyperlink w:anchor="__RefHeading___Toc5555_825272777" w:tooltip="11 µ-Auswertungskontext (Referenz)">
+          <w:hyperlink w:anchor="__RefHeading___Toc5612_2460123423" w:tooltip="11 µ-Auswertungskontext (Referenz)">
             <w:r>
               <w:rPr>
                 <w:rStyle w:val="Verzeichnissprung"/>
               </w:rPr>
               <w:t>11 µ-Auswertungskontext (Referenz)</w:t>
               <w:tab/>
-              <w:t>43</w:t>
+              <w:t>44</w:t>
             </w:r>
           </w:hyperlink>
         </w:p>
@@ -1895,14 +1915,14 @@
             </w:tabs>
             <w:rPr/>
           </w:pPr>
-          <w:hyperlink w:anchor="__RefHeading___Toc5557_825272777" w:tooltip="11.1 Das $-Objekt">
+          <w:hyperlink w:anchor="__RefHeading___Toc5614_2460123423" w:tooltip="11.1 Das $-Objekt">
             <w:r>
               <w:rPr>
                 <w:rStyle w:val="Verzeichnissprung"/>
               </w:rPr>
               <w:t>11.1 Das $-Objekt</w:t>
               <w:tab/>
-              <w:t>43</w:t>
+              <w:t>44</w:t>
             </w:r>
           </w:hyperlink>
         </w:p>
@@ -1915,14 +1935,14 @@
             </w:tabs>
             <w:rPr/>
           </w:pPr>
-          <w:hyperlink w:anchor="__RefHeading___Toc5559_825272777" w:tooltip="11.2 Farb- und Wert-Funktionen">
+          <w:hyperlink w:anchor="__RefHeading___Toc5616_2460123423" w:tooltip="11.2 Farb- und Wert-Funktionen">
             <w:r>
               <w:rPr>
                 <w:rStyle w:val="Verzeichnissprung"/>
               </w:rPr>
               <w:t>11.2 Farb- und Wert-Funktionen</w:t>
               <w:tab/>
-              <w:t>43</w:t>
+              <w:t>44</w:t>
             </w:r>
           </w:hyperlink>
         </w:p>
@@ -1935,14 +1955,14 @@
             </w:tabs>
             <w:rPr/>
           </w:pPr>
-          <w:hyperlink w:anchor="__RefHeading___Toc5561_825272777" w:tooltip="11.3 Regel- und Dokument-Methoden">
+          <w:hyperlink w:anchor="__RefHeading___Toc5618_2460123423" w:tooltip="11.3 Regel- und Dokument-Methoden">
             <w:r>
               <w:rPr>
                 <w:rStyle w:val="Verzeichnissprung"/>
               </w:rPr>
               <w:t>11.3 Regel- und Dokument-Methoden</w:t>
               <w:tab/>
-              <w:t>43</w:t>
+              <w:t>44</w:t>
             </w:r>
           </w:hyperlink>
         </w:p>
@@ -1955,14 +1975,14 @@
             </w:tabs>
             <w:rPr/>
           </w:pPr>
-          <w:hyperlink w:anchor="__RefHeading___Toc5563_825272777" w:tooltip="11.4 Sprite()">
+          <w:hyperlink w:anchor="__RefHeading___Toc5620_2460123423" w:tooltip="11.4 Sprite()">
             <w:r>
               <w:rPr>
                 <w:rStyle w:val="Verzeichnissprung"/>
               </w:rPr>
               <w:t>11.4 Sprite()</w:t>
               <w:tab/>
-              <w:t>44</w:t>
+              <w:t>45</w:t>
             </w:r>
           </w:hyperlink>
         </w:p>
@@ -1975,14 +1995,14 @@
             </w:tabs>
             <w:rPr/>
           </w:pPr>
-          <w:hyperlink w:anchor="__RefHeading___Toc5565_825272777" w:tooltip="11.5 Cursor()">
+          <w:hyperlink w:anchor="__RefHeading___Toc5622_2460123423" w:tooltip="11.5 Cursor()">
             <w:r>
               <w:rPr>
                 <w:rStyle w:val="Verzeichnissprung"/>
               </w:rPr>
               <w:t>11.5 Cursor()</w:t>
               <w:tab/>
-              <w:t>44</w:t>
+              <w:t>45</w:t>
             </w:r>
           </w:hyperlink>
         </w:p>
@@ -1995,14 +2015,14 @@
             </w:tabs>
             <w:rPr/>
           </w:pPr>
-          <w:hyperlink w:anchor="__RefHeading___Toc5567_825272777" w:tooltip="11.6 DataUri()">
+          <w:hyperlink w:anchor="__RefHeading___Toc5624_2460123423" w:tooltip="11.6 DataUri()">
             <w:r>
               <w:rPr>
                 <w:rStyle w:val="Verzeichnissprung"/>
               </w:rPr>
               <w:t>11.6 DataUri()</w:t>
               <w:tab/>
-              <w:t>44</w:t>
+              <w:t>45</w:t>
             </w:r>
           </w:hyperlink>
         </w:p>
@@ -2015,14 +2035,14 @@
             </w:tabs>
             <w:rPr/>
           </w:pPr>
-          <w:hyperlink w:anchor="__RefHeading___Toc5569_825272777" w:tooltip="11.7 Helper-Funktionen und this-Bindung">
+          <w:hyperlink w:anchor="__RefHeading___Toc5626_2460123423" w:tooltip="11.7 Helper-Funktionen und this-Bindung">
             <w:r>
               <w:rPr>
                 <w:rStyle w:val="Verzeichnissprung"/>
               </w:rPr>
               <w:t>11.7 Helper-Funktionen und this-Bindung</w:t>
               <w:tab/>
-              <w:t>45</w:t>
+              <w:t>46</w:t>
             </w:r>
           </w:hyperlink>
         </w:p>
@@ -2035,14 +2055,14 @@
             </w:tabs>
             <w:rPr/>
           </w:pPr>
-          <w:hyperlink w:anchor="__RefHeading___Toc5571_825272777" w:tooltip="11.8 afterWork-Hooks">
+          <w:hyperlink w:anchor="__RefHeading___Toc5628_2460123423" w:tooltip="11.8 afterWork-Hooks">
             <w:r>
               <w:rPr>
                 <w:rStyle w:val="Verzeichnissprung"/>
               </w:rPr>
               <w:t>11.8 afterWork-Hooks</w:t>
               <w:tab/>
-              <w:t>45</w:t>
+              <w:t>46</w:t>
             </w:r>
           </w:hyperlink>
         </w:p>
@@ -2055,14 +2075,14 @@
             </w:tabs>
             <w:rPr/>
           </w:pPr>
-          <w:hyperlink w:anchor="__RefHeading___Toc5573_825272777" w:tooltip="12 Arbeiten mit Farben">
+          <w:hyperlink w:anchor="__RefHeading___Toc5630_2460123423" w:tooltip="12 Arbeiten mit Farben">
             <w:r>
               <w:rPr>
                 <w:rStyle w:val="Verzeichnissprung"/>
               </w:rPr>
               <w:t>12 Arbeiten mit Farben</w:t>
               <w:tab/>
-              <w:t>46</w:t>
+              <w:t>47</w:t>
             </w:r>
           </w:hyperlink>
         </w:p>
@@ -2075,14 +2095,14 @@
             </w:tabs>
             <w:rPr/>
           </w:pPr>
-          <w:hyperlink w:anchor="__RefHeading___Toc5575_825272777" w:tooltip="12.1 Farben definieren">
+          <w:hyperlink w:anchor="__RefHeading___Toc5632_2460123423" w:tooltip="12.1 Farben definieren">
             <w:r>
               <w:rPr>
                 <w:rStyle w:val="Verzeichnissprung"/>
               </w:rPr>
               <w:t>12.1 Farben definieren</w:t>
               <w:tab/>
-              <w:t>46</w:t>
+              <w:t>47</w:t>
             </w:r>
           </w:hyperlink>
         </w:p>
@@ -2095,14 +2115,14 @@
             </w:tabs>
             <w:rPr/>
           </w:pPr>
-          <w:hyperlink w:anchor="__RefHeading___Toc5577_825272777" w:tooltip="12.2 Alpha-Werte">
+          <w:hyperlink w:anchor="__RefHeading___Toc5634_2460123423" w:tooltip="12.2 Alpha-Werte">
             <w:r>
               <w:rPr>
                 <w:rStyle w:val="Verzeichnissprung"/>
               </w:rPr>
               <w:t>12.2 Alpha-Werte</w:t>
               <w:tab/>
-              <w:t>46</w:t>
+              <w:t>47</w:t>
             </w:r>
           </w:hyperlink>
         </w:p>
@@ -2115,14 +2135,14 @@
             </w:tabs>
             <w:rPr/>
           </w:pPr>
-          <w:hyperlink w:anchor="__RefHeading___Toc5579_825272777" w:tooltip="12.3 Farbberechnungen">
+          <w:hyperlink w:anchor="__RefHeading___Toc5636_2460123423" w:tooltip="12.3 Farbberechnungen">
             <w:r>
               <w:rPr>
                 <w:rStyle w:val="Verzeichnissprung"/>
               </w:rPr>
               <w:t>12.3 Farbberechnungen</w:t>
               <w:tab/>
-              <w:t>46</w:t>
+              <w:t>47</w:t>
             </w:r>
           </w:hyperlink>
         </w:p>
@@ -2135,14 +2155,14 @@
             </w:tabs>
             <w:rPr/>
           </w:pPr>
-          <w:hyperlink w:anchor="__RefHeading___Toc5581_825272777" w:tooltip="13 Node-API">
+          <w:hyperlink w:anchor="__RefHeading___Toc5638_2460123423" w:tooltip="13 Node-API">
             <w:r>
               <w:rPr>
                 <w:rStyle w:val="Verzeichnissprung"/>
               </w:rPr>
               <w:t>13 Node-API</w:t>
               <w:tab/>
-              <w:t>47</w:t>
+              <w:t>48</w:t>
             </w:r>
           </w:hyperlink>
         </w:p>
@@ -2155,14 +2175,14 @@
             </w:tabs>
             <w:rPr/>
           </w:pPr>
-          <w:hyperlink w:anchor="__RefHeading___Toc5583_825272777" w:tooltip="13.1 Versionshistorie-API (RELEASES.json)">
+          <w:hyperlink w:anchor="__RefHeading___Toc5640_2460123423" w:tooltip="13.1 Versionshistorie-API (RELEASES.json)">
             <w:r>
               <w:rPr>
                 <w:rStyle w:val="Verzeichnissprung"/>
               </w:rPr>
               <w:t>13.1 Versionshistorie-API (RELEASES.json)</w:t>
               <w:tab/>
-              <w:t>48</w:t>
+              <w:t>49</w:t>
             </w:r>
           </w:hyperlink>
         </w:p>
@@ -2175,14 +2195,14 @@
             </w:tabs>
             <w:rPr/>
           </w:pPr>
-          <w:hyperlink w:anchor="__RefHeading___Toc5585_825272777" w:tooltip="14 Fehlerdiagnostik">
+          <w:hyperlink w:anchor="__RefHeading___Toc5642_2460123423" w:tooltip="14 Fehlerdiagnostik">
             <w:r>
               <w:rPr>
                 <w:rStyle w:val="Verzeichnissprung"/>
               </w:rPr>
               <w:t>14 Fehlerdiagnostik</w:t>
               <w:tab/>
-              <w:t>49</w:t>
+              <w:t>50</w:t>
             </w:r>
           </w:hyperlink>
         </w:p>
@@ -2195,14 +2215,14 @@
             </w:tabs>
             <w:rPr/>
           </w:pPr>
-          <w:hyperlink w:anchor="__RefHeading___Toc5587_825272777" w:tooltip="15 Migration von µCSS™">
+          <w:hyperlink w:anchor="__RefHeading___Toc5644_2460123423" w:tooltip="15 Migration von µCSS™">
             <w:r>
               <w:rPr>
                 <w:rStyle w:val="Verzeichnissprung"/>
               </w:rPr>
               <w:t>15 Migration von µCSS™</w:t>
               <w:tab/>
-              <w:t>50</w:t>
+              <w:t>51</w:t>
             </w:r>
           </w:hyperlink>
         </w:p>
@@ -2215,14 +2235,14 @@
             </w:tabs>
             <w:rPr/>
           </w:pPr>
-          <w:hyperlink w:anchor="__RefHeading___Toc5589_825272777" w:tooltip="16 Versionshistorie">
+          <w:hyperlink w:anchor="__RefHeading___Toc5646_2460123423" w:tooltip="16 Versionshistorie">
             <w:r>
               <w:rPr>
                 <w:rStyle w:val="Verzeichnissprung"/>
               </w:rPr>
               <w:t>16 Versionshistorie</w:t>
               <w:tab/>
-              <w:t>51</w:t>
+              <w:t>52</w:t>
             </w:r>
           </w:hyperlink>
         </w:p>
@@ -2235,14 +2255,14 @@
             </w:tabs>
             <w:rPr/>
           </w:pPr>
-          <w:hyperlink w:anchor="__RefHeading___Toc5591_825272777" w:tooltip="17 Rechtliches">
+          <w:hyperlink w:anchor="__RefHeading___Toc5648_2460123423" w:tooltip="17 Rechtliches">
             <w:r>
               <w:rPr>
                 <w:rStyle w:val="Verzeichnissprung"/>
               </w:rPr>
               <w:t>17 Rechtliches</w:t>
               <w:tab/>
-              <w:t>54</w:t>
+              <w:t>55</w:t>
             </w:r>
           </w:hyperlink>
         </w:p>
@@ -2255,14 +2275,14 @@
             </w:tabs>
             <w:rPr/>
           </w:pPr>
-          <w:hyperlink w:anchor="__RefHeading___Toc5593_825272777" w:tooltip="17.1 MIT-Lizenz (Originaltext)">
+          <w:hyperlink w:anchor="__RefHeading___Toc5650_2460123423" w:tooltip="17.1 MIT-Lizenz (Originaltext)">
             <w:r>
               <w:rPr>
                 <w:rStyle w:val="Verzeichnissprung"/>
               </w:rPr>
               <w:t>17.1 MIT-Lizenz (Originaltext)</w:t>
               <w:tab/>
-              <w:t>54</w:t>
+              <w:t>55</w:t>
             </w:r>
           </w:hyperlink>
         </w:p>
@@ -2275,14 +2295,14 @@
             </w:tabs>
             <w:rPr/>
           </w:pPr>
-          <w:hyperlink w:anchor="__RefHeading___Toc5595_825272777" w:tooltip="17.2 Marken">
+          <w:hyperlink w:anchor="__RefHeading___Toc5652_2460123423" w:tooltip="17.2 Marken">
             <w:r>
               <w:rPr>
                 <w:rStyle w:val="Verzeichnissprung"/>
               </w:rPr>
               <w:t>17.2 Marken</w:t>
               <w:tab/>
-              <w:t>54</w:t>
+              <w:t>55</w:t>
             </w:r>
           </w:hyperlink>
         </w:p>
@@ -2295,14 +2315,14 @@
             </w:tabs>
             <w:rPr/>
           </w:pPr>
-          <w:hyperlink w:anchor="__RefHeading___Toc5597_825272777" w:tooltip="17.3 Verwendete Bibliotheken">
+          <w:hyperlink w:anchor="__RefHeading___Toc5654_2460123423" w:tooltip="17.3 Verwendete Bibliotheken">
             <w:r>
               <w:rPr>
                 <w:rStyle w:val="Verzeichnissprung"/>
               </w:rPr>
               <w:t>17.3 Verwendete Bibliotheken</w:t>
               <w:tab/>
-              <w:t>54</w:t>
+              <w:t>55</w:t>
             </w:r>
           </w:hyperlink>
           <w:r>
@@ -2346,7 +2366,7 @@
         <w:outlineLvl w:val="0"/>
         <w:rPr/>
       </w:pPr>
-      <w:bookmarkStart w:id="0" w:name="__RefHeading___Toc5389_825272777"/>
+      <w:bookmarkStart w:id="0" w:name="__RefHeading___Toc5444_2460123423"/>
       <w:bookmarkEnd w:id="0"/>
       <w:r>
         <w:rPr/>
@@ -2829,7 +2849,7 @@
         <w:outlineLvl w:val="1"/>
         <w:rPr/>
       </w:pPr>
-      <w:bookmarkStart w:id="1" w:name="__RefHeading___Toc5391_825272777"/>
+      <w:bookmarkStart w:id="1" w:name="__RefHeading___Toc5446_2460123423"/>
       <w:bookmarkEnd w:id="1"/>
       <w:r>
         <w:rPr/>
@@ -2845,7 +2865,7 @@
       </w:pPr>
       <w:r>
         <w:rPr/>
-        <w:t>Diese Ausgabe beschreibt µCSS 2.5.17, µPS 1.3.6, µFT 0.1.6 und µAU 0.1.8.</w:t>
+        <w:t>Diese Ausgabe beschreibt µCSS 2.5.18, µPS 1.3.6, µFT 0.2.0 und µAU 0.1.8.</w:t>
       </w:r>
     </w:p>
     <w:p>
@@ -2962,7 +2982,7 @@
         <w:outlineLvl w:val="1"/>
         <w:rPr/>
       </w:pPr>
-      <w:bookmarkStart w:id="2" w:name="__RefHeading___Toc5393_825272777"/>
+      <w:bookmarkStart w:id="2" w:name="__RefHeading___Toc5448_2460123423"/>
       <w:bookmarkEnd w:id="2"/>
       <w:r>
         <w:rPr/>
@@ -3085,7 +3105,7 @@
         <w:outlineLvl w:val="1"/>
         <w:rPr/>
       </w:pPr>
-      <w:bookmarkStart w:id="3" w:name="__RefHeading___Toc5395_825272777"/>
+      <w:bookmarkStart w:id="3" w:name="__RefHeading___Toc5450_2460123423"/>
       <w:bookmarkEnd w:id="3"/>
       <w:r>
         <w:rPr/>
@@ -4055,7 +4075,7 @@
         <w:outlineLvl w:val="2"/>
         <w:rPr/>
       </w:pPr>
-      <w:bookmarkStart w:id="4" w:name="__RefHeading___Toc5397_825272777"/>
+      <w:bookmarkStart w:id="4" w:name="__RefHeading___Toc5452_2460123423"/>
       <w:bookmarkEnd w:id="4"/>
       <w:r>
         <w:rPr/>
@@ -4295,7 +4315,7 @@
         <w:outlineLvl w:val="1"/>
         <w:rPr/>
       </w:pPr>
-      <w:bookmarkStart w:id="5" w:name="__RefHeading___Toc5399_825272777"/>
+      <w:bookmarkStart w:id="5" w:name="__RefHeading___Toc5454_2460123423"/>
       <w:bookmarkEnd w:id="5"/>
       <w:r>
         <w:rPr/>
@@ -4944,7 +4964,7 @@
         <w:outlineLvl w:val="0"/>
         <w:rPr/>
       </w:pPr>
-      <w:bookmarkStart w:id="6" w:name="__RefHeading___Toc5401_825272777"/>
+      <w:bookmarkStart w:id="6" w:name="__RefHeading___Toc5456_2460123423"/>
       <w:bookmarkEnd w:id="6"/>
       <w:r>
         <w:rPr/>
@@ -5270,7 +5290,7 @@
         <w:outlineLvl w:val="0"/>
         <w:rPr/>
       </w:pPr>
-      <w:bookmarkStart w:id="7" w:name="__RefHeading___Toc5403_825272777"/>
+      <w:bookmarkStart w:id="7" w:name="__RefHeading___Toc5458_2460123423"/>
       <w:bookmarkEnd w:id="7"/>
       <w:r>
         <w:rPr/>
@@ -5300,7 +5320,7 @@
         <w:outlineLvl w:val="1"/>
         <w:rPr/>
       </w:pPr>
-      <w:bookmarkStart w:id="8" w:name="__RefHeading___Toc5405_825272777"/>
+      <w:bookmarkStart w:id="8" w:name="__RefHeading___Toc5460_2460123423"/>
       <w:bookmarkEnd w:id="8"/>
       <w:r>
         <w:rPr/>
@@ -5957,7 +5977,7 @@
         <w:outlineLvl w:val="1"/>
         <w:rPr/>
       </w:pPr>
-      <w:bookmarkStart w:id="9" w:name="__RefHeading___Toc5407_825272777"/>
+      <w:bookmarkStart w:id="9" w:name="__RefHeading___Toc5462_2460123423"/>
       <w:bookmarkEnd w:id="9"/>
       <w:r>
         <w:rPr/>
@@ -6335,7 +6355,7 @@
         <w:outlineLvl w:val="1"/>
         <w:rPr/>
       </w:pPr>
-      <w:bookmarkStart w:id="10" w:name="__RefHeading___Toc5409_825272777"/>
+      <w:bookmarkStart w:id="10" w:name="__RefHeading___Toc5464_2460123423"/>
       <w:bookmarkEnd w:id="10"/>
       <w:r>
         <w:rPr/>
@@ -6653,7 +6673,7 @@
         <w:outlineLvl w:val="1"/>
         <w:rPr/>
       </w:pPr>
-      <w:bookmarkStart w:id="11" w:name="__RefHeading___Toc5411_825272777"/>
+      <w:bookmarkStart w:id="11" w:name="__RefHeading___Toc5466_2460123423"/>
       <w:bookmarkEnd w:id="11"/>
       <w:r>
         <w:rPr/>
@@ -7285,7 +7305,7 @@
         <w:outlineLvl w:val="1"/>
         <w:rPr/>
       </w:pPr>
-      <w:bookmarkStart w:id="12" w:name="__RefHeading___Toc5413_825272777"/>
+      <w:bookmarkStart w:id="12" w:name="__RefHeading___Toc5468_2460123423"/>
       <w:bookmarkEnd w:id="12"/>
       <w:r>
         <w:rPr/>
@@ -8416,7 +8436,7 @@
         <w:outlineLvl w:val="1"/>
         <w:rPr/>
       </w:pPr>
-      <w:bookmarkStart w:id="13" w:name="__RefHeading___Toc5415_825272777"/>
+      <w:bookmarkStart w:id="13" w:name="__RefHeading___Toc5470_2460123423"/>
       <w:bookmarkEnd w:id="13"/>
       <w:r>
         <w:rPr/>
@@ -8592,7 +8612,7 @@
         <w:outlineLvl w:val="1"/>
         <w:rPr/>
       </w:pPr>
-      <w:bookmarkStart w:id="14" w:name="__RefHeading___Toc5417_825272777"/>
+      <w:bookmarkStart w:id="14" w:name="__RefHeading___Toc5472_2460123423"/>
       <w:bookmarkEnd w:id="14"/>
       <w:r>
         <w:rPr/>
@@ -8957,7 +8977,7 @@
         <w:outlineLvl w:val="1"/>
         <w:rPr/>
       </w:pPr>
-      <w:bookmarkStart w:id="15" w:name="__RefHeading___Toc5419_825272777"/>
+      <w:bookmarkStart w:id="15" w:name="__RefHeading___Toc5474_2460123423"/>
       <w:bookmarkEnd w:id="15"/>
       <w:r>
         <w:rPr/>
@@ -9176,7 +9196,7 @@
         <w:outlineLvl w:val="2"/>
         <w:rPr/>
       </w:pPr>
-      <w:bookmarkStart w:id="16" w:name="__RefHeading___Toc5421_825272777"/>
+      <w:bookmarkStart w:id="16" w:name="__RefHeading___Toc5476_2460123423"/>
       <w:bookmarkEnd w:id="16"/>
       <w:r>
         <w:rPr/>
@@ -10021,7 +10041,7 @@
         <w:outlineLvl w:val="0"/>
         <w:rPr/>
       </w:pPr>
-      <w:bookmarkStart w:id="17" w:name="__RefHeading___Toc5423_825272777"/>
+      <w:bookmarkStart w:id="17" w:name="__RefHeading___Toc5478_2460123423"/>
       <w:bookmarkEnd w:id="17"/>
       <w:r>
         <w:rPr/>
@@ -10216,7 +10236,7 @@
         <w:outlineLvl w:val="1"/>
         <w:rPr/>
       </w:pPr>
-      <w:bookmarkStart w:id="18" w:name="__RefHeading___Toc5425_825272777"/>
+      <w:bookmarkStart w:id="18" w:name="__RefHeading___Toc5480_2460123423"/>
       <w:bookmarkEnd w:id="18"/>
       <w:r>
         <w:rPr/>
@@ -11528,7 +11548,7 @@
         <w:outlineLvl w:val="1"/>
         <w:rPr/>
       </w:pPr>
-      <w:bookmarkStart w:id="19" w:name="__RefHeading___Toc5427_825272777"/>
+      <w:bookmarkStart w:id="19" w:name="__RefHeading___Toc5482_2460123423"/>
       <w:bookmarkEnd w:id="19"/>
       <w:r>
         <w:rPr/>
@@ -12685,7 +12705,7 @@
         <w:outlineLvl w:val="2"/>
         <w:rPr/>
       </w:pPr>
-      <w:bookmarkStart w:id="20" w:name="__RefHeading___Toc5429_825272777"/>
+      <w:bookmarkStart w:id="20" w:name="__RefHeading___Toc5484_2460123423"/>
       <w:bookmarkEnd w:id="20"/>
       <w:r>
         <w:rPr/>
@@ -12924,7 +12944,7 @@
         <w:outlineLvl w:val="1"/>
         <w:rPr/>
       </w:pPr>
-      <w:bookmarkStart w:id="21" w:name="__RefHeading___Toc5431_825272777"/>
+      <w:bookmarkStart w:id="21" w:name="__RefHeading___Toc5486_2460123423"/>
       <w:bookmarkEnd w:id="21"/>
       <w:r>
         <w:rPr/>
@@ -13550,7 +13570,7 @@
         <w:outlineLvl w:val="1"/>
         <w:rPr/>
       </w:pPr>
-      <w:bookmarkStart w:id="22" w:name="__RefHeading___Toc5433_825272777"/>
+      <w:bookmarkStart w:id="22" w:name="__RefHeading___Toc5488_2460123423"/>
       <w:bookmarkEnd w:id="22"/>
       <w:r>
         <w:rPr/>
@@ -13615,7 +13635,7 @@
         <w:outlineLvl w:val="1"/>
         <w:rPr/>
       </w:pPr>
-      <w:bookmarkStart w:id="23" w:name="__RefHeading___Toc5435_825272777"/>
+      <w:bookmarkStart w:id="23" w:name="__RefHeading___Toc5490_2460123423"/>
       <w:bookmarkEnd w:id="23"/>
       <w:r>
         <w:rPr/>
@@ -14024,7 +14044,7 @@
         <w:outlineLvl w:val="2"/>
         <w:rPr/>
       </w:pPr>
-      <w:bookmarkStart w:id="24" w:name="__RefHeading___Toc5437_825272777"/>
+      <w:bookmarkStart w:id="24" w:name="__RefHeading___Toc5492_2460123423"/>
       <w:bookmarkEnd w:id="24"/>
       <w:r>
         <w:rPr/>
@@ -14322,7 +14342,7 @@
         <w:outlineLvl w:val="2"/>
         <w:rPr/>
       </w:pPr>
-      <w:bookmarkStart w:id="25" w:name="__RefHeading___Toc5439_825272777"/>
+      <w:bookmarkStart w:id="25" w:name="__RefHeading___Toc5494_2460123423"/>
       <w:bookmarkEnd w:id="25"/>
       <w:r>
         <w:rPr/>
@@ -14486,7 +14506,7 @@
         <w:outlineLvl w:val="1"/>
         <w:rPr/>
       </w:pPr>
-      <w:bookmarkStart w:id="26" w:name="__RefHeading___Toc5441_825272777"/>
+      <w:bookmarkStart w:id="26" w:name="__RefHeading___Toc5496_2460123423"/>
       <w:bookmarkEnd w:id="26"/>
       <w:r>
         <w:rPr/>
@@ -15420,7 +15440,7 @@
         <w:outlineLvl w:val="1"/>
         <w:rPr/>
       </w:pPr>
-      <w:bookmarkStart w:id="27" w:name="__RefHeading___Toc5443_825272777"/>
+      <w:bookmarkStart w:id="27" w:name="__RefHeading___Toc5498_2460123423"/>
       <w:bookmarkEnd w:id="27"/>
       <w:r>
         <w:rPr/>
@@ -15472,7 +15492,7 @@
         <w:outlineLvl w:val="2"/>
         <w:rPr/>
       </w:pPr>
-      <w:bookmarkStart w:id="28" w:name="__RefHeading___Toc5445_825272777"/>
+      <w:bookmarkStart w:id="28" w:name="__RefHeading___Toc5500_2460123423"/>
       <w:bookmarkEnd w:id="28"/>
       <w:r>
         <w:rPr/>
@@ -15795,7 +15815,7 @@
         <w:outlineLvl w:val="2"/>
         <w:rPr/>
       </w:pPr>
-      <w:bookmarkStart w:id="29" w:name="__RefHeading___Toc5447_825272777"/>
+      <w:bookmarkStart w:id="29" w:name="__RefHeading___Toc5502_2460123423"/>
       <w:bookmarkEnd w:id="29"/>
       <w:r>
         <w:rPr/>
@@ -16436,7 +16456,7 @@
         <w:outlineLvl w:val="2"/>
         <w:rPr/>
       </w:pPr>
-      <w:bookmarkStart w:id="30" w:name="__RefHeading___Toc5449_825272777"/>
+      <w:bookmarkStart w:id="30" w:name="__RefHeading___Toc5504_2460123423"/>
       <w:bookmarkEnd w:id="30"/>
       <w:r>
         <w:rPr/>
@@ -16910,7 +16930,7 @@
         <w:outlineLvl w:val="2"/>
         <w:rPr/>
       </w:pPr>
-      <w:bookmarkStart w:id="31" w:name="__RefHeading___Toc5451_825272777"/>
+      <w:bookmarkStart w:id="31" w:name="__RefHeading___Toc5506_2460123423"/>
       <w:bookmarkEnd w:id="31"/>
       <w:r>
         <w:rPr/>
@@ -17285,7 +17305,7 @@
         <w:outlineLvl w:val="2"/>
         <w:rPr/>
       </w:pPr>
-      <w:bookmarkStart w:id="32" w:name="__RefHeading___Toc5453_825272777"/>
+      <w:bookmarkStart w:id="32" w:name="__RefHeading___Toc5508_2460123423"/>
       <w:bookmarkEnd w:id="32"/>
       <w:r>
         <w:rPr/>
@@ -17676,7 +17696,7 @@
         <w:outlineLvl w:val="2"/>
         <w:rPr/>
       </w:pPr>
-      <w:bookmarkStart w:id="33" w:name="__RefHeading___Toc5455_825272777"/>
+      <w:bookmarkStart w:id="33" w:name="__RefHeading___Toc5510_2460123423"/>
       <w:bookmarkEnd w:id="33"/>
       <w:r>
         <w:rPr/>
@@ -18073,7 +18093,7 @@
         <w:outlineLvl w:val="1"/>
         <w:rPr/>
       </w:pPr>
-      <w:bookmarkStart w:id="34" w:name="__RefHeading___Toc5457_825272777"/>
+      <w:bookmarkStart w:id="34" w:name="__RefHeading___Toc5512_2460123423"/>
       <w:bookmarkEnd w:id="34"/>
       <w:r>
         <w:rPr/>
@@ -19129,7 +19149,7 @@
         <w:outlineLvl w:val="1"/>
         <w:rPr/>
       </w:pPr>
-      <w:bookmarkStart w:id="35" w:name="__RefHeading___Toc5459_825272777"/>
+      <w:bookmarkStart w:id="35" w:name="__RefHeading___Toc5514_2460123423"/>
       <w:bookmarkEnd w:id="35"/>
       <w:r>
         <w:rPr/>
@@ -20332,7 +20352,7 @@
         <w:outlineLvl w:val="1"/>
         <w:rPr/>
       </w:pPr>
-      <w:bookmarkStart w:id="36" w:name="__RefHeading___Toc5461_825272777"/>
+      <w:bookmarkStart w:id="36" w:name="__RefHeading___Toc5516_2460123423"/>
       <w:bookmarkEnd w:id="36"/>
       <w:r>
         <w:rPr/>
@@ -20461,7 +20481,7 @@
         <w:outlineLvl w:val="2"/>
         <w:rPr/>
       </w:pPr>
-      <w:bookmarkStart w:id="37" w:name="__RefHeading___Toc5463_825272777"/>
+      <w:bookmarkStart w:id="37" w:name="__RefHeading___Toc5518_2460123423"/>
       <w:bookmarkEnd w:id="37"/>
       <w:r>
         <w:rPr/>
@@ -23086,7 +23106,7 @@
         <w:outlineLvl w:val="2"/>
         <w:rPr/>
       </w:pPr>
-      <w:bookmarkStart w:id="38" w:name="__RefHeading___Toc5465_825272777"/>
+      <w:bookmarkStart w:id="38" w:name="__RefHeading___Toc5520_2460123423"/>
       <w:bookmarkEnd w:id="38"/>
       <w:r>
         <w:rPr/>
@@ -23558,7 +23578,7 @@
         <w:outlineLvl w:val="2"/>
         <w:rPr/>
       </w:pPr>
-      <w:bookmarkStart w:id="39" w:name="__RefHeading___Toc5467_825272777"/>
+      <w:bookmarkStart w:id="39" w:name="__RefHeading___Toc5522_2460123423"/>
       <w:bookmarkEnd w:id="39"/>
       <w:r>
         <w:rPr/>
@@ -23991,7 +24011,7 @@
         <w:outlineLvl w:val="2"/>
         <w:rPr/>
       </w:pPr>
-      <w:bookmarkStart w:id="40" w:name="__RefHeading___Toc5469_825272777"/>
+      <w:bookmarkStart w:id="40" w:name="__RefHeading___Toc5524_2460123423"/>
       <w:bookmarkEnd w:id="40"/>
       <w:r>
         <w:rPr/>
@@ -24965,7 +24985,7 @@
         <w:outlineLvl w:val="2"/>
         <w:rPr/>
       </w:pPr>
-      <w:bookmarkStart w:id="41" w:name="__RefHeading___Toc5471_825272777"/>
+      <w:bookmarkStart w:id="41" w:name="__RefHeading___Toc5526_2460123423"/>
       <w:bookmarkEnd w:id="41"/>
       <w:r>
         <w:rPr/>
@@ -25068,7 +25088,7 @@
         <w:outlineLvl w:val="1"/>
         <w:rPr/>
       </w:pPr>
-      <w:bookmarkStart w:id="42" w:name="__RefHeading___Toc5473_825272777"/>
+      <w:bookmarkStart w:id="42" w:name="__RefHeading___Toc5528_2460123423"/>
       <w:bookmarkEnd w:id="42"/>
       <w:r>
         <w:rPr/>
@@ -25370,7 +25390,7 @@
         <w:outlineLvl w:val="2"/>
         <w:rPr/>
       </w:pPr>
-      <w:bookmarkStart w:id="43" w:name="__RefHeading___Toc5475_825272777"/>
+      <w:bookmarkStart w:id="43" w:name="__RefHeading___Toc5530_2460123423"/>
       <w:bookmarkEnd w:id="43"/>
       <w:r>
         <w:rPr/>
@@ -25632,7 +25652,7 @@
         <w:outlineLvl w:val="0"/>
         <w:rPr/>
       </w:pPr>
-      <w:bookmarkStart w:id="44" w:name="__RefHeading___Toc5477_825272777"/>
+      <w:bookmarkStart w:id="44" w:name="__RefHeading___Toc5532_2460123423"/>
       <w:bookmarkEnd w:id="44"/>
       <w:r>
         <w:rPr/>
@@ -25778,7 +25798,7 @@
         <w:outlineLvl w:val="1"/>
         <w:rPr/>
       </w:pPr>
-      <w:bookmarkStart w:id="45" w:name="__RefHeading___Toc5479_825272777"/>
+      <w:bookmarkStart w:id="45" w:name="__RefHeading___Toc5534_2460123423"/>
       <w:bookmarkEnd w:id="45"/>
       <w:r>
         <w:rPr/>
@@ -26063,7 +26083,7 @@
         <w:outlineLvl w:val="1"/>
         <w:rPr/>
       </w:pPr>
-      <w:bookmarkStart w:id="46" w:name="__RefHeading___Toc5481_825272777"/>
+      <w:bookmarkStart w:id="46" w:name="__RefHeading___Toc5536_2460123423"/>
       <w:bookmarkEnd w:id="46"/>
       <w:r>
         <w:rPr/>
@@ -27096,7 +27116,7 @@
         <w:outlineLvl w:val="2"/>
         <w:rPr/>
       </w:pPr>
-      <w:bookmarkStart w:id="47" w:name="__RefHeading___Toc5483_825272777"/>
+      <w:bookmarkStart w:id="47" w:name="__RefHeading___Toc5538_2460123423"/>
       <w:bookmarkEnd w:id="47"/>
       <w:r>
         <w:rPr/>
@@ -27161,7 +27181,7 @@
         <w:outlineLvl w:val="2"/>
         <w:rPr/>
       </w:pPr>
-      <w:bookmarkStart w:id="48" w:name="__RefHeading___Toc5485_825272777"/>
+      <w:bookmarkStart w:id="48" w:name="__RefHeading___Toc5540_2460123423"/>
       <w:bookmarkEnd w:id="48"/>
       <w:r>
         <w:rPr/>
@@ -27255,7 +27275,7 @@
         <w:outlineLvl w:val="2"/>
         <w:rPr/>
       </w:pPr>
-      <w:bookmarkStart w:id="49" w:name="__RefHeading___Toc5487_825272777"/>
+      <w:bookmarkStart w:id="49" w:name="__RefHeading___Toc5542_2460123423"/>
       <w:bookmarkEnd w:id="49"/>
       <w:r>
         <w:rPr/>
@@ -27322,7 +27342,7 @@
         <w:outlineLvl w:val="1"/>
         <w:rPr/>
       </w:pPr>
-      <w:bookmarkStart w:id="50" w:name="__RefHeading___Toc5489_825272777"/>
+      <w:bookmarkStart w:id="50" w:name="__RefHeading___Toc5544_2460123423"/>
       <w:bookmarkEnd w:id="50"/>
       <w:r>
         <w:rPr/>
@@ -27658,7 +27678,7 @@
         <w:outlineLvl w:val="2"/>
         <w:rPr/>
       </w:pPr>
-      <w:bookmarkStart w:id="51" w:name="__RefHeading___Toc5491_825272777"/>
+      <w:bookmarkStart w:id="51" w:name="__RefHeading___Toc5546_2460123423"/>
       <w:bookmarkEnd w:id="51"/>
       <w:r>
         <w:rPr/>
@@ -28351,7 +28371,7 @@
         <w:outlineLvl w:val="0"/>
         <w:rPr/>
       </w:pPr>
-      <w:bookmarkStart w:id="52" w:name="__RefHeading___Toc5493_825272777"/>
+      <w:bookmarkStart w:id="52" w:name="__RefHeading___Toc5548_2460123423"/>
       <w:bookmarkEnd w:id="52"/>
       <w:r>
         <w:rPr/>
@@ -28398,7 +28418,31 @@
       </w:r>
       <w:r>
         <w:rPr/>
-        <w:t xml:space="preserve"> — automatisiert wie IcoMoon, ohne Adobe/IcoMoon-Abhängigkeit. Ausgabe: Font-Dateien (SVG/TTF/EOT/WOFF/WOFF2), CSS-Klassen, IcoMoon-kompatible JSON, HTML-Übersicht.</w:t>
+        <w:t xml:space="preserve"> — automatisiert wie IcoMoon, ohne Adobe/IcoMoon-Abhängigkeit — und verpackt </w:t>
+      </w:r>
+      <w:r>
+        <w:rPr>
+          <w:b/>
+          <w:bCs/>
+        </w:rPr>
+        <w:t>vorhandene Webfonts</w:t>
+      </w:r>
+      <w:r>
+        <w:rPr/>
+        <w:t>, einschließlich moderner OpenType-Color-Fonts und Emoji-Fonts. Ausgabe: Font-Dateien (SVG/TTF/EOT/WOFF/WOFF2), CSS (</w:t>
+      </w:r>
+      <w:r>
+        <w:rPr>
+          <w:rFonts w:eastAsia="Consolas" w:cs="Consolas" w:ascii="Consolas" w:hAnsi="Consolas"/>
+          <w:sz w:val="18"/>
+          <w:szCs w:val="18"/>
+          <w:shd w:fill="F2F2F2" w:val="clear"/>
+        </w:rPr>
+        <w:t>@font-face</w:t>
+      </w:r>
+      <w:r>
+        <w:rPr/>
+        <w:t xml:space="preserve"> und Icon-Klassen), IcoMoon-kompatible JSON (Icons), HTML-Übersicht.</w:t>
       </w:r>
     </w:p>
     <w:p>
@@ -28473,7 +28517,31 @@
       </w:r>
       <w:r>
         <w:rPr/>
-        <w:t>.</w:t>
+        <w:t xml:space="preserve">. Die SVG-Icon-Pipeline bleibt </w:t>
+      </w:r>
+      <w:r>
+        <w:rPr>
+          <w:b/>
+          <w:bCs/>
+        </w:rPr>
+        <w:t>monochrom</w:t>
+      </w:r>
+      <w:r>
+        <w:rPr/>
+        <w:t xml:space="preserve">. Farbinformationen bleiben erhalten, wenn </w:t>
+      </w:r>
+      <w:r>
+        <w:rPr>
+          <w:rFonts w:eastAsia="Consolas" w:cs="Consolas" w:ascii="Consolas" w:hAnsi="Consolas"/>
+          <w:sz w:val="18"/>
+          <w:szCs w:val="18"/>
+          <w:shd w:fill="F2F2F2" w:val="clear"/>
+        </w:rPr>
+        <w:t>src</w:t>
+      </w:r>
+      <w:r>
+        <w:rPr/>
+        <w:t xml:space="preserve"> eine vorhandene TTF/OTF/WOFF/WOFF2-Datei ist.</w:t>
       </w:r>
     </w:p>
     <w:p>
@@ -28487,7 +28555,7 @@
         <w:outlineLvl w:val="1"/>
         <w:rPr/>
       </w:pPr>
-      <w:bookmarkStart w:id="53" w:name="__RefHeading___Toc5495_825272777"/>
+      <w:bookmarkStart w:id="53" w:name="__RefHeading___Toc5550_2460123423"/>
       <w:bookmarkEnd w:id="53"/>
       <w:r>
         <w:rPr/>
@@ -28641,7 +28709,7 @@
         <w:outlineLvl w:val="1"/>
         <w:rPr/>
       </w:pPr>
-      <w:bookmarkStart w:id="54" w:name="__RefHeading___Toc5497_825272777"/>
+      <w:bookmarkStart w:id="54" w:name="__RefHeading___Toc5552_2460123423"/>
       <w:bookmarkEnd w:id="54"/>
       <w:r>
         <w:rPr/>
@@ -29208,7 +29276,18 @@
             </w:pPr>
             <w:r>
               <w:rPr/>
-              <w:t>Font-Name, SVG-Quellbaum, Ziel</w:t>
+              <w:t xml:space="preserve">Font-Name, SVG-Quellbaum </w:t>
+            </w:r>
+            <w:r>
+              <w:rPr>
+                <w:b/>
+                <w:bCs/>
+              </w:rPr>
+              <w:t>oder</w:t>
+            </w:r>
+            <w:r>
+              <w:rPr/>
+              <w:t xml:space="preserve"> einzelne TTF/OTF/WOFF/WOFF2-Datei, Ziel</w:t>
             </w:r>
           </w:p>
         </w:tc>
@@ -30091,7 +30170,7 @@
         <w:outlineLvl w:val="1"/>
         <w:rPr/>
       </w:pPr>
-      <w:bookmarkStart w:id="55" w:name="__RefHeading___Toc5499_825272777"/>
+      <w:bookmarkStart w:id="55" w:name="__RefHeading___Toc5554_2460123423"/>
       <w:bookmarkEnd w:id="55"/>
       <w:r>
         <w:rPr/>
@@ -30314,6 +30393,19 @@
                 <w:szCs w:val="18"/>
                 <w:shd w:fill="F2F2F2" w:val="clear"/>
               </w:rPr>
+              <w:t>ConvertFontFormats</w:t>
+            </w:r>
+            <w:r>
+              <w:rPr/>
+              <w:t xml:space="preserve">, </w:t>
+            </w:r>
+            <w:r>
+              <w:rPr>
+                <w:rFonts w:eastAsia="Consolas" w:cs="Consolas" w:ascii="Consolas" w:hAnsi="Consolas"/>
+                <w:sz w:val="18"/>
+                <w:szCs w:val="18"/>
+                <w:shd w:fill="F2F2F2" w:val="clear"/>
+              </w:rPr>
               <w:t>BuildFontCss</w:t>
             </w:r>
             <w:r>
@@ -30327,7 +30419,59 @@
                 <w:szCs w:val="18"/>
                 <w:shd w:fill="F2F2F2" w:val="clear"/>
               </w:rPr>
-              <w:t>BuildIcoMoonJson</w:t>
+              <w:t>BuildWebfontCss</w:t>
+            </w:r>
+          </w:p>
+        </w:tc>
+        <w:tc>
+          <w:tcPr>
+            <w:tcW w:w="4514" w:type="dxa"/>
+            <w:tcBorders>
+              <w:top w:val="single" w:sz="4" w:space="0" w:color="999999"/>
+              <w:start w:val="single" w:sz="4" w:space="0" w:color="999999"/>
+              <w:bottom w:val="single" w:sz="4" w:space="0" w:color="999999"/>
+              <w:end w:val="single" w:sz="4" w:space="0" w:color="999999"/>
+            </w:tcBorders>
+          </w:tcPr>
+          <w:p>
+            <w:pPr>
+              <w:pStyle w:val="Normal"/>
+              <w:spacing w:before="40" w:after="40"/>
+              <w:rPr/>
+            </w:pPr>
+            <w:r>
+              <w:rPr/>
+              <w:t>Einzelne Build-Schritte</w:t>
+            </w:r>
+          </w:p>
+        </w:tc>
+      </w:tr>
+      <w:tr>
+        <w:trPr/>
+        <w:tc>
+          <w:tcPr>
+            <w:tcW w:w="4512" w:type="dxa"/>
+            <w:tcBorders>
+              <w:top w:val="single" w:sz="4" w:space="0" w:color="999999"/>
+              <w:start w:val="single" w:sz="4" w:space="0" w:color="999999"/>
+              <w:bottom w:val="single" w:sz="4" w:space="0" w:color="999999"/>
+              <w:end w:val="single" w:sz="4" w:space="0" w:color="999999"/>
+            </w:tcBorders>
+          </w:tcPr>
+          <w:p>
+            <w:pPr>
+              <w:pStyle w:val="Normal"/>
+              <w:spacing w:before="40" w:after="40"/>
+              <w:rPr/>
+            </w:pPr>
+            <w:r>
+              <w:rPr>
+                <w:rFonts w:eastAsia="Consolas" w:cs="Consolas" w:ascii="Consolas" w:hAnsi="Consolas"/>
+                <w:sz w:val="18"/>
+                <w:szCs w:val="18"/>
+                <w:shd w:fill="F2F2F2" w:val="clear"/>
+              </w:rPr>
+              <w:t>InspectFont</w:t>
             </w:r>
             <w:r>
               <w:rPr/>
@@ -30340,7 +30484,7 @@
                 <w:szCs w:val="18"/>
                 <w:shd w:fill="F2F2F2" w:val="clear"/>
               </w:rPr>
-              <w:t>BuildOverviewHtml</w:t>
+              <w:t>DetectColorFont</w:t>
             </w:r>
           </w:p>
         </w:tc>
@@ -30362,7 +30506,7 @@
             </w:pPr>
             <w:r>
               <w:rPr/>
-              <w:t>Einzelne Build-Schritte</w:t>
+              <w:t>Color-Table-Erkennung</w:t>
             </w:r>
           </w:p>
         </w:tc>
@@ -30454,11 +30598,11 @@
         <w:outlineLvl w:val="1"/>
         <w:rPr/>
       </w:pPr>
-      <w:bookmarkStart w:id="56" w:name="__RefHeading___Toc5501_825272777"/>
+      <w:bookmarkStart w:id="56" w:name="__RefHeading___Toc5556_2460123423"/>
       <w:bookmarkEnd w:id="56"/>
       <w:r>
         <w:rPr/>
-        <w:t>6.4 Anbindung an µCSS™</w:t>
+        <w:t>6.4 Color Fonts und Emoji-Fonts</w:t>
       </w:r>
     </w:p>
     <w:p>
@@ -30470,9 +30614,286 @@
       </w:pPr>
       <w:r>
         <w:rPr>
+          <w:rFonts w:eastAsia="Consolas" w:cs="Consolas" w:ascii="Consolas" w:hAnsi="Consolas"/>
+          <w:sz w:val="18"/>
+          <w:szCs w:val="18"/>
+          <w:shd w:fill="F2F2F2" w:val="clear"/>
+        </w:rPr>
+        <w:t>src</w:t>
+      </w:r>
+      <w:r>
+        <w:rPr/>
+        <w:t xml:space="preserve"> auf eine Color-Fontdatei statt auf ein SVG-Verzeichnis zeigen — derselbe Aufruf </w:t>
+      </w:r>
+      <w:r>
+        <w:rPr>
+          <w:rFonts w:eastAsia="Consolas" w:cs="Consolas" w:ascii="Consolas" w:hAnsi="Consolas"/>
+          <w:sz w:val="18"/>
+          <w:szCs w:val="18"/>
+          <w:shd w:fill="F2F2F2" w:val="clear"/>
+        </w:rPr>
+        <w:t>FontGenerator.Create</w:t>
+      </w:r>
+      <w:r>
+        <w:rPr/>
+        <w:t xml:space="preserve">. µFT erkennt COLR/CPAL (v0 und v1), SVG-in-OpenType, CBDT/CBLC und sbix, packt TTF/OTF als WOFF/WOFF2 </w:t>
+      </w:r>
+      <w:r>
+        <w:rPr>
           <w:b/>
           <w:bCs/>
         </w:rPr>
+        <w:t>ohne diese Tables zu verwerfen</w:t>
+      </w:r>
+      <w:r>
+        <w:rPr/>
+        <w:t xml:space="preserve"> und schreibt ein normales </w:t>
+      </w:r>
+      <w:r>
+        <w:rPr>
+          <w:rFonts w:eastAsia="Consolas" w:cs="Consolas" w:ascii="Consolas" w:hAnsi="Consolas"/>
+          <w:sz w:val="18"/>
+          <w:szCs w:val="18"/>
+          <w:shd w:fill="F2F2F2" w:val="clear"/>
+        </w:rPr>
+        <w:t>@font-face</w:t>
+      </w:r>
+      <w:r>
+        <w:rPr/>
+        <w:t xml:space="preserve"> (keine Icon-Klassen).</w:t>
+      </w:r>
+    </w:p>
+    <w:p>
+      <w:pPr>
+        <w:pStyle w:val="Normal"/>
+        <w:shd w:val="clear" w:fill="F2F2F2"/>
+        <w:spacing w:before="0" w:after="0"/>
+        <w:rPr/>
+      </w:pPr>
+      <w:r>
+        <w:rPr>
+          <w:rFonts w:eastAsia="Consolas" w:cs="Consolas" w:ascii="Consolas" w:hAnsi="Consolas"/>
+          <w:sz w:val="18"/>
+          <w:szCs w:val="18"/>
+        </w:rPr>
+        <w:t>await FontGenerator.Create({</w:t>
+      </w:r>
+    </w:p>
+    <w:p>
+      <w:pPr>
+        <w:pStyle w:val="Normal"/>
+        <w:shd w:val="clear" w:fill="F2F2F2"/>
+        <w:spacing w:before="0" w:after="0"/>
+        <w:rPr/>
+      </w:pPr>
+      <w:r>
+        <w:rPr>
+          <w:rFonts w:eastAsia="Consolas" w:cs="Consolas" w:ascii="Consolas" w:hAnsi="Consolas"/>
+          <w:sz w:val="18"/>
+          <w:szCs w:val="18"/>
+        </w:rPr>
+        <w:t xml:space="preserve">    </w:t>
+      </w:r>
+      <w:r>
+        <w:rPr>
+          <w:rFonts w:eastAsia="Consolas" w:cs="Consolas" w:ascii="Consolas" w:hAnsi="Consolas"/>
+          <w:sz w:val="18"/>
+          <w:szCs w:val="18"/>
+        </w:rPr>
+        <w:t>fontName: "ChatEmoji",</w:t>
+      </w:r>
+    </w:p>
+    <w:p>
+      <w:pPr>
+        <w:pStyle w:val="Normal"/>
+        <w:shd w:val="clear" w:fill="F2F2F2"/>
+        <w:spacing w:before="0" w:after="0"/>
+        <w:rPr/>
+      </w:pPr>
+      <w:r>
+        <w:rPr>
+          <w:rFonts w:eastAsia="Consolas" w:cs="Consolas" w:ascii="Consolas" w:hAnsi="Consolas"/>
+          <w:sz w:val="18"/>
+          <w:szCs w:val="18"/>
+        </w:rPr>
+        <w:t xml:space="preserve">    </w:t>
+      </w:r>
+      <w:r>
+        <w:rPr>
+          <w:rFonts w:eastAsia="Consolas" w:cs="Consolas" w:ascii="Consolas" w:hAnsi="Consolas"/>
+          <w:sz w:val="18"/>
+          <w:szCs w:val="18"/>
+        </w:rPr>
+        <w:t>src: "vendor/NotoColorEmoji-Regular.ttf",</w:t>
+      </w:r>
+    </w:p>
+    <w:p>
+      <w:pPr>
+        <w:pStyle w:val="Normal"/>
+        <w:shd w:val="clear" w:fill="F2F2F2"/>
+        <w:spacing w:before="0" w:after="0"/>
+        <w:rPr/>
+      </w:pPr>
+      <w:r>
+        <w:rPr>
+          <w:rFonts w:eastAsia="Consolas" w:cs="Consolas" w:ascii="Consolas" w:hAnsi="Consolas"/>
+          <w:sz w:val="18"/>
+          <w:szCs w:val="18"/>
+        </w:rPr>
+        <w:t xml:space="preserve">    </w:t>
+      </w:r>
+      <w:r>
+        <w:rPr>
+          <w:rFonts w:eastAsia="Consolas" w:cs="Consolas" w:ascii="Consolas" w:hAnsi="Consolas"/>
+          <w:sz w:val="18"/>
+          <w:szCs w:val="18"/>
+        </w:rPr>
+        <w:t>outputDir: "dev/media/final/fonts"</w:t>
+      </w:r>
+    </w:p>
+    <w:p>
+      <w:pPr>
+        <w:pStyle w:val="Normal"/>
+        <w:shd w:val="clear" w:fill="F2F2F2"/>
+        <w:spacing w:before="0" w:after="160"/>
+        <w:rPr/>
+      </w:pPr>
+      <w:r>
+        <w:rPr>
+          <w:rFonts w:eastAsia="Consolas" w:cs="Consolas" w:ascii="Consolas" w:hAnsi="Consolas"/>
+          <w:sz w:val="18"/>
+          <w:szCs w:val="18"/>
+        </w:rPr>
+        <w:t>});</w:t>
+      </w:r>
+    </w:p>
+    <w:p>
+      <w:pPr>
+        <w:pStyle w:val="Normal"/>
+        <w:shd w:val="clear" w:fill="F2F2F2"/>
+        <w:spacing w:before="0" w:after="0"/>
+        <w:rPr/>
+      </w:pPr>
+      <w:r>
+        <w:rPr>
+          <w:rFonts w:eastAsia="Consolas" w:cs="Consolas" w:ascii="Consolas" w:hAnsi="Consolas"/>
+          <w:sz w:val="18"/>
+          <w:szCs w:val="18"/>
+        </w:rPr>
+        <w:t>body { font-family: ChatEmoji, system-ui, sans-serif; }</w:t>
+      </w:r>
+    </w:p>
+    <w:p>
+      <w:pPr>
+        <w:pStyle w:val="Normal"/>
+        <w:shd w:val="clear" w:fill="F2F2F2"/>
+        <w:spacing w:before="0" w:after="160"/>
+        <w:rPr/>
+      </w:pPr>
+      <w:r>
+        <w:rPr>
+          <w:rFonts w:eastAsia="Consolas" w:cs="Consolas" w:ascii="Consolas" w:hAnsi="Consolas"/>
+          <w:sz w:val="18"/>
+          <w:szCs w:val="18"/>
+        </w:rPr>
+        <w:t>/* Optionale Palette: font-palette / @font-palette-values — µFT schreibt CPAL nicht um. */</w:t>
+      </w:r>
+    </w:p>
+    <w:p>
+      <w:pPr>
+        <w:pStyle w:val="Normal"/>
+        <w:shd w:val="clear" w:fill="F2F2F2"/>
+        <w:spacing w:before="0" w:after="160"/>
+        <w:rPr/>
+      </w:pPr>
+      <w:r>
+        <w:rPr>
+          <w:rFonts w:eastAsia="Consolas" w:cs="Consolas" w:ascii="Consolas" w:hAnsi="Consolas"/>
+          <w:sz w:val="18"/>
+          <w:szCs w:val="18"/>
+        </w:rPr>
+        <w:t>&lt;p&gt;Hallo 😀 🎉&lt;/p&gt;</w:t>
+      </w:r>
+    </w:p>
+    <w:p>
+      <w:pPr>
+        <w:pStyle w:val="Normal"/>
+        <w:spacing w:before="0" w:after="120"/>
+        <w:jc w:val="both"/>
+        <w:rPr/>
+      </w:pPr>
+      <w:r>
+        <w:rPr/>
+        <w:t xml:space="preserve">Die Farbdarstellung hängt von Font, Browser und Betriebssystem ab. µFT erzeugt </w:t>
+      </w:r>
+      <w:r>
+        <w:rPr>
+          <w:b/>
+          <w:bCs/>
+        </w:rPr>
+        <w:t>keine</w:t>
+      </w:r>
+      <w:r>
+        <w:rPr/>
+        <w:t xml:space="preserve"> Emoji-Animation. EOT und Legacy-SVG-Fonts werden bei Color-Quellen übersprungen (keine Color-Tables). Subsetting ist nicht implementiert; der ganze Font wird verpackt, damit COLR-Layer-Glyphen erhalten bleiben. Matrix erkannt/erhalten/konvertiert: README von </w:t>
+      </w:r>
+      <w:r>
+        <w:rPr>
+          <w:rFonts w:eastAsia="Consolas" w:cs="Consolas" w:ascii="Consolas" w:hAnsi="Consolas"/>
+          <w:sz w:val="18"/>
+          <w:szCs w:val="18"/>
+          <w:shd w:fill="F2F2F2" w:val="clear"/>
+        </w:rPr>
+        <w:t>gulp-mu-ft</w:t>
+      </w:r>
+      <w:r>
+        <w:rPr/>
+        <w:t xml:space="preserve">, Abschnitt *Color Fonts*. Beispiel: </w:t>
+      </w:r>
+      <w:r>
+        <w:rPr>
+          <w:rFonts w:eastAsia="Consolas" w:cs="Consolas" w:ascii="Consolas" w:hAnsi="Consolas"/>
+          <w:sz w:val="18"/>
+          <w:szCs w:val="18"/>
+          <w:shd w:fill="F2F2F2" w:val="clear"/>
+        </w:rPr>
+        <w:t>gulp-mu-ft/examples/color-font/</w:t>
+      </w:r>
+      <w:r>
+        <w:rPr/>
+        <w:t>.</w:t>
+      </w:r>
+    </w:p>
+    <w:p>
+      <w:pPr>
+        <w:pStyle w:val="Heading2"/>
+        <w:numPr>
+          <w:ilvl w:val="0"/>
+          <w:numId w:val="0"/>
+        </w:numPr>
+        <w:spacing w:before="240" w:after="120"/>
+        <w:outlineLvl w:val="1"/>
+        <w:rPr/>
+      </w:pPr>
+      <w:bookmarkStart w:id="57" w:name="__RefHeading___Toc5558_2460123423"/>
+      <w:bookmarkEnd w:id="57"/>
+      <w:r>
+        <w:rPr/>
+        <w:t>6.5 Anbindung an µCSS™</w:t>
+      </w:r>
+    </w:p>
+    <w:p>
+      <w:pPr>
+        <w:pStyle w:val="Normal"/>
+        <w:spacing w:before="0" w:after="120"/>
+        <w:jc w:val="both"/>
+        <w:rPr/>
+      </w:pPr>
+      <w:r>
+        <w:rPr>
+          <w:b/>
+          <w:bCs/>
+        </w:rPr>
         <w:t>Manifest (geplant):</w:t>
       </w:r>
       <w:r>
@@ -30503,7 +30924,7 @@
       </w:r>
       <w:r>
         <w:rPr/>
-        <w:t xml:space="preserve"> (SVG-Verzeichnis), </w:t>
+        <w:t xml:space="preserve"> (SVG-Verzeichnis oder Color-/Emoji-Fontdatei), </w:t>
       </w:r>
       <w:r>
         <w:rPr>
@@ -30750,8 +31171,8 @@
         <w:outlineLvl w:val="0"/>
         <w:rPr/>
       </w:pPr>
-      <w:bookmarkStart w:id="57" w:name="__RefHeading___Toc5503_825272777"/>
-      <w:bookmarkEnd w:id="57"/>
+      <w:bookmarkStart w:id="58" w:name="__RefHeading___Toc5560_2460123423"/>
+      <w:bookmarkEnd w:id="58"/>
       <w:r>
         <w:rPr/>
         <w:t>7 Vue und Komponenten-Co-Location</w:t>
@@ -30879,8 +31300,8 @@
         <w:outlineLvl w:val="1"/>
         <w:rPr/>
       </w:pPr>
-      <w:bookmarkStart w:id="58" w:name="__RefHeading___Toc5505_825272777"/>
-      <w:bookmarkEnd w:id="58"/>
+      <w:bookmarkStart w:id="59" w:name="__RefHeading___Toc5562_2460123423"/>
+      <w:bookmarkEnd w:id="59"/>
       <w:r>
         <w:rPr/>
         <w:t>7.1 Ablauf</w:t>
@@ -31174,8 +31595,8 @@
         <w:outlineLvl w:val="1"/>
         <w:rPr/>
       </w:pPr>
-      <w:bookmarkStart w:id="59" w:name="__RefHeading___Toc5507_825272777"/>
-      <w:bookmarkEnd w:id="59"/>
+      <w:bookmarkStart w:id="60" w:name="__RefHeading___Toc5564_2460123423"/>
+      <w:bookmarkEnd w:id="60"/>
       <w:r>
         <w:rPr/>
         <w:t>7.2 Namespaces und globale State-Klassen</w:t>
@@ -31329,8 +31750,8 @@
         <w:outlineLvl w:val="1"/>
         <w:rPr/>
       </w:pPr>
-      <w:bookmarkStart w:id="60" w:name="__RefHeading___Toc5509_825272777"/>
-      <w:bookmarkEnd w:id="60"/>
+      <w:bookmarkStart w:id="61" w:name="__RefHeading___Toc5566_2460123423"/>
+      <w:bookmarkEnd w:id="61"/>
       <w:r>
         <w:rPr/>
         <w:t>7.3 Bestehende Vue-SFCs migrieren</w:t>
@@ -31575,8 +31996,8 @@
         <w:outlineLvl w:val="0"/>
         <w:rPr/>
       </w:pPr>
-      <w:bookmarkStart w:id="61" w:name="__RefHeading___Toc5511_825272777"/>
-      <w:bookmarkEnd w:id="61"/>
+      <w:bookmarkStart w:id="62" w:name="__RefHeading___Toc5568_2460123423"/>
+      <w:bookmarkEnd w:id="62"/>
       <w:r>
         <w:rPr/>
         <w:t>8 Grundideen von µCSS™</w:t>
@@ -31593,8 +32014,8 @@
         <w:outlineLvl w:val="1"/>
         <w:rPr/>
       </w:pPr>
-      <w:bookmarkStart w:id="62" w:name="__RefHeading___Toc5513_825272777"/>
-      <w:bookmarkEnd w:id="62"/>
+      <w:bookmarkStart w:id="63" w:name="__RefHeading___Toc5570_2460123423"/>
+      <w:bookmarkEnd w:id="63"/>
       <w:r>
         <w:rPr/>
         <w:t>8.1 Das .µ.css-Format</w:t>
@@ -31800,8 +32221,8 @@
         <w:outlineLvl w:val="1"/>
         <w:rPr/>
       </w:pPr>
-      <w:bookmarkStart w:id="63" w:name="__RefHeading___Toc5515_825272777"/>
-      <w:bookmarkEnd w:id="63"/>
+      <w:bookmarkStart w:id="64" w:name="__RefHeading___Toc5572_2460123423"/>
+      <w:bookmarkEnd w:id="64"/>
       <w:r>
         <w:rPr/>
         <w:t>8.2 Werte-Interpolation µ(Ausdruck)</w:t>
@@ -32086,8 +32507,8 @@
         <w:outlineLvl w:val="1"/>
         <w:rPr/>
       </w:pPr>
-      <w:bookmarkStart w:id="64" w:name="__RefHeading___Toc5517_825272777"/>
-      <w:bookmarkEnd w:id="64"/>
+      <w:bookmarkStart w:id="65" w:name="__RefHeading___Toc5574_2460123423"/>
+      <w:bookmarkEnd w:id="65"/>
       <w:r>
         <w:rPr/>
         <w:t>8.3 Direktiven -µ: Ausdruck</w:t>
@@ -32415,8 +32836,8 @@
         <w:outlineLvl w:val="1"/>
         <w:rPr/>
       </w:pPr>
-      <w:bookmarkStart w:id="65" w:name="__RefHeading___Toc5519_825272777"/>
-      <w:bookmarkEnd w:id="65"/>
+      <w:bookmarkStart w:id="66" w:name="__RefHeading___Toc5576_2460123423"/>
+      <w:bookmarkEnd w:id="66"/>
       <w:r>
         <w:rPr/>
         <w:t>8.4 Das Skin-Manifest</w:t>
@@ -33087,8 +33508,8 @@
         <w:outlineLvl w:val="1"/>
         <w:rPr/>
       </w:pPr>
-      <w:bookmarkStart w:id="66" w:name="__RefHeading___Toc5521_825272777"/>
-      <w:bookmarkEnd w:id="66"/>
+      <w:bookmarkStart w:id="67" w:name="__RefHeading___Toc5578_2460123423"/>
+      <w:bookmarkEnd w:id="67"/>
       <w:r>
         <w:rPr/>
         <w:t>8.5 JavaScript ohne Ersatzzeichen</w:t>
@@ -33298,8 +33719,8 @@
         <w:outlineLvl w:val="0"/>
         <w:rPr/>
       </w:pPr>
-      <w:bookmarkStart w:id="67" w:name="__RefHeading___Toc5523_825272777"/>
-      <w:bookmarkEnd w:id="67"/>
+      <w:bookmarkStart w:id="68" w:name="__RefHeading___Toc5580_2460123423"/>
+      <w:bookmarkEnd w:id="68"/>
       <w:r>
         <w:rPr/>
         <w:t>9 Build-Ablauf und Gulp-Integration</w:t>
@@ -33341,8 +33762,8 @@
         <w:outlineLvl w:val="1"/>
         <w:rPr/>
       </w:pPr>
-      <w:bookmarkStart w:id="68" w:name="__RefHeading___Toc5525_825272777"/>
-      <w:bookmarkEnd w:id="68"/>
+      <w:bookmarkStart w:id="69" w:name="__RefHeading___Toc5582_2460123423"/>
+      <w:bookmarkEnd w:id="69"/>
       <w:r>
         <w:rPr/>
         <w:t>9.1 Verzeichniskonventionen</w:t>
@@ -33741,8 +34162,8 @@
         <w:outlineLvl w:val="1"/>
         <w:rPr/>
       </w:pPr>
-      <w:bookmarkStart w:id="69" w:name="__RefHeading___Toc5527_825272777"/>
-      <w:bookmarkEnd w:id="69"/>
+      <w:bookmarkStart w:id="70" w:name="__RefHeading___Toc5584_2460123423"/>
+      <w:bookmarkEnd w:id="70"/>
       <w:r>
         <w:rPr/>
         <w:t>9.2 Kompilierungs-Ablauf</w:t>
@@ -33992,8 +34413,8 @@
         <w:outlineLvl w:val="1"/>
         <w:rPr/>
       </w:pPr>
-      <w:bookmarkStart w:id="70" w:name="__RefHeading___Toc5529_825272777"/>
-      <w:bookmarkEnd w:id="70"/>
+      <w:bookmarkStart w:id="71" w:name="__RefHeading___Toc5586_2460123423"/>
+      <w:bookmarkEnd w:id="71"/>
       <w:r>
         <w:rPr/>
         <w:t>9.3 Inkrementeller Build und Cache</w:t>
@@ -34248,8 +34669,8 @@
         <w:outlineLvl w:val="1"/>
         <w:rPr/>
       </w:pPr>
-      <w:bookmarkStart w:id="71" w:name="__RefHeading___Toc5531_825272777"/>
-      <w:bookmarkEnd w:id="71"/>
+      <w:bookmarkStart w:id="72" w:name="__RefHeading___Toc5588_2460123423"/>
+      <w:bookmarkEnd w:id="72"/>
       <w:r>
         <w:rPr/>
         <w:t>9.4 Gulp-Tasks und Watch</w:t>
@@ -34698,8 +35119,8 @@
         <w:outlineLvl w:val="0"/>
         <w:rPr/>
       </w:pPr>
-      <w:bookmarkStart w:id="72" w:name="__RefHeading___Toc5533_825272777"/>
-      <w:bookmarkEnd w:id="72"/>
+      <w:bookmarkStart w:id="73" w:name="__RefHeading___Toc5590_2460123423"/>
+      <w:bookmarkEnd w:id="73"/>
       <w:r>
         <w:rPr/>
         <w:t>10 Manifest-Referenz (DefineSkin)</w:t>
@@ -34737,8 +35158,8 @@
         <w:outlineLvl w:val="1"/>
         <w:rPr/>
       </w:pPr>
-      <w:bookmarkStart w:id="73" w:name="__RefHeading___Toc5535_825272777"/>
-      <w:bookmarkEnd w:id="73"/>
+      <w:bookmarkStart w:id="74" w:name="__RefHeading___Toc5592_2460123423"/>
+      <w:bookmarkEnd w:id="74"/>
       <w:r>
         <w:rPr/>
         <w:t>10.1 vars</w:t>
@@ -34835,8 +35256,8 @@
         <w:outlineLvl w:val="1"/>
         <w:rPr/>
       </w:pPr>
-      <w:bookmarkStart w:id="74" w:name="__RefHeading___Toc5537_825272777"/>
-      <w:bookmarkEnd w:id="74"/>
+      <w:bookmarkStart w:id="75" w:name="__RefHeading___Toc5594_2460123423"/>
+      <w:bookmarkEnd w:id="75"/>
       <w:r>
         <w:rPr/>
         <w:t>10.2 helpers</w:t>
@@ -35008,8 +35429,8 @@
         <w:outlineLvl w:val="1"/>
         <w:rPr/>
       </w:pPr>
-      <w:bookmarkStart w:id="75" w:name="__RefHeading___Toc5539_825272777"/>
-      <w:bookmarkEnd w:id="75"/>
+      <w:bookmarkStart w:id="76" w:name="__RefHeading___Toc5596_2460123423"/>
+      <w:bookmarkEnd w:id="76"/>
       <w:r>
         <w:rPr/>
         <w:t>10.3 cursors</w:t>
@@ -35625,8 +36046,8 @@
         <w:outlineLvl w:val="1"/>
         <w:rPr/>
       </w:pPr>
-      <w:bookmarkStart w:id="76" w:name="__RefHeading___Toc5541_825272777"/>
-      <w:bookmarkEnd w:id="76"/>
+      <w:bookmarkStart w:id="77" w:name="__RefHeading___Toc5598_2460123423"/>
+      <w:bookmarkEnd w:id="77"/>
       <w:r>
         <w:rPr/>
         <w:t>10.4 media</w:t>
@@ -36649,8 +37070,8 @@
         <w:outlineLvl w:val="1"/>
         <w:rPr/>
       </w:pPr>
-      <w:bookmarkStart w:id="77" w:name="__RefHeading___Toc5543_825272777"/>
-      <w:bookmarkEnd w:id="77"/>
+      <w:bookmarkStart w:id="78" w:name="__RefHeading___Toc5600_2460123423"/>
+      <w:bookmarkEnd w:id="78"/>
       <w:r>
         <w:rPr/>
         <w:t>10.5 imageFormat</w:t>
@@ -37022,8 +37443,8 @@
         <w:outlineLvl w:val="1"/>
         <w:rPr/>
       </w:pPr>
-      <w:bookmarkStart w:id="78" w:name="__RefHeading___Toc5545_825272777"/>
-      <w:bookmarkEnd w:id="78"/>
+      <w:bookmarkStart w:id="79" w:name="__RefHeading___Toc5602_2460123423"/>
+      <w:bookmarkEnd w:id="79"/>
       <w:r>
         <w:rPr/>
         <w:t>10.6 sprites</w:t>
@@ -38221,8 +38642,8 @@
         <w:outlineLvl w:val="1"/>
         <w:rPr/>
       </w:pPr>
-      <w:bookmarkStart w:id="79" w:name="__RefHeading___Toc5547_825272777"/>
-      <w:bookmarkEnd w:id="79"/>
+      <w:bookmarkStart w:id="80" w:name="__RefHeading___Toc5604_2460123423"/>
+      <w:bookmarkEnd w:id="80"/>
       <w:r>
         <w:rPr/>
         <w:t>10.7 minify</w:t>
@@ -38783,8 +39204,8 @@
         <w:outlineLvl w:val="1"/>
         <w:rPr/>
       </w:pPr>
-      <w:bookmarkStart w:id="80" w:name="__RefHeading___Toc5549_825272777"/>
-      <w:bookmarkEnd w:id="80"/>
+      <w:bookmarkStart w:id="81" w:name="__RefHeading___Toc5606_2460123423"/>
+      <w:bookmarkEnd w:id="81"/>
       <w:r>
         <w:rPr/>
         <w:t>10.8 sounds</w:t>
@@ -39623,8 +40044,8 @@
         <w:outlineLvl w:val="1"/>
         <w:rPr/>
       </w:pPr>
-      <w:bookmarkStart w:id="81" w:name="__RefHeading___Toc5551_825272777"/>
-      <w:bookmarkEnd w:id="81"/>
+      <w:bookmarkStart w:id="82" w:name="__RefHeading___Toc5608_2460123423"/>
+      <w:bookmarkEnd w:id="82"/>
       <w:r>
         <w:rPr/>
         <w:t>10.9 font</w:t>
@@ -40279,7 +40700,18 @@
             </w:pPr>
             <w:r>
               <w:rPr/>
-              <w:t>Quellverzeichnis mit SVG-Glyphen (rekursiv), relativ zum Projektstamm</w:t>
+              <w:t xml:space="preserve">Quellverzeichnis mit SVG-Glyphen (rekursiv) </w:t>
+            </w:r>
+            <w:r>
+              <w:rPr>
+                <w:b/>
+                <w:bCs/>
+              </w:rPr>
+              <w:t>oder</w:t>
+            </w:r>
+            <w:r>
+              <w:rPr/>
+              <w:t xml:space="preserve"> TTF/OTF/WOFF/WOFF2-Color-/Emoji-Fontdatei, relativ zum Projektstamm</w:t>
             </w:r>
           </w:p>
         </w:tc>
@@ -41100,8 +41532,8 @@
         <w:outlineLvl w:val="1"/>
         <w:rPr/>
       </w:pPr>
-      <w:bookmarkStart w:id="82" w:name="__RefHeading___Toc5553_825272777"/>
-      <w:bookmarkEnd w:id="82"/>
+      <w:bookmarkStart w:id="83" w:name="__RefHeading___Toc5610_2460123423"/>
+      <w:bookmarkEnd w:id="83"/>
       <w:r>
         <w:rPr/>
         <w:t>10.10 files</w:t>
@@ -41264,8 +41696,8 @@
         <w:outlineLvl w:val="0"/>
         <w:rPr/>
       </w:pPr>
-      <w:bookmarkStart w:id="83" w:name="__RefHeading___Toc5555_825272777"/>
-      <w:bookmarkEnd w:id="83"/>
+      <w:bookmarkStart w:id="84" w:name="__RefHeading___Toc5612_2460123423"/>
+      <w:bookmarkEnd w:id="84"/>
       <w:r>
         <w:rPr/>
         <w:t>11 µ-Auswertungskontext (Referenz)</w:t>
@@ -41333,8 +41765,8 @@
         <w:outlineLvl w:val="1"/>
         <w:rPr/>
       </w:pPr>
-      <w:bookmarkStart w:id="84" w:name="__RefHeading___Toc5557_825272777"/>
-      <w:bookmarkEnd w:id="84"/>
+      <w:bookmarkStart w:id="85" w:name="__RefHeading___Toc5614_2460123423"/>
+      <w:bookmarkEnd w:id="85"/>
       <w:r>
         <w:rPr/>
         <w:t>11.1 Das $-Objekt</w:t>
@@ -41414,8 +41846,8 @@
         <w:outlineLvl w:val="1"/>
         <w:rPr/>
       </w:pPr>
-      <w:bookmarkStart w:id="85" w:name="__RefHeading___Toc5559_825272777"/>
-      <w:bookmarkEnd w:id="85"/>
+      <w:bookmarkStart w:id="86" w:name="__RefHeading___Toc5616_2460123423"/>
+      <w:bookmarkEnd w:id="86"/>
       <w:r>
         <w:rPr/>
         <w:t>11.2 Farb- und Wert-Funktionen</w:t>
@@ -42024,8 +42456,8 @@
         <w:outlineLvl w:val="1"/>
         <w:rPr/>
       </w:pPr>
-      <w:bookmarkStart w:id="86" w:name="__RefHeading___Toc5561_825272777"/>
-      <w:bookmarkEnd w:id="86"/>
+      <w:bookmarkStart w:id="87" w:name="__RefHeading___Toc5618_2460123423"/>
+      <w:bookmarkEnd w:id="87"/>
       <w:r>
         <w:rPr/>
         <w:t>11.3 Regel- und Dokument-Methoden</w:t>
@@ -42607,8 +43039,8 @@
         <w:outlineLvl w:val="1"/>
         <w:rPr/>
       </w:pPr>
-      <w:bookmarkStart w:id="87" w:name="__RefHeading___Toc5563_825272777"/>
-      <w:bookmarkEnd w:id="87"/>
+      <w:bookmarkStart w:id="88" w:name="__RefHeading___Toc5620_2460123423"/>
+      <w:bookmarkEnd w:id="88"/>
       <w:r>
         <w:rPr/>
         <w:t>11.4 Sprite()</w:t>
@@ -43388,8 +43820,8 @@
         <w:outlineLvl w:val="1"/>
         <w:rPr/>
       </w:pPr>
-      <w:bookmarkStart w:id="88" w:name="__RefHeading___Toc5565_825272777"/>
-      <w:bookmarkEnd w:id="88"/>
+      <w:bookmarkStart w:id="89" w:name="__RefHeading___Toc5622_2460123423"/>
+      <w:bookmarkEnd w:id="89"/>
       <w:r>
         <w:rPr/>
         <w:t>11.5 Cursor()</w:t>
@@ -43483,8 +43915,8 @@
         <w:outlineLvl w:val="1"/>
         <w:rPr/>
       </w:pPr>
-      <w:bookmarkStart w:id="89" w:name="__RefHeading___Toc5567_825272777"/>
-      <w:bookmarkEnd w:id="89"/>
+      <w:bookmarkStart w:id="90" w:name="__RefHeading___Toc5624_2460123423"/>
+      <w:bookmarkEnd w:id="90"/>
       <w:r>
         <w:rPr/>
         <w:t>11.6 DataUri()</w:t>
@@ -43652,8 +44084,8 @@
         <w:outlineLvl w:val="1"/>
         <w:rPr/>
       </w:pPr>
-      <w:bookmarkStart w:id="90" w:name="__RefHeading___Toc5569_825272777"/>
-      <w:bookmarkEnd w:id="90"/>
+      <w:bookmarkStart w:id="91" w:name="__RefHeading___Toc5626_2460123423"/>
+      <w:bookmarkEnd w:id="91"/>
       <w:r>
         <w:rPr/>
         <w:t>11.7 Helper-Funktionen und this-Bindung</w:t>
@@ -44116,8 +44548,8 @@
         <w:outlineLvl w:val="1"/>
         <w:rPr/>
       </w:pPr>
-      <w:bookmarkStart w:id="91" w:name="__RefHeading___Toc5571_825272777"/>
-      <w:bookmarkEnd w:id="91"/>
+      <w:bookmarkStart w:id="92" w:name="__RefHeading___Toc5628_2460123423"/>
+      <w:bookmarkEnd w:id="92"/>
       <w:r>
         <w:rPr/>
         <w:t>11.8 afterWork-Hooks</w:t>
@@ -44654,8 +45086,8 @@
         <w:outlineLvl w:val="0"/>
         <w:rPr/>
       </w:pPr>
-      <w:bookmarkStart w:id="92" w:name="__RefHeading___Toc5573_825272777"/>
-      <w:bookmarkEnd w:id="92"/>
+      <w:bookmarkStart w:id="93" w:name="__RefHeading___Toc5630_2460123423"/>
+      <w:bookmarkEnd w:id="93"/>
       <w:r>
         <w:rPr/>
         <w:t>12 Arbeiten mit Farben</w:t>
@@ -44672,8 +45104,8 @@
         <w:outlineLvl w:val="1"/>
         <w:rPr/>
       </w:pPr>
-      <w:bookmarkStart w:id="93" w:name="__RefHeading___Toc5575_825272777"/>
-      <w:bookmarkEnd w:id="93"/>
+      <w:bookmarkStart w:id="94" w:name="__RefHeading___Toc5632_2460123423"/>
+      <w:bookmarkEnd w:id="94"/>
       <w:r>
         <w:rPr/>
         <w:t>12.1 Farben definieren</w:t>
@@ -45093,8 +45525,8 @@
         <w:outlineLvl w:val="1"/>
         <w:rPr/>
       </w:pPr>
-      <w:bookmarkStart w:id="94" w:name="__RefHeading___Toc5577_825272777"/>
-      <w:bookmarkEnd w:id="94"/>
+      <w:bookmarkStart w:id="95" w:name="__RefHeading___Toc5634_2460123423"/>
+      <w:bookmarkEnd w:id="95"/>
       <w:r>
         <w:rPr/>
         <w:t>12.2 Alpha-Werte</w:t>
@@ -45376,8 +45808,8 @@
         <w:outlineLvl w:val="1"/>
         <w:rPr/>
       </w:pPr>
-      <w:bookmarkStart w:id="95" w:name="__RefHeading___Toc5579_825272777"/>
-      <w:bookmarkEnd w:id="95"/>
+      <w:bookmarkStart w:id="96" w:name="__RefHeading___Toc5636_2460123423"/>
+      <w:bookmarkEnd w:id="96"/>
       <w:r>
         <w:rPr/>
         <w:t>12.3 Farbberechnungen</w:t>
@@ -45629,8 +46061,8 @@
         <w:outlineLvl w:val="0"/>
         <w:rPr/>
       </w:pPr>
-      <w:bookmarkStart w:id="96" w:name="__RefHeading___Toc5581_825272777"/>
-      <w:bookmarkEnd w:id="96"/>
+      <w:bookmarkStart w:id="97" w:name="__RefHeading___Toc5638_2460123423"/>
+      <w:bookmarkEnd w:id="97"/>
       <w:r>
         <w:rPr/>
         <w:t>13 Node-API</w:t>
@@ -46960,8 +47392,8 @@
         <w:outlineLvl w:val="1"/>
         <w:rPr/>
       </w:pPr>
-      <w:bookmarkStart w:id="97" w:name="__RefHeading___Toc5583_825272777"/>
-      <w:bookmarkEnd w:id="97"/>
+      <w:bookmarkStart w:id="98" w:name="__RefHeading___Toc5640_2460123423"/>
+      <w:bookmarkEnd w:id="98"/>
       <w:r>
         <w:rPr/>
         <w:t>13.1 Versionshistorie-API (RELEASES.json)</w:t>
@@ -47711,8 +48143,8 @@
         <w:outlineLvl w:val="0"/>
         <w:rPr/>
       </w:pPr>
-      <w:bookmarkStart w:id="98" w:name="__RefHeading___Toc5585_825272777"/>
-      <w:bookmarkEnd w:id="98"/>
+      <w:bookmarkStart w:id="99" w:name="__RefHeading___Toc5642_2460123423"/>
+      <w:bookmarkEnd w:id="99"/>
       <w:r>
         <w:rPr/>
         <w:t>14 Fehlerdiagnostik</w:t>
@@ -48227,8 +48659,8 @@
         <w:outlineLvl w:val="0"/>
         <w:rPr/>
       </w:pPr>
-      <w:bookmarkStart w:id="99" w:name="__RefHeading___Toc5587_825272777"/>
-      <w:bookmarkEnd w:id="99"/>
+      <w:bookmarkStart w:id="100" w:name="__RefHeading___Toc5644_2460123423"/>
+      <w:bookmarkEnd w:id="100"/>
       <w:r>
         <w:rPr/>
         <w:t>15 Migration von µCSS™</w:t>
@@ -49450,8 +49882,8 @@
         <w:outlineLvl w:val="0"/>
         <w:rPr/>
       </w:pPr>
-      <w:bookmarkStart w:id="100" w:name="__RefHeading___Toc5589_825272777"/>
-      <w:bookmarkEnd w:id="100"/>
+      <w:bookmarkStart w:id="101" w:name="__RefHeading___Toc5646_2460123423"/>
+      <w:bookmarkEnd w:id="101"/>
       <w:r>
         <w:rPr/>
         <w:t>16 Versionshistorie</w:t>
@@ -51437,6 +51869,86 @@
           </w:p>
         </w:tc>
       </w:tr>
+      <w:tr>
+        <w:trPr/>
+        <w:tc>
+          <w:tcPr>
+            <w:tcW w:w="3008" w:type="dxa"/>
+            <w:tcBorders>
+              <w:top w:val="single" w:sz="4" w:space="0" w:color="999999"/>
+              <w:start w:val="single" w:sz="4" w:space="0" w:color="999999"/>
+              <w:bottom w:val="single" w:sz="4" w:space="0" w:color="999999"/>
+              <w:end w:val="single" w:sz="4" w:space="0" w:color="999999"/>
+            </w:tcBorders>
+          </w:tcPr>
+          <w:p>
+            <w:pPr>
+              <w:pStyle w:val="Normal"/>
+              <w:spacing w:before="40" w:after="40"/>
+              <w:rPr/>
+            </w:pPr>
+            <w:r>
+              <w:rPr/>
+              <w:t>2026-09</w:t>
+            </w:r>
+          </w:p>
+        </w:tc>
+        <w:tc>
+          <w:tcPr>
+            <w:tcW w:w="3009" w:type="dxa"/>
+            <w:tcBorders>
+              <w:top w:val="single" w:sz="4" w:space="0" w:color="999999"/>
+              <w:start w:val="single" w:sz="4" w:space="0" w:color="999999"/>
+              <w:bottom w:val="single" w:sz="4" w:space="0" w:color="999999"/>
+              <w:end w:val="single" w:sz="4" w:space="0" w:color="999999"/>
+            </w:tcBorders>
+          </w:tcPr>
+          <w:p>
+            <w:pPr>
+              <w:pStyle w:val="Normal"/>
+              <w:spacing w:before="40" w:after="40"/>
+              <w:rPr/>
+            </w:pPr>
+            <w:r>
+              <w:rPr/>
+              <w:t>2.5.18</w:t>
+            </w:r>
+          </w:p>
+        </w:tc>
+        <w:tc>
+          <w:tcPr>
+            <w:tcW w:w="3009" w:type="dxa"/>
+            <w:tcBorders>
+              <w:top w:val="single" w:sz="4" w:space="0" w:color="999999"/>
+              <w:start w:val="single" w:sz="4" w:space="0" w:color="999999"/>
+              <w:bottom w:val="single" w:sz="4" w:space="0" w:color="999999"/>
+              <w:end w:val="single" w:sz="4" w:space="0" w:color="999999"/>
+            </w:tcBorders>
+          </w:tcPr>
+          <w:p>
+            <w:pPr>
+              <w:pStyle w:val="Normal"/>
+              <w:spacing w:before="40" w:after="40"/>
+              <w:rPr/>
+            </w:pPr>
+            <w:r>
+              <w:rPr/>
+              <w:t xml:space="preserve">Handbuch *microFT*: OpenType-Color-Fonts und Emoji-Fonts (COLR/CPAL v0/v1, SVG-in-OpenType, CBDT/CBLC, sbix). </w:t>
+            </w:r>
+            <w:r>
+              <w:rPr>
+                <w:b/>
+                <w:bCs/>
+              </w:rPr>
+              <w:t>µFT</w:t>
+            </w:r>
+            <w:r>
+              <w:rPr/>
+              <w:t xml:space="preserve"> 0.2.0 verpackt vorhandene TTF/OTF/WOFF/WOFF2-Dateien ohne Color-Tables zu verwerfen.</w:t>
+            </w:r>
+          </w:p>
+        </w:tc>
+      </w:tr>
     </w:tbl>
     <w:p>
       <w:pPr>
@@ -51462,8 +51974,8 @@
         <w:outlineLvl w:val="0"/>
         <w:rPr/>
       </w:pPr>
-      <w:bookmarkStart w:id="101" w:name="__RefHeading___Toc5591_825272777"/>
-      <w:bookmarkEnd w:id="101"/>
+      <w:bookmarkStart w:id="102" w:name="__RefHeading___Toc5648_2460123423"/>
+      <w:bookmarkEnd w:id="102"/>
       <w:r>
         <w:rPr/>
         <w:t>17 Rechtliches</w:t>
@@ -51504,8 +52016,8 @@
         <w:outlineLvl w:val="1"/>
         <w:rPr/>
       </w:pPr>
-      <w:bookmarkStart w:id="102" w:name="__RefHeading___Toc5593_825272777"/>
-      <w:bookmarkEnd w:id="102"/>
+      <w:bookmarkStart w:id="103" w:name="__RefHeading___Toc5650_2460123423"/>
+      <w:bookmarkEnd w:id="103"/>
       <w:r>
         <w:rPr/>
         <w:t>17.1 MIT-Lizenz (Originaltext)</w:t>
@@ -51558,8 +52070,8 @@
         <w:outlineLvl w:val="1"/>
         <w:rPr/>
       </w:pPr>
-      <w:bookmarkStart w:id="103" w:name="__RefHeading___Toc5595_825272777"/>
-      <w:bookmarkEnd w:id="103"/>
+      <w:bookmarkStart w:id="104" w:name="__RefHeading___Toc5652_2460123423"/>
+      <w:bookmarkEnd w:id="104"/>
       <w:r>
         <w:rPr/>
         <w:t>17.2 Marken</w:t>
@@ -51588,8 +52100,8 @@
         <w:outlineLvl w:val="1"/>
         <w:rPr/>
       </w:pPr>
-      <w:bookmarkStart w:id="104" w:name="__RefHeading___Toc5597_825272777"/>
-      <w:bookmarkEnd w:id="104"/>
+      <w:bookmarkStart w:id="105" w:name="__RefHeading___Toc5654_2460123423"/>
+      <w:bookmarkEnd w:id="105"/>
       <w:r>
         <w:rPr/>
         <w:t>17.3 Verwendete Bibliotheken</w:t>

</xml_diff>

<commit_message>
Release gulp-mu-css 2.5.19: headless pipeline positioning.
</commit_message>
<xml_diff>
--- a/gulp-mu-css/docs/microCSS-de.docx
+++ b/gulp-mu-css/docs/microCSS-de.docx
@@ -136,7 +136,7 @@
           <w:sz w:val="24"/>
           <w:szCs w:val="24"/>
         </w:rPr>
-        <w:t>Version 2.5.18</w:t>
+        <w:t>Version 2.5.19</w:t>
       </w:r>
     </w:p>
     <w:p>
@@ -151,7 +151,7 @@
           <w:sz w:val="24"/>
           <w:szCs w:val="24"/>
         </w:rPr>
-        <w:t>2026-09-24</w:t>
+        <w:t>2026-10-01</w:t>
       </w:r>
     </w:p>
     <w:p>
@@ -215,7 +215,7 @@
             </w:rPr>
             <w:fldChar w:fldCharType="separate"/>
           </w:r>
-          <w:hyperlink w:anchor="__RefHeading___Toc5444_2460123423" w:tooltip="1 Einführung">
+          <w:hyperlink w:anchor="__RefHeading___Toc5488_759348175" w:tooltip="1 Einführung">
             <w:r>
               <w:rPr>
                 <w:rStyle w:val="Verzeichnissprung"/>
@@ -235,7 +235,7 @@
             </w:tabs>
             <w:rPr/>
           </w:pPr>
-          <w:hyperlink w:anchor="__RefHeading___Toc5446_2460123423" w:tooltip="1.1 Paketversionen und µGulp ready">
+          <w:hyperlink w:anchor="__RefHeading___Toc5490_759348175" w:tooltip="1.1 Paketversionen und µGulp ready">
             <w:r>
               <w:rPr>
                 <w:rStyle w:val="Verzeichnissprung"/>
@@ -255,12 +255,12 @@
             </w:tabs>
             <w:rPr/>
           </w:pPr>
-          <w:hyperlink w:anchor="__RefHeading___Toc5448_2460123423" w:tooltip="1.2 Werkzeuge und Kosten">
+          <w:hyperlink w:anchor="__RefHeading___Toc5492_759348175" w:tooltip="1.2 Einsatzebenen: interaktive Editoren vs. headless Pipeline">
             <w:r>
               <w:rPr>
                 <w:rStyle w:val="Verzeichnissprung"/>
               </w:rPr>
-              <w:t>1.2 Werkzeuge und Kosten</w:t>
+              <w:t>1.2 Einsatzebenen: interaktive Editoren vs. headless Pipeline</w:t>
               <w:tab/>
               <w:t>6</w:t>
             </w:r>
@@ -275,14 +275,14 @@
             </w:tabs>
             <w:rPr/>
           </w:pPr>
-          <w:hyperlink w:anchor="__RefHeading___Toc5450_2460123423" w:tooltip="1.3 Draft-Workflow (Authoring + Watch)">
+          <w:hyperlink w:anchor="__RefHeading___Toc5494_759348175" w:tooltip="1.3 Draft-Workflow (Authoring + Watch)">
             <w:r>
               <w:rPr>
                 <w:rStyle w:val="Verzeichnissprung"/>
               </w:rPr>
               <w:t>1.3 Draft-Workflow (Authoring + Watch)</w:t>
               <w:tab/>
-              <w:t>6</w:t>
+              <w:t>7</w:t>
             </w:r>
           </w:hyperlink>
         </w:p>
@@ -295,7 +295,7 @@
             </w:tabs>
             <w:rPr/>
           </w:pPr>
-          <w:hyperlink w:anchor="__RefHeading___Toc5452_2460123423" w:tooltip="1.3.1 Photopea (Browser, optional)">
+          <w:hyperlink w:anchor="__RefHeading___Toc5496_759348175" w:tooltip="1.3.1 Photopea (Browser, optional)">
             <w:r>
               <w:rPr>
                 <w:rStyle w:val="Verzeichnissprung"/>
@@ -315,14 +315,14 @@
             </w:tabs>
             <w:rPr/>
           </w:pPr>
-          <w:hyperlink w:anchor="__RefHeading___Toc5454_2460123423" w:tooltip="1.4 Einordnung: Warum µCSS™?">
+          <w:hyperlink w:anchor="__RefHeading___Toc5498_759348175" w:tooltip="1.4 Einordnung: Warum µCSS™?">
             <w:r>
               <w:rPr>
                 <w:rStyle w:val="Verzeichnissprung"/>
               </w:rPr>
               <w:t>1.4 Einordnung: Warum µCSS™?</w:t>
               <w:tab/>
-              <w:t>7</w:t>
+              <w:t>8</w:t>
             </w:r>
           </w:hyperlink>
         </w:p>
@@ -335,7 +335,7 @@
             </w:tabs>
             <w:rPr/>
           </w:pPr>
-          <w:hyperlink w:anchor="__RefHeading___Toc5456_2460123423" w:tooltip="2 Installation und Start">
+          <w:hyperlink w:anchor="__RefHeading___Toc5500_759348175" w:tooltip="2 Installation und Start">
             <w:r>
               <w:rPr>
                 <w:rStyle w:val="Verzeichnissprung"/>
@@ -355,7 +355,7 @@
             </w:tabs>
             <w:rPr/>
           </w:pPr>
-          <w:hyperlink w:anchor="__RefHeading___Toc5458_2460123423" w:tooltip="3 Anwendungsfälle">
+          <w:hyperlink w:anchor="__RefHeading___Toc5502_759348175" w:tooltip="3 Anwendungsfälle">
             <w:r>
               <w:rPr>
                 <w:rStyle w:val="Verzeichnissprung"/>
@@ -375,7 +375,7 @@
             </w:tabs>
             <w:rPr/>
           </w:pPr>
-          <w:hyperlink w:anchor="__RefHeading___Toc5460_2460123423" w:tooltip="3.1 Benannte Eigenschaften (Variablen)">
+          <w:hyperlink w:anchor="__RefHeading___Toc5504_759348175" w:tooltip="3.1 Benannte Eigenschaften (Variablen)">
             <w:r>
               <w:rPr>
                 <w:rStyle w:val="Verzeichnissprung"/>
@@ -395,7 +395,7 @@
             </w:tabs>
             <w:rPr/>
           </w:pPr>
-          <w:hyperlink w:anchor="__RefHeading___Toc5462_2460123423" w:tooltip="3.2 Berechnungen und Ausdrücke">
+          <w:hyperlink w:anchor="__RefHeading___Toc5506_759348175" w:tooltip="3.2 Berechnungen und Ausdrücke">
             <w:r>
               <w:rPr>
                 <w:rStyle w:val="Verzeichnissprung"/>
@@ -415,7 +415,7 @@
             </w:tabs>
             <w:rPr/>
           </w:pPr>
-          <w:hyperlink w:anchor="__RefHeading___Toc5464_2460123423" w:tooltip="3.3 Mehrere Layouts über Skin-Manifeste">
+          <w:hyperlink w:anchor="__RefHeading___Toc5508_759348175" w:tooltip="3.3 Mehrere Layouts über Skin-Manifeste">
             <w:r>
               <w:rPr>
                 <w:rStyle w:val="Verzeichnissprung"/>
@@ -435,7 +435,7 @@
             </w:tabs>
             <w:rPr/>
           </w:pPr>
-          <w:hyperlink w:anchor="__RefHeading___Toc5466_2460123423" w:tooltip="3.4 Automatische Sprite-Generierung">
+          <w:hyperlink w:anchor="__RefHeading___Toc5510_759348175" w:tooltip="3.4 Automatische Sprite-Generierung">
             <w:r>
               <w:rPr>
                 <w:rStyle w:val="Verzeichnissprung"/>
@@ -455,7 +455,7 @@
             </w:tabs>
             <w:rPr/>
           </w:pPr>
-          <w:hyperlink w:anchor="__RefHeading___Toc5468_2460123423" w:tooltip="3.5 Data-URI-Inlining (DataUri)">
+          <w:hyperlink w:anchor="__RefHeading___Toc5512_759348175" w:tooltip="3.5 Data-URI-Inlining (DataUri)">
             <w:r>
               <w:rPr>
                 <w:rStyle w:val="Verzeichnissprung"/>
@@ -475,7 +475,7 @@
             </w:tabs>
             <w:rPr/>
           </w:pPr>
-          <w:hyperlink w:anchor="__RefHeading___Toc5470_2460123423" w:tooltip="3.6 Bilder vorladen (Preload)">
+          <w:hyperlink w:anchor="__RefHeading___Toc5514_759348175" w:tooltip="3.6 Bilder vorladen (Preload)">
             <w:r>
               <w:rPr>
                 <w:rStyle w:val="Verzeichnissprung"/>
@@ -495,7 +495,7 @@
             </w:tabs>
             <w:rPr/>
           </w:pPr>
-          <w:hyperlink w:anchor="__RefHeading___Toc5472_2460123423" w:tooltip="3.7 Cursor mit Hotspot und Fallback">
+          <w:hyperlink w:anchor="__RefHeading___Toc5516_759348175" w:tooltip="3.7 Cursor mit Hotspot und Fallback">
             <w:r>
               <w:rPr>
                 <w:rStyle w:val="Verzeichnissprung"/>
@@ -515,7 +515,7 @@
             </w:tabs>
             <w:rPr/>
           </w:pPr>
-          <w:hyperlink w:anchor="__RefHeading___Toc5474_2460123423" w:tooltip="3.8 Automatische Bilderzeugung (media-Steps)">
+          <w:hyperlink w:anchor="__RefHeading___Toc5518_759348175" w:tooltip="3.8 Automatische Bilderzeugung (media-Steps)">
             <w:r>
               <w:rPr>
                 <w:rStyle w:val="Verzeichnissprung"/>
@@ -535,7 +535,7 @@
             </w:tabs>
             <w:rPr/>
           </w:pPr>
-          <w:hyperlink w:anchor="__RefHeading___Toc5476_2460123423" w:tooltip="3.8.1 Eigene media-Steps (Plugins)">
+          <w:hyperlink w:anchor="__RefHeading___Toc5520_759348175" w:tooltip="3.8.1 Eigene media-Steps (Plugins)">
             <w:r>
               <w:rPr>
                 <w:rStyle w:val="Verzeichnissprung"/>
@@ -555,7 +555,7 @@
             </w:tabs>
             <w:rPr/>
           </w:pPr>
-          <w:hyperlink w:anchor="__RefHeading___Toc5478_2460123423" w:tooltip="4 microPS (µPS) — Bildgeneratoren">
+          <w:hyperlink w:anchor="__RefHeading___Toc5522_759348175" w:tooltip="4 microPS (µPS) — Bildgeneratoren">
             <w:r>
               <w:rPr>
                 <w:rStyle w:val="Verzeichnissprung"/>
@@ -575,7 +575,7 @@
             </w:tabs>
             <w:rPr/>
           </w:pPr>
-          <w:hyperlink w:anchor="__RefHeading___Toc5480_2460123423" w:tooltip="4.1 API-Übersicht">
+          <w:hyperlink w:anchor="__RefHeading___Toc5524_759348175" w:tooltip="4.1 API-Übersicht">
             <w:r>
               <w:rPr>
                 <w:rStyle w:val="Verzeichnissprung"/>
@@ -595,14 +595,14 @@
             </w:tabs>
             <w:rPr/>
           </w:pPr>
-          <w:hyperlink w:anchor="__RefHeading___Toc5482_2460123423" w:tooltip="4.2 ButtonAndIconCreator">
+          <w:hyperlink w:anchor="__RefHeading___Toc5526_759348175" w:tooltip="4.2 ButtonAndIconCreator">
             <w:r>
               <w:rPr>
                 <w:rStyle w:val="Verzeichnissprung"/>
               </w:rPr>
               <w:t>4.2 ButtonAndIconCreator</w:t>
               <w:tab/>
-              <w:t>16</w:t>
+              <w:t>17</w:t>
             </w:r>
           </w:hyperlink>
         </w:p>
@@ -615,7 +615,7 @@
             </w:tabs>
             <w:rPr/>
           </w:pPr>
-          <w:hyperlink w:anchor="__RefHeading___Toc5484_2460123423" w:tooltip="4.2.1 CreateByTopLayerSets — ein Bild pro Gruppe">
+          <w:hyperlink w:anchor="__RefHeading___Toc5528_759348175" w:tooltip="4.2.1 CreateByTopLayerSets — ein Bild pro Gruppe">
             <w:r>
               <w:rPr>
                 <w:rStyle w:val="Verzeichnissprung"/>
@@ -635,7 +635,7 @@
             </w:tabs>
             <w:rPr/>
           </w:pPr>
-          <w:hyperlink w:anchor="__RefHeading___Toc5486_2460123423" w:tooltip="4.3 AppIconMaker">
+          <w:hyperlink w:anchor="__RefHeading___Toc5530_759348175" w:tooltip="4.3 AppIconMaker">
             <w:r>
               <w:rPr>
                 <w:rStyle w:val="Verzeichnissprung"/>
@@ -655,7 +655,7 @@
             </w:tabs>
             <w:rPr/>
           </w:pPr>
-          <w:hyperlink w:anchor="__RefHeading___Toc5488_2460123423" w:tooltip="4.4 SpriteAtlas und TileSheet">
+          <w:hyperlink w:anchor="__RefHeading___Toc5532_759348175" w:tooltip="4.4 SpriteAtlas und TileSheet">
             <w:r>
               <w:rPr>
                 <w:rStyle w:val="Verzeichnissprung"/>
@@ -675,7 +675,7 @@
             </w:tabs>
             <w:rPr/>
           </w:pPr>
-          <w:hyperlink w:anchor="__RefHeading___Toc5490_2460123423" w:tooltip="4.5 SequenceStrip und DSD-Format">
+          <w:hyperlink w:anchor="__RefHeading___Toc5534_759348175" w:tooltip="4.5 SequenceStrip und DSD-Format">
             <w:r>
               <w:rPr>
                 <w:rStyle w:val="Verzeichnissprung"/>
@@ -695,7 +695,7 @@
             </w:tabs>
             <w:rPr/>
           </w:pPr>
-          <w:hyperlink w:anchor="__RefHeading___Toc5492_2460123423" w:tooltip="4.5.1 DSD erzeugen (`CreateDsdFromImages`)">
+          <w:hyperlink w:anchor="__RefHeading___Toc5536_759348175" w:tooltip="4.5.1 DSD erzeugen (`CreateDsdFromImages`)">
             <w:r>
               <w:rPr>
                 <w:rStyle w:val="Verzeichnissprung"/>
@@ -715,7 +715,7 @@
             </w:tabs>
             <w:rPr/>
           </w:pPr>
-          <w:hyperlink w:anchor="__RefHeading___Toc5494_2460123423" w:tooltip="4.5.2 PSD-Sequenzgruppen">
+          <w:hyperlink w:anchor="__RefHeading___Toc5538_759348175" w:tooltip="4.5.2 PSD-Sequenzgruppen">
             <w:r>
               <w:rPr>
                 <w:rStyle w:val="Verzeichnissprung"/>
@@ -735,7 +735,7 @@
             </w:tabs>
             <w:rPr/>
           </w:pPr>
-          <w:hyperlink w:anchor="__RefHeading___Toc5496_2460123423" w:tooltip="4.6 Raster-Modell, I/O und Arbeitsblatt">
+          <w:hyperlink w:anchor="__RefHeading___Toc5540_759348175" w:tooltip="4.6 Raster-Modell, I/O und Arbeitsblatt">
             <w:r>
               <w:rPr>
                 <w:rStyle w:val="Verzeichnissprung"/>
@@ -755,7 +755,7 @@
             </w:tabs>
             <w:rPr/>
           </w:pPr>
-          <w:hyperlink w:anchor="__RefHeading___Toc5498_2460123423" w:tooltip="4.7 Bildanpassungen und Masken">
+          <w:hyperlink w:anchor="__RefHeading___Toc5542_759348175" w:tooltip="4.7 Bildanpassungen und Masken">
             <w:r>
               <w:rPr>
                 <w:rStyle w:val="Verzeichnissprung"/>
@@ -775,7 +775,7 @@
             </w:tabs>
             <w:rPr/>
           </w:pPr>
-          <w:hyperlink w:anchor="__RefHeading___Toc5500_2460123423" w:tooltip="4.7.1 Masken">
+          <w:hyperlink w:anchor="__RefHeading___Toc5544_759348175" w:tooltip="4.7.1 Masken">
             <w:r>
               <w:rPr>
                 <w:rStyle w:val="Verzeichnissprung"/>
@@ -795,7 +795,7 @@
             </w:tabs>
             <w:rPr/>
           </w:pPr>
-          <w:hyperlink w:anchor="__RefHeading___Toc5502_2460123423" w:tooltip="4.7.2 Auswahl-Engine">
+          <w:hyperlink w:anchor="__RefHeading___Toc5546_759348175" w:tooltip="4.7.2 Auswahl-Engine">
             <w:r>
               <w:rPr>
                 <w:rStyle w:val="Verzeichnissprung"/>
@@ -815,7 +815,7 @@
             </w:tabs>
             <w:rPr/>
           </w:pPr>
-          <w:hyperlink w:anchor="__RefHeading___Toc5504_2460123423" w:tooltip="4.7.3 ApplyGamma">
+          <w:hyperlink w:anchor="__RefHeading___Toc5548_759348175" w:tooltip="4.7.3 ApplyGamma">
             <w:r>
               <w:rPr>
                 <w:rStyle w:val="Verzeichnissprung"/>
@@ -835,7 +835,7 @@
             </w:tabs>
             <w:rPr/>
           </w:pPr>
-          <w:hyperlink w:anchor="__RefHeading___Toc5506_2460123423" w:tooltip="4.7.4 ApplyBrightnessContrast">
+          <w:hyperlink w:anchor="__RefHeading___Toc5550_759348175" w:tooltip="4.7.4 ApplyBrightnessContrast">
             <w:r>
               <w:rPr>
                 <w:rStyle w:val="Verzeichnissprung"/>
@@ -855,7 +855,7 @@
             </w:tabs>
             <w:rPr/>
           </w:pPr>
-          <w:hyperlink w:anchor="__RefHeading___Toc5508_2460123423" w:tooltip="4.7.5 ApplyHueSaturation">
+          <w:hyperlink w:anchor="__RefHeading___Toc5552_759348175" w:tooltip="4.7.5 ApplyHueSaturation">
             <w:r>
               <w:rPr>
                 <w:rStyle w:val="Verzeichnissprung"/>
@@ -875,7 +875,7 @@
             </w:tabs>
             <w:rPr/>
           </w:pPr>
-          <w:hyperlink w:anchor="__RefHeading___Toc5510_2460123423" w:tooltip="4.7.6 ApplyAdjustmentStack">
+          <w:hyperlink w:anchor="__RefHeading___Toc5554_759348175" w:tooltip="4.7.6 ApplyAdjustmentStack">
             <w:r>
               <w:rPr>
                 <w:rStyle w:val="Verzeichnissprung"/>
@@ -895,7 +895,7 @@
             </w:tabs>
             <w:rPr/>
           </w:pPr>
-          <w:hyperlink w:anchor="__RefHeading___Toc5512_2460123423" w:tooltip="4.8 Raster-Transformationen">
+          <w:hyperlink w:anchor="__RefHeading___Toc5556_759348175" w:tooltip="4.8 Raster-Transformationen">
             <w:r>
               <w:rPr>
                 <w:rStyle w:val="Verzeichnissprung"/>
@@ -915,7 +915,7 @@
             </w:tabs>
             <w:rPr/>
           </w:pPr>
-          <w:hyperlink w:anchor="__RefHeading___Toc5514_2460123423" w:tooltip="4.9 ExtendScript-Einstieg (`MuPsDoc`)">
+          <w:hyperlink w:anchor="__RefHeading___Toc5558_759348175" w:tooltip="4.9 ExtendScript-Einstieg (`MuPsDoc`)">
             <w:r>
               <w:rPr>
                 <w:rStyle w:val="Verzeichnissprung"/>
@@ -935,7 +935,7 @@
             </w:tabs>
             <w:rPr/>
           </w:pPr>
-          <w:hyperlink w:anchor="__RefHeading___Toc5516_2460123423" w:tooltip="4.10 PSD-Compositor und Ebenenzusammenführung">
+          <w:hyperlink w:anchor="__RefHeading___Toc5560_759348175" w:tooltip="4.10 PSD-Compositor und Ebenenzusammenführung">
             <w:r>
               <w:rPr>
                 <w:rStyle w:val="Verzeichnissprung"/>
@@ -955,7 +955,7 @@
             </w:tabs>
             <w:rPr/>
           </w:pPr>
-          <w:hyperlink w:anchor="__RefHeading___Toc5518_2460123423" w:tooltip="4.10.1 Nachgebildete Fülloptionen (Layer Styles)">
+          <w:hyperlink w:anchor="__RefHeading___Toc5562_759348175" w:tooltip="4.10.1 Nachgebildete Fülloptionen (Layer Styles)">
             <w:r>
               <w:rPr>
                 <w:rStyle w:val="Verzeichnissprung"/>
@@ -975,7 +975,7 @@
             </w:tabs>
             <w:rPr/>
           </w:pPr>
-          <w:hyperlink w:anchor="__RefHeading___Toc5520_2460123423" w:tooltip="4.10.2 Stilübertragung (ButtonAndIconCreator) vs. Ebenenverknüpfung">
+          <w:hyperlink w:anchor="__RefHeading___Toc5564_759348175" w:tooltip="4.10.2 Stilübertragung (ButtonAndIconCreator) vs. Ebenenverknüpfung">
             <w:r>
               <w:rPr>
                 <w:rStyle w:val="Verzeichnissprung"/>
@@ -995,7 +995,7 @@
             </w:tabs>
             <w:rPr/>
           </w:pPr>
-          <w:hyperlink w:anchor="__RefHeading___Toc5522_2460123423" w:tooltip="4.10.3 Deckkraft-Modell (drei getrennte Stellschrauben)">
+          <w:hyperlink w:anchor="__RefHeading___Toc5566_759348175" w:tooltip="4.10.3 Deckkraft-Modell (drei getrennte Stellschrauben)">
             <w:r>
               <w:rPr>
                 <w:rStyle w:val="Verzeichnissprung"/>
@@ -1015,7 +1015,7 @@
             </w:tabs>
             <w:rPr/>
           </w:pPr>
-          <w:hyperlink w:anchor="__RefHeading___Toc5524_2460123423" w:tooltip="4.10.4 Referenz-PSD und Adobe-Ground-Truth">
+          <w:hyperlink w:anchor="__RefHeading___Toc5568_759348175" w:tooltip="4.10.4 Referenz-PSD und Adobe-Ground-Truth">
             <w:r>
               <w:rPr>
                 <w:rStyle w:val="Verzeichnissprung"/>
@@ -1035,7 +1035,7 @@
             </w:tabs>
             <w:rPr/>
           </w:pPr>
-          <w:hyperlink w:anchor="__RefHeading___Toc5526_2460123423" w:tooltip="4.10.5 Werkzeuge (µPS-Entwicklung)">
+          <w:hyperlink w:anchor="__RefHeading___Toc5570_759348175" w:tooltip="4.10.5 Werkzeuge (µPS-Entwicklung)">
             <w:r>
               <w:rPr>
                 <w:rStyle w:val="Verzeichnissprung"/>
@@ -1055,7 +1055,7 @@
             </w:tabs>
             <w:rPr/>
           </w:pPr>
-          <w:hyperlink w:anchor="__RefHeading___Toc5528_2460123423" w:tooltip="4.11 Draft-Workflow (Authoring + Watch)">
+          <w:hyperlink w:anchor="__RefHeading___Toc5572_759348175" w:tooltip="4.11 Draft-Workflow (Authoring + Watch)">
             <w:r>
               <w:rPr>
                 <w:rStyle w:val="Verzeichnissprung"/>
@@ -1075,7 +1075,7 @@
             </w:tabs>
             <w:rPr/>
           </w:pPr>
-          <w:hyperlink w:anchor="__RefHeading___Toc5530_2460123423" w:tooltip="4.11.1 Zwischenschritte raw → final (`outputBase`)">
+          <w:hyperlink w:anchor="__RefHeading___Toc5574_759348175" w:tooltip="4.11.1 Zwischenschritte raw → final (`outputBase`)">
             <w:r>
               <w:rPr>
                 <w:rStyle w:val="Verzeichnissprung"/>
@@ -1095,7 +1095,7 @@
             </w:tabs>
             <w:rPr/>
           </w:pPr>
-          <w:hyperlink w:anchor="__RefHeading___Toc5532_2460123423" w:tooltip="5 microAU (µAU) — Sound-Atlas">
+          <w:hyperlink w:anchor="__RefHeading___Toc5576_759348175" w:tooltip="5 microAU (µAU) — Sound-Atlas">
             <w:r>
               <w:rPr>
                 <w:rStyle w:val="Verzeichnissprung"/>
@@ -1115,7 +1115,7 @@
             </w:tabs>
             <w:rPr/>
           </w:pPr>
-          <w:hyperlink w:anchor="__RefHeading___Toc5534_2460123423" w:tooltip="5.1 API-Übersicht">
+          <w:hyperlink w:anchor="__RefHeading___Toc5578_759348175" w:tooltip="5.1 API-Übersicht">
             <w:r>
               <w:rPr>
                 <w:rStyle w:val="Verzeichnissprung"/>
@@ -1135,7 +1135,7 @@
             </w:tabs>
             <w:rPr/>
           </w:pPr>
-          <w:hyperlink w:anchor="__RefHeading___Toc5536_2460123423" w:tooltip="5.2 SoundAtlasMaker">
+          <w:hyperlink w:anchor="__RefHeading___Toc5580_759348175" w:tooltip="5.2 SoundAtlasMaker">
             <w:r>
               <w:rPr>
                 <w:rStyle w:val="Verzeichnissprung"/>
@@ -1155,7 +1155,7 @@
             </w:tabs>
             <w:rPr/>
           </w:pPr>
-          <w:hyperlink w:anchor="__RefHeading___Toc5538_2460123423" w:tooltip="5.2.1 Loop-Punkte im Dateinamen">
+          <w:hyperlink w:anchor="__RefHeading___Toc5582_759348175" w:tooltip="5.2.1 Loop-Punkte im Dateinamen">
             <w:r>
               <w:rPr>
                 <w:rStyle w:val="Verzeichnissprung"/>
@@ -1175,7 +1175,7 @@
             </w:tabs>
             <w:rPr/>
           </w:pPr>
-          <w:hyperlink w:anchor="__RefHeading___Toc5540_2460123423" w:tooltip="5.2.2 JSON-Format">
+          <w:hyperlink w:anchor="__RefHeading___Toc5584_759348175" w:tooltip="5.2.2 JSON-Format">
             <w:r>
               <w:rPr>
                 <w:rStyle w:val="Verzeichnissprung"/>
@@ -1195,7 +1195,7 @@
             </w:tabs>
             <w:rPr/>
           </w:pPr>
-          <w:hyperlink w:anchor="__RefHeading___Toc5542_2460123423" w:tooltip="5.2.3 MP3-Eingaben">
+          <w:hyperlink w:anchor="__RefHeading___Toc5586_759348175" w:tooltip="5.2.3 MP3-Eingaben">
             <w:r>
               <w:rPr>
                 <w:rStyle w:val="Verzeichnissprung"/>
@@ -1215,7 +1215,7 @@
             </w:tabs>
             <w:rPr/>
           </w:pPr>
-          <w:hyperlink w:anchor="__RefHeading___Toc5544_2460123423" w:tooltip="5.3 Anbindung an µCSS™ (Manifest `sounds`)">
+          <w:hyperlink w:anchor="__RefHeading___Toc5588_759348175" w:tooltip="5.3 Anbindung an µCSS™ (Manifest `sounds`)">
             <w:r>
               <w:rPr>
                 <w:rStyle w:val="Verzeichnissprung"/>
@@ -1235,7 +1235,7 @@
             </w:tabs>
             <w:rPr/>
           </w:pPr>
-          <w:hyperlink w:anchor="__RefHeading___Toc5546_2460123423" w:tooltip="5.3.1 Geplant: CSS-Sounds, Auto-Wiring &amp; Handler-Overrides">
+          <w:hyperlink w:anchor="__RefHeading___Toc5590_759348175" w:tooltip="5.3.1 Geplant: CSS-Sounds, Auto-Wiring &amp; Handler-Overrides">
             <w:r>
               <w:rPr>
                 <w:rStyle w:val="Verzeichnissprung"/>
@@ -1255,7 +1255,7 @@
             </w:tabs>
             <w:rPr/>
           </w:pPr>
-          <w:hyperlink w:anchor="__RefHeading___Toc5548_2460123423" w:tooltip="6 microFT (µFT) — Icon-Font">
+          <w:hyperlink w:anchor="__RefHeading___Toc5592_759348175" w:tooltip="6 microFT (µFT) — Icon-Font">
             <w:r>
               <w:rPr>
                 <w:rStyle w:val="Verzeichnissprung"/>
@@ -1275,7 +1275,7 @@
             </w:tabs>
             <w:rPr/>
           </w:pPr>
-          <w:hyperlink w:anchor="__RefHeading___Toc5550_2460123423" w:tooltip="6.1 Glyphen-Benennung">
+          <w:hyperlink w:anchor="__RefHeading___Toc5594_759348175" w:tooltip="6.1 Glyphen-Benennung">
             <w:r>
               <w:rPr>
                 <w:rStyle w:val="Verzeichnissprung"/>
@@ -1295,7 +1295,7 @@
             </w:tabs>
             <w:rPr/>
           </w:pPr>
-          <w:hyperlink w:anchor="__RefHeading___Toc5552_2460123423" w:tooltip="6.2 FontGenerator">
+          <w:hyperlink w:anchor="__RefHeading___Toc5596_759348175" w:tooltip="6.2 FontGenerator">
             <w:r>
               <w:rPr>
                 <w:rStyle w:val="Verzeichnissprung"/>
@@ -1315,7 +1315,7 @@
             </w:tabs>
             <w:rPr/>
           </w:pPr>
-          <w:hyperlink w:anchor="__RefHeading___Toc5554_2460123423" w:tooltip="6.3 API-Bausteine">
+          <w:hyperlink w:anchor="__RefHeading___Toc5598_759348175" w:tooltip="6.3 API-Bausteine">
             <w:r>
               <w:rPr>
                 <w:rStyle w:val="Verzeichnissprung"/>
@@ -1335,7 +1335,7 @@
             </w:tabs>
             <w:rPr/>
           </w:pPr>
-          <w:hyperlink w:anchor="__RefHeading___Toc5556_2460123423" w:tooltip="6.4 Color Fonts und Emoji-Fonts">
+          <w:hyperlink w:anchor="__RefHeading___Toc5600_759348175" w:tooltip="6.4 Color Fonts und Emoji-Fonts">
             <w:r>
               <w:rPr>
                 <w:rStyle w:val="Verzeichnissprung"/>
@@ -1355,7 +1355,7 @@
             </w:tabs>
             <w:rPr/>
           </w:pPr>
-          <w:hyperlink w:anchor="__RefHeading___Toc5558_2460123423" w:tooltip="6.5 Anbindung an µCSS™">
+          <w:hyperlink w:anchor="__RefHeading___Toc5602_759348175" w:tooltip="6.5 Anbindung an µCSS™">
             <w:r>
               <w:rPr>
                 <w:rStyle w:val="Verzeichnissprung"/>
@@ -1375,7 +1375,7 @@
             </w:tabs>
             <w:rPr/>
           </w:pPr>
-          <w:hyperlink w:anchor="__RefHeading___Toc5560_2460123423" w:tooltip="7 Vue und Komponenten-Co-Location">
+          <w:hyperlink w:anchor="__RefHeading___Toc5604_759348175" w:tooltip="7 Vue und Komponenten-Co-Location">
             <w:r>
               <w:rPr>
                 <w:rStyle w:val="Verzeichnissprung"/>
@@ -1395,7 +1395,7 @@
             </w:tabs>
             <w:rPr/>
           </w:pPr>
-          <w:hyperlink w:anchor="__RefHeading___Toc5562_2460123423" w:tooltip="7.1 Ablauf">
+          <w:hyperlink w:anchor="__RefHeading___Toc5606_759348175" w:tooltip="7.1 Ablauf">
             <w:r>
               <w:rPr>
                 <w:rStyle w:val="Verzeichnissprung"/>
@@ -1415,7 +1415,7 @@
             </w:tabs>
             <w:rPr/>
           </w:pPr>
-          <w:hyperlink w:anchor="__RefHeading___Toc5564_2460123423" w:tooltip="7.2 Namespaces und globale State-Klassen">
+          <w:hyperlink w:anchor="__RefHeading___Toc5608_759348175" w:tooltip="7.2 Namespaces und globale State-Klassen">
             <w:r>
               <w:rPr>
                 <w:rStyle w:val="Verzeichnissprung"/>
@@ -1435,7 +1435,7 @@
             </w:tabs>
             <w:rPr/>
           </w:pPr>
-          <w:hyperlink w:anchor="__RefHeading___Toc5566_2460123423" w:tooltip="7.3 Bestehende Vue-SFCs migrieren">
+          <w:hyperlink w:anchor="__RefHeading___Toc5610_759348175" w:tooltip="7.3 Bestehende Vue-SFCs migrieren">
             <w:r>
               <w:rPr>
                 <w:rStyle w:val="Verzeichnissprung"/>
@@ -1455,7 +1455,7 @@
             </w:tabs>
             <w:rPr/>
           </w:pPr>
-          <w:hyperlink w:anchor="__RefHeading___Toc5568_2460123423" w:tooltip="8 Grundideen von µCSS™">
+          <w:hyperlink w:anchor="__RefHeading___Toc5612_759348175" w:tooltip="8 Grundideen von µCSS™">
             <w:r>
               <w:rPr>
                 <w:rStyle w:val="Verzeichnissprung"/>
@@ -1475,7 +1475,7 @@
             </w:tabs>
             <w:rPr/>
           </w:pPr>
-          <w:hyperlink w:anchor="__RefHeading___Toc5570_2460123423" w:tooltip="8.1 Das .µ.css-Format">
+          <w:hyperlink w:anchor="__RefHeading___Toc5614_759348175" w:tooltip="8.1 Das .µ.css-Format">
             <w:r>
               <w:rPr>
                 <w:rStyle w:val="Verzeichnissprung"/>
@@ -1495,7 +1495,7 @@
             </w:tabs>
             <w:rPr/>
           </w:pPr>
-          <w:hyperlink w:anchor="__RefHeading___Toc5572_2460123423" w:tooltip="8.2 Werte-Interpolation µ(Ausdruck)">
+          <w:hyperlink w:anchor="__RefHeading___Toc5616_759348175" w:tooltip="8.2 Werte-Interpolation µ(Ausdruck)">
             <w:r>
               <w:rPr>
                 <w:rStyle w:val="Verzeichnissprung"/>
@@ -1515,7 +1515,7 @@
             </w:tabs>
             <w:rPr/>
           </w:pPr>
-          <w:hyperlink w:anchor="__RefHeading___Toc5574_2460123423" w:tooltip="8.3 Direktiven -µ: Ausdruck">
+          <w:hyperlink w:anchor="__RefHeading___Toc5618_759348175" w:tooltip="8.3 Direktiven -µ: Ausdruck">
             <w:r>
               <w:rPr>
                 <w:rStyle w:val="Verzeichnissprung"/>
@@ -1535,7 +1535,7 @@
             </w:tabs>
             <w:rPr/>
           </w:pPr>
-          <w:hyperlink w:anchor="__RefHeading___Toc5576_2460123423" w:tooltip="8.4 Das Skin-Manifest">
+          <w:hyperlink w:anchor="__RefHeading___Toc5620_759348175" w:tooltip="8.4 Das Skin-Manifest">
             <w:r>
               <w:rPr>
                 <w:rStyle w:val="Verzeichnissprung"/>
@@ -1555,7 +1555,7 @@
             </w:tabs>
             <w:rPr/>
           </w:pPr>
-          <w:hyperlink w:anchor="__RefHeading___Toc5578_2460123423" w:tooltip="8.5 JavaScript ohne Ersatzzeichen">
+          <w:hyperlink w:anchor="__RefHeading___Toc5622_759348175" w:tooltip="8.5 JavaScript ohne Ersatzzeichen">
             <w:r>
               <w:rPr>
                 <w:rStyle w:val="Verzeichnissprung"/>
@@ -1575,7 +1575,7 @@
             </w:tabs>
             <w:rPr/>
           </w:pPr>
-          <w:hyperlink w:anchor="__RefHeading___Toc5580_2460123423" w:tooltip="9 Build-Ablauf und Gulp-Integration">
+          <w:hyperlink w:anchor="__RefHeading___Toc5624_759348175" w:tooltip="9 Build-Ablauf und Gulp-Integration">
             <w:r>
               <w:rPr>
                 <w:rStyle w:val="Verzeichnissprung"/>
@@ -1595,7 +1595,7 @@
             </w:tabs>
             <w:rPr/>
           </w:pPr>
-          <w:hyperlink w:anchor="__RefHeading___Toc5582_2460123423" w:tooltip="9.1 Verzeichniskonventionen">
+          <w:hyperlink w:anchor="__RefHeading___Toc5626_759348175" w:tooltip="9.1 Verzeichniskonventionen">
             <w:r>
               <w:rPr>
                 <w:rStyle w:val="Verzeichnissprung"/>
@@ -1615,7 +1615,7 @@
             </w:tabs>
             <w:rPr/>
           </w:pPr>
-          <w:hyperlink w:anchor="__RefHeading___Toc5584_2460123423" w:tooltip="9.2 Kompilierungs-Ablauf">
+          <w:hyperlink w:anchor="__RefHeading___Toc5628_759348175" w:tooltip="9.2 Kompilierungs-Ablauf">
             <w:r>
               <w:rPr>
                 <w:rStyle w:val="Verzeichnissprung"/>
@@ -1635,7 +1635,7 @@
             </w:tabs>
             <w:rPr/>
           </w:pPr>
-          <w:hyperlink w:anchor="__RefHeading___Toc5586_2460123423" w:tooltip="9.3 Inkrementeller Build und Cache">
+          <w:hyperlink w:anchor="__RefHeading___Toc5630_759348175" w:tooltip="9.3 Inkrementeller Build und Cache">
             <w:r>
               <w:rPr>
                 <w:rStyle w:val="Verzeichnissprung"/>
@@ -1655,7 +1655,7 @@
             </w:tabs>
             <w:rPr/>
           </w:pPr>
-          <w:hyperlink w:anchor="__RefHeading___Toc5588_2460123423" w:tooltip="9.4 Gulp-Tasks und Watch">
+          <w:hyperlink w:anchor="__RefHeading___Toc5632_759348175" w:tooltip="9.4 Gulp-Tasks und Watch">
             <w:r>
               <w:rPr>
                 <w:rStyle w:val="Verzeichnissprung"/>
@@ -1675,7 +1675,7 @@
             </w:tabs>
             <w:rPr/>
           </w:pPr>
-          <w:hyperlink w:anchor="__RefHeading___Toc5590_2460123423" w:tooltip="10 Manifest-Referenz (DefineSkin)">
+          <w:hyperlink w:anchor="__RefHeading___Toc5634_759348175" w:tooltip="10 Manifest-Referenz (DefineSkin)">
             <w:r>
               <w:rPr>
                 <w:rStyle w:val="Verzeichnissprung"/>
@@ -1695,7 +1695,7 @@
             </w:tabs>
             <w:rPr/>
           </w:pPr>
-          <w:hyperlink w:anchor="__RefHeading___Toc5592_2460123423" w:tooltip="10.1 vars">
+          <w:hyperlink w:anchor="__RefHeading___Toc5636_759348175" w:tooltip="10.1 vars">
             <w:r>
               <w:rPr>
                 <w:rStyle w:val="Verzeichnissprung"/>
@@ -1715,7 +1715,7 @@
             </w:tabs>
             <w:rPr/>
           </w:pPr>
-          <w:hyperlink w:anchor="__RefHeading___Toc5594_2460123423" w:tooltip="10.2 helpers">
+          <w:hyperlink w:anchor="__RefHeading___Toc5638_759348175" w:tooltip="10.2 helpers">
             <w:r>
               <w:rPr>
                 <w:rStyle w:val="Verzeichnissprung"/>
@@ -1735,7 +1735,7 @@
             </w:tabs>
             <w:rPr/>
           </w:pPr>
-          <w:hyperlink w:anchor="__RefHeading___Toc5596_2460123423" w:tooltip="10.3 cursors">
+          <w:hyperlink w:anchor="__RefHeading___Toc5640_759348175" w:tooltip="10.3 cursors">
             <w:r>
               <w:rPr>
                 <w:rStyle w:val="Verzeichnissprung"/>
@@ -1755,7 +1755,7 @@
             </w:tabs>
             <w:rPr/>
           </w:pPr>
-          <w:hyperlink w:anchor="__RefHeading___Toc5598_2460123423" w:tooltip="10.4 media">
+          <w:hyperlink w:anchor="__RefHeading___Toc5642_759348175" w:tooltip="10.4 media">
             <w:r>
               <w:rPr>
                 <w:rStyle w:val="Verzeichnissprung"/>
@@ -1775,7 +1775,7 @@
             </w:tabs>
             <w:rPr/>
           </w:pPr>
-          <w:hyperlink w:anchor="__RefHeading___Toc5600_2460123423" w:tooltip="10.5 imageFormat">
+          <w:hyperlink w:anchor="__RefHeading___Toc5644_759348175" w:tooltip="10.5 imageFormat">
             <w:r>
               <w:rPr>
                 <w:rStyle w:val="Verzeichnissprung"/>
@@ -1795,7 +1795,7 @@
             </w:tabs>
             <w:rPr/>
           </w:pPr>
-          <w:hyperlink w:anchor="__RefHeading___Toc5602_2460123423" w:tooltip="10.6 sprites">
+          <w:hyperlink w:anchor="__RefHeading___Toc5646_759348175" w:tooltip="10.6 sprites">
             <w:r>
               <w:rPr>
                 <w:rStyle w:val="Verzeichnissprung"/>
@@ -1815,7 +1815,7 @@
             </w:tabs>
             <w:rPr/>
           </w:pPr>
-          <w:hyperlink w:anchor="__RefHeading___Toc5604_2460123423" w:tooltip="10.7 minify">
+          <w:hyperlink w:anchor="__RefHeading___Toc5648_759348175" w:tooltip="10.7 minify">
             <w:r>
               <w:rPr>
                 <w:rStyle w:val="Verzeichnissprung"/>
@@ -1835,7 +1835,7 @@
             </w:tabs>
             <w:rPr/>
           </w:pPr>
-          <w:hyperlink w:anchor="__RefHeading___Toc5606_2460123423" w:tooltip="10.8 sounds">
+          <w:hyperlink w:anchor="__RefHeading___Toc5650_759348175" w:tooltip="10.8 sounds">
             <w:r>
               <w:rPr>
                 <w:rStyle w:val="Verzeichnissprung"/>
@@ -1855,7 +1855,7 @@
             </w:tabs>
             <w:rPr/>
           </w:pPr>
-          <w:hyperlink w:anchor="__RefHeading___Toc5608_2460123423" w:tooltip="10.9 font">
+          <w:hyperlink w:anchor="__RefHeading___Toc5652_759348175" w:tooltip="10.9 font">
             <w:r>
               <w:rPr>
                 <w:rStyle w:val="Verzeichnissprung"/>
@@ -1875,7 +1875,7 @@
             </w:tabs>
             <w:rPr/>
           </w:pPr>
-          <w:hyperlink w:anchor="__RefHeading___Toc5610_2460123423" w:tooltip="10.10 files">
+          <w:hyperlink w:anchor="__RefHeading___Toc5654_759348175" w:tooltip="10.10 files">
             <w:r>
               <w:rPr>
                 <w:rStyle w:val="Verzeichnissprung"/>
@@ -1895,7 +1895,7 @@
             </w:tabs>
             <w:rPr/>
           </w:pPr>
-          <w:hyperlink w:anchor="__RefHeading___Toc5612_2460123423" w:tooltip="11 µ-Auswertungskontext (Referenz)">
+          <w:hyperlink w:anchor="__RefHeading___Toc5656_759348175" w:tooltip="11 µ-Auswertungskontext (Referenz)">
             <w:r>
               <w:rPr>
                 <w:rStyle w:val="Verzeichnissprung"/>
@@ -1915,7 +1915,7 @@
             </w:tabs>
             <w:rPr/>
           </w:pPr>
-          <w:hyperlink w:anchor="__RefHeading___Toc5614_2460123423" w:tooltip="11.1 Das $-Objekt">
+          <w:hyperlink w:anchor="__RefHeading___Toc5658_759348175" w:tooltip="11.1 Das $-Objekt">
             <w:r>
               <w:rPr>
                 <w:rStyle w:val="Verzeichnissprung"/>
@@ -1935,7 +1935,7 @@
             </w:tabs>
             <w:rPr/>
           </w:pPr>
-          <w:hyperlink w:anchor="__RefHeading___Toc5616_2460123423" w:tooltip="11.2 Farb- und Wert-Funktionen">
+          <w:hyperlink w:anchor="__RefHeading___Toc5660_759348175" w:tooltip="11.2 Farb- und Wert-Funktionen">
             <w:r>
               <w:rPr>
                 <w:rStyle w:val="Verzeichnissprung"/>
@@ -1955,7 +1955,7 @@
             </w:tabs>
             <w:rPr/>
           </w:pPr>
-          <w:hyperlink w:anchor="__RefHeading___Toc5618_2460123423" w:tooltip="11.3 Regel- und Dokument-Methoden">
+          <w:hyperlink w:anchor="__RefHeading___Toc5662_759348175" w:tooltip="11.3 Regel- und Dokument-Methoden">
             <w:r>
               <w:rPr>
                 <w:rStyle w:val="Verzeichnissprung"/>
@@ -1975,7 +1975,7 @@
             </w:tabs>
             <w:rPr/>
           </w:pPr>
-          <w:hyperlink w:anchor="__RefHeading___Toc5620_2460123423" w:tooltip="11.4 Sprite()">
+          <w:hyperlink w:anchor="__RefHeading___Toc5664_759348175" w:tooltip="11.4 Sprite()">
             <w:r>
               <w:rPr>
                 <w:rStyle w:val="Verzeichnissprung"/>
@@ -1995,7 +1995,7 @@
             </w:tabs>
             <w:rPr/>
           </w:pPr>
-          <w:hyperlink w:anchor="__RefHeading___Toc5622_2460123423" w:tooltip="11.5 Cursor()">
+          <w:hyperlink w:anchor="__RefHeading___Toc5666_759348175" w:tooltip="11.5 Cursor()">
             <w:r>
               <w:rPr>
                 <w:rStyle w:val="Verzeichnissprung"/>
@@ -2015,7 +2015,7 @@
             </w:tabs>
             <w:rPr/>
           </w:pPr>
-          <w:hyperlink w:anchor="__RefHeading___Toc5624_2460123423" w:tooltip="11.6 DataUri()">
+          <w:hyperlink w:anchor="__RefHeading___Toc5668_759348175" w:tooltip="11.6 DataUri()">
             <w:r>
               <w:rPr>
                 <w:rStyle w:val="Verzeichnissprung"/>
@@ -2035,7 +2035,7 @@
             </w:tabs>
             <w:rPr/>
           </w:pPr>
-          <w:hyperlink w:anchor="__RefHeading___Toc5626_2460123423" w:tooltip="11.7 Helper-Funktionen und this-Bindung">
+          <w:hyperlink w:anchor="__RefHeading___Toc5670_759348175" w:tooltip="11.7 Helper-Funktionen und this-Bindung">
             <w:r>
               <w:rPr>
                 <w:rStyle w:val="Verzeichnissprung"/>
@@ -2055,7 +2055,7 @@
             </w:tabs>
             <w:rPr/>
           </w:pPr>
-          <w:hyperlink w:anchor="__RefHeading___Toc5628_2460123423" w:tooltip="11.8 afterWork-Hooks">
+          <w:hyperlink w:anchor="__RefHeading___Toc5672_759348175" w:tooltip="11.8 afterWork-Hooks">
             <w:r>
               <w:rPr>
                 <w:rStyle w:val="Verzeichnissprung"/>
@@ -2075,7 +2075,7 @@
             </w:tabs>
             <w:rPr/>
           </w:pPr>
-          <w:hyperlink w:anchor="__RefHeading___Toc5630_2460123423" w:tooltip="12 Arbeiten mit Farben">
+          <w:hyperlink w:anchor="__RefHeading___Toc5674_759348175" w:tooltip="12 Arbeiten mit Farben">
             <w:r>
               <w:rPr>
                 <w:rStyle w:val="Verzeichnissprung"/>
@@ -2095,7 +2095,7 @@
             </w:tabs>
             <w:rPr/>
           </w:pPr>
-          <w:hyperlink w:anchor="__RefHeading___Toc5632_2460123423" w:tooltip="12.1 Farben definieren">
+          <w:hyperlink w:anchor="__RefHeading___Toc5676_759348175" w:tooltip="12.1 Farben definieren">
             <w:r>
               <w:rPr>
                 <w:rStyle w:val="Verzeichnissprung"/>
@@ -2115,7 +2115,7 @@
             </w:tabs>
             <w:rPr/>
           </w:pPr>
-          <w:hyperlink w:anchor="__RefHeading___Toc5634_2460123423" w:tooltip="12.2 Alpha-Werte">
+          <w:hyperlink w:anchor="__RefHeading___Toc5678_759348175" w:tooltip="12.2 Alpha-Werte">
             <w:r>
               <w:rPr>
                 <w:rStyle w:val="Verzeichnissprung"/>
@@ -2135,7 +2135,7 @@
             </w:tabs>
             <w:rPr/>
           </w:pPr>
-          <w:hyperlink w:anchor="__RefHeading___Toc5636_2460123423" w:tooltip="12.3 Farbberechnungen">
+          <w:hyperlink w:anchor="__RefHeading___Toc5680_759348175" w:tooltip="12.3 Farbberechnungen">
             <w:r>
               <w:rPr>
                 <w:rStyle w:val="Verzeichnissprung"/>
@@ -2155,7 +2155,7 @@
             </w:tabs>
             <w:rPr/>
           </w:pPr>
-          <w:hyperlink w:anchor="__RefHeading___Toc5638_2460123423" w:tooltip="13 Node-API">
+          <w:hyperlink w:anchor="__RefHeading___Toc5682_759348175" w:tooltip="13 Node-API">
             <w:r>
               <w:rPr>
                 <w:rStyle w:val="Verzeichnissprung"/>
@@ -2175,7 +2175,7 @@
             </w:tabs>
             <w:rPr/>
           </w:pPr>
-          <w:hyperlink w:anchor="__RefHeading___Toc5640_2460123423" w:tooltip="13.1 Versionshistorie-API (RELEASES.json)">
+          <w:hyperlink w:anchor="__RefHeading___Toc5684_759348175" w:tooltip="13.1 Versionshistorie-API (RELEASES.json)">
             <w:r>
               <w:rPr>
                 <w:rStyle w:val="Verzeichnissprung"/>
@@ -2195,7 +2195,7 @@
             </w:tabs>
             <w:rPr/>
           </w:pPr>
-          <w:hyperlink w:anchor="__RefHeading___Toc5642_2460123423" w:tooltip="14 Fehlerdiagnostik">
+          <w:hyperlink w:anchor="__RefHeading___Toc5686_759348175" w:tooltip="14 Fehlerdiagnostik">
             <w:r>
               <w:rPr>
                 <w:rStyle w:val="Verzeichnissprung"/>
@@ -2215,7 +2215,7 @@
             </w:tabs>
             <w:rPr/>
           </w:pPr>
-          <w:hyperlink w:anchor="__RefHeading___Toc5644_2460123423" w:tooltip="15 Migration von µCSS™">
+          <w:hyperlink w:anchor="__RefHeading___Toc5688_759348175" w:tooltip="15 Migration von µCSS™">
             <w:r>
               <w:rPr>
                 <w:rStyle w:val="Verzeichnissprung"/>
@@ -2235,7 +2235,7 @@
             </w:tabs>
             <w:rPr/>
           </w:pPr>
-          <w:hyperlink w:anchor="__RefHeading___Toc5646_2460123423" w:tooltip="16 Versionshistorie">
+          <w:hyperlink w:anchor="__RefHeading___Toc5690_759348175" w:tooltip="16 Versionshistorie">
             <w:r>
               <w:rPr>
                 <w:rStyle w:val="Verzeichnissprung"/>
@@ -2255,14 +2255,14 @@
             </w:tabs>
             <w:rPr/>
           </w:pPr>
-          <w:hyperlink w:anchor="__RefHeading___Toc5648_2460123423" w:tooltip="17 Rechtliches">
+          <w:hyperlink w:anchor="__RefHeading___Toc5692_759348175" w:tooltip="17 Rechtliches">
             <w:r>
               <w:rPr>
                 <w:rStyle w:val="Verzeichnissprung"/>
               </w:rPr>
               <w:t>17 Rechtliches</w:t>
               <w:tab/>
-              <w:t>55</w:t>
+              <w:t>56</w:t>
             </w:r>
           </w:hyperlink>
         </w:p>
@@ -2275,14 +2275,14 @@
             </w:tabs>
             <w:rPr/>
           </w:pPr>
-          <w:hyperlink w:anchor="__RefHeading___Toc5650_2460123423" w:tooltip="17.1 MIT-Lizenz (Originaltext)">
+          <w:hyperlink w:anchor="__RefHeading___Toc5694_759348175" w:tooltip="17.1 MIT-Lizenz (Originaltext)">
             <w:r>
               <w:rPr>
                 <w:rStyle w:val="Verzeichnissprung"/>
               </w:rPr>
               <w:t>17.1 MIT-Lizenz (Originaltext)</w:t>
               <w:tab/>
-              <w:t>55</w:t>
+              <w:t>56</w:t>
             </w:r>
           </w:hyperlink>
         </w:p>
@@ -2295,14 +2295,14 @@
             </w:tabs>
             <w:rPr/>
           </w:pPr>
-          <w:hyperlink w:anchor="__RefHeading___Toc5652_2460123423" w:tooltip="17.2 Marken">
+          <w:hyperlink w:anchor="__RefHeading___Toc5696_759348175" w:tooltip="17.2 Marken">
             <w:r>
               <w:rPr>
                 <w:rStyle w:val="Verzeichnissprung"/>
               </w:rPr>
               <w:t>17.2 Marken</w:t>
               <w:tab/>
-              <w:t>55</w:t>
+              <w:t>56</w:t>
             </w:r>
           </w:hyperlink>
         </w:p>
@@ -2315,14 +2315,14 @@
             </w:tabs>
             <w:rPr/>
           </w:pPr>
-          <w:hyperlink w:anchor="__RefHeading___Toc5654_2460123423" w:tooltip="17.3 Verwendete Bibliotheken">
+          <w:hyperlink w:anchor="__RefHeading___Toc5698_759348175" w:tooltip="17.3 Verwendete Bibliotheken">
             <w:r>
               <w:rPr>
                 <w:rStyle w:val="Verzeichnissprung"/>
               </w:rPr>
               <w:t>17.3 Verwendete Bibliotheken</w:t>
               <w:tab/>
-              <w:t>55</w:t>
+              <w:t>56</w:t>
             </w:r>
           </w:hyperlink>
           <w:r>
@@ -2366,7 +2366,7 @@
         <w:outlineLvl w:val="0"/>
         <w:rPr/>
       </w:pPr>
-      <w:bookmarkStart w:id="0" w:name="__RefHeading___Toc5444_2460123423"/>
+      <w:bookmarkStart w:id="0" w:name="__RefHeading___Toc5488_759348175"/>
       <w:bookmarkEnd w:id="0"/>
       <w:r>
         <w:rPr/>
@@ -2449,7 +2449,18 @@
       </w:pPr>
       <w:r>
         <w:rPr/>
-        <w:t>µCSS™ ist ein Node-Modul zur Verarbeitung von CSS-Dateien und zur Generierung von Web-Grafiken. Dieses Handbuch beschreibt die Version 2 — den Node-basierten Nachfolger des 2013 eingeführten, Adobe-Photoshop-basierten µCSS™ 1: Aus erweiterten Quell-Stylesheets (</w:t>
+        <w:t xml:space="preserve">µCSS™ ist eine </w:t>
+      </w:r>
+      <w:r>
+        <w:rPr>
+          <w:b/>
+          <w:bCs/>
+        </w:rPr>
+        <w:t>headless CSS- und Bildverarbeitungs-Toolchain für automatisierte Node-/Gulp-Pipelines</w:t>
+      </w:r>
+      <w:r>
+        <w:rPr/>
+        <w:t>. Dieses Handbuch beschreibt die Version 2 — den Node-Nachfolger des 2013 als Adobe-Photoshop-Script eingeführten µCSS™ 1. Aus erweiterten Quell-Stylesheets (</w:t>
       </w:r>
       <w:r>
         <w:rPr>
@@ -2462,7 +2473,7 @@
       </w:r>
       <w:r>
         <w:rPr/>
-        <w:t>) und den Medienquellen (z. B. PSD-Entwürfen) entstehen per Gulp die fertigen Skin-Dateien — Standard-CSS plus alle benötigten Bilder, Sprites, Cursor, Fonts und Sounds. Die Bilderzeugung übernimmt das Schwester-Modul µPS; Sound-Atlanten und Icon-Fonts die Module µAU und µFT — jeweils als eigenes Kapitel (*microPS*, *microAU*, *microFT*).</w:t>
+        <w:t>) und den Medienquellen (z. B. PSD-Entwürfen) entstehen per Gulp die fertigen Skin-Dateien — Standard-CSS plus alle benötigten Bilder, Sprites, Cursor, Fonts und Sounds — ohne einen Desktop-Editor zu starten. Die Bilderzeugung übernimmt das Schwester-Modul µPS; Sound-Atlanten und Icon-Fonts die Module µAU und µFT — jeweils als eigenes Kapitel (*microPS*, *microAU*, *microFT*).</w:t>
       </w:r>
     </w:p>
     <w:p>
@@ -2835,7 +2846,18 @@
       </w:pPr>
       <w:r>
         <w:rPr/>
-        <w:t>Im Gegensatz zu µCSS™ 1 läuft Version 2 vollständig in Node.js (ab Version 18) und benötigt weder Photoshop noch andere Adobe-Produkte. Die Build-Steuerung erfolgt über Gulp oder direkt über die Node-API.</w:t>
+        <w:t xml:space="preserve">Im Gegensatz zu µCSS™ 1 läuft Version 2 vollständig in Node.js (ab Version 18). Der </w:t>
+      </w:r>
+      <w:r>
+        <w:rPr>
+          <w:b/>
+          <w:bCs/>
+        </w:rPr>
+        <w:t>Build</w:t>
+      </w:r>
+      <w:r>
+        <w:rPr/>
+        <w:t xml:space="preserve"> braucht weder Photoshop noch eine andere Desktop-Bildbearbeitung. Interaktives Authoring der PSD-Entwürfe bleibt im Editor Ihrer Wahl. Die Build-Steuerung erfolgt über Gulp oder direkt über die Node-API.</w:t>
       </w:r>
     </w:p>
     <w:p>
@@ -2849,7 +2871,7 @@
         <w:outlineLvl w:val="1"/>
         <w:rPr/>
       </w:pPr>
-      <w:bookmarkStart w:id="1" w:name="__RefHeading___Toc5446_2460123423"/>
+      <w:bookmarkStart w:id="1" w:name="__RefHeading___Toc5490_759348175"/>
       <w:bookmarkEnd w:id="1"/>
       <w:r>
         <w:rPr/>
@@ -2865,7 +2887,7 @@
       </w:pPr>
       <w:r>
         <w:rPr/>
-        <w:t>Diese Ausgabe beschreibt µCSS 2.5.18, µPS 1.3.6, µFT 0.2.0 und µAU 0.1.8.</w:t>
+        <w:t>Diese Ausgabe beschreibt µCSS 2.5.19, µPS 1.3.6, µFT 0.2.0 und µAU 0.1.8.</w:t>
       </w:r>
     </w:p>
     <w:p>
@@ -2982,11 +3004,11 @@
         <w:outlineLvl w:val="1"/>
         <w:rPr/>
       </w:pPr>
-      <w:bookmarkStart w:id="2" w:name="__RefHeading___Toc5448_2460123423"/>
+      <w:bookmarkStart w:id="2" w:name="__RefHeading___Toc5492_759348175"/>
       <w:bookmarkEnd w:id="2"/>
       <w:r>
         <w:rPr/>
-        <w:t>1.2 Werkzeuge und Kosten</w:t>
+        <w:t>1.2 Einsatzebenen: interaktive Editoren vs. headless Pipeline</w:t>
       </w:r>
     </w:p>
     <w:p>
@@ -2997,19 +3019,11 @@
         <w:rPr/>
       </w:pPr>
       <w:r>
-        <w:rPr/>
-        <w:t xml:space="preserve">Version 2 braucht </w:t>
-      </w:r>
-      <w:r>
         <w:rPr>
           <w:b/>
           <w:bCs/>
         </w:rPr>
-        <w:t>kein Adobe-Abo</w:t>
-      </w:r>
-      <w:r>
-        <w:rPr/>
-        <w:t xml:space="preserve"> für den Build: Sprites, Cursor und PSD-Rendering laufen headless über Node und µPS.</w:t>
+        <w:t>Keine manuellen Schritte? Editor überspringen.</w:t>
       </w:r>
     </w:p>
     <w:p>
@@ -3021,77 +3035,357 @@
       </w:pPr>
       <w:r>
         <w:rPr/>
-        <w:t xml:space="preserve">Geschichtete PSD-Entwürfe pflegt man mit </w:t>
-      </w:r>
+        <w:t>Die Trennlinie ist nicht, welchen Editor man besitzt, und nicht die reine Geschwindigkeit. Entscheidend ist, ob während der Verarbeitung ein Mensch gebraucht wird:</w:t>
+      </w:r>
+    </w:p>
+    <w:tbl>
+      <w:tblPr>
+        <w:tblW w:w="5000" w:type="pct"/>
+        <w:jc w:val="start"/>
+        <w:tblInd w:w="0" w:type="dxa"/>
+        <w:tblLayout w:type="fixed"/>
+        <w:tblCellMar>
+          <w:top w:w="0" w:type="dxa"/>
+          <w:start w:w="80" w:type="dxa"/>
+          <w:bottom w:w="0" w:type="dxa"/>
+          <w:end w:w="80" w:type="dxa"/>
+        </w:tblCellMar>
+      </w:tblPr>
+      <w:tblGrid>
+        <w:gridCol w:w="4512"/>
+        <w:gridCol w:w="4514"/>
+      </w:tblGrid>
+      <w:tr>
+        <w:trPr>
+          <w:tblHeader w:val="true"/>
+        </w:trPr>
+        <w:tc>
+          <w:tcPr>
+            <w:tcW w:w="4512" w:type="dxa"/>
+            <w:tcBorders>
+              <w:top w:val="single" w:sz="4" w:space="0" w:color="999999"/>
+              <w:start w:val="single" w:sz="4" w:space="0" w:color="999999"/>
+              <w:bottom w:val="single" w:sz="4" w:space="0" w:color="999999"/>
+              <w:end w:val="single" w:sz="4" w:space="0" w:color="999999"/>
+            </w:tcBorders>
+            <w:shd w:fill="DDE6EE" w:val="clear"/>
+          </w:tcPr>
+          <w:p>
+            <w:pPr>
+              <w:pStyle w:val="Normal"/>
+              <w:spacing w:before="40" w:after="40"/>
+              <w:rPr/>
+            </w:pPr>
+            <w:r>
+              <w:rPr>
+                <w:b/>
+                <w:bCs/>
+              </w:rPr>
+              <w:t>Frage während der Verarbeitung</w:t>
+            </w:r>
+          </w:p>
+        </w:tc>
+        <w:tc>
+          <w:tcPr>
+            <w:tcW w:w="4514" w:type="dxa"/>
+            <w:tcBorders>
+              <w:top w:val="single" w:sz="4" w:space="0" w:color="999999"/>
+              <w:start w:val="single" w:sz="4" w:space="0" w:color="999999"/>
+              <w:bottom w:val="single" w:sz="4" w:space="0" w:color="999999"/>
+              <w:end w:val="single" w:sz="4" w:space="0" w:color="999999"/>
+            </w:tcBorders>
+            <w:shd w:fill="DDE6EE" w:val="clear"/>
+          </w:tcPr>
+          <w:p>
+            <w:pPr>
+              <w:pStyle w:val="Normal"/>
+              <w:spacing w:before="40" w:after="40"/>
+              <w:rPr/>
+            </w:pPr>
+            <w:r>
+              <w:rPr>
+                <w:b/>
+                <w:bCs/>
+              </w:rPr>
+              <w:t>Werkzeug</w:t>
+            </w:r>
+          </w:p>
+        </w:tc>
+      </w:tr>
+      <w:tr>
+        <w:trPr/>
+        <w:tc>
+          <w:tcPr>
+            <w:tcW w:w="4512" w:type="dxa"/>
+            <w:tcBorders>
+              <w:top w:val="single" w:sz="4" w:space="0" w:color="999999"/>
+              <w:start w:val="single" w:sz="4" w:space="0" w:color="999999"/>
+              <w:bottom w:val="single" w:sz="4" w:space="0" w:color="999999"/>
+              <w:end w:val="single" w:sz="4" w:space="0" w:color="999999"/>
+            </w:tcBorders>
+          </w:tcPr>
+          <w:p>
+            <w:pPr>
+              <w:pStyle w:val="Normal"/>
+              <w:spacing w:before="40" w:after="40"/>
+              <w:rPr/>
+            </w:pPr>
+            <w:r>
+              <w:rPr/>
+              <w:t>Jemand muss beurteilen, ändern oder entscheiden</w:t>
+            </w:r>
+          </w:p>
+        </w:tc>
+        <w:tc>
+          <w:tcPr>
+            <w:tcW w:w="4514" w:type="dxa"/>
+            <w:tcBorders>
+              <w:top w:val="single" w:sz="4" w:space="0" w:color="999999"/>
+              <w:start w:val="single" w:sz="4" w:space="0" w:color="999999"/>
+              <w:bottom w:val="single" w:sz="4" w:space="0" w:color="999999"/>
+              <w:end w:val="single" w:sz="4" w:space="0" w:color="999999"/>
+            </w:tcBorders>
+          </w:tcPr>
+          <w:p>
+            <w:pPr>
+              <w:pStyle w:val="Normal"/>
+              <w:spacing w:before="40" w:after="40"/>
+              <w:rPr/>
+            </w:pPr>
+            <w:r>
+              <w:rPr/>
+              <w:t>Interaktiver Editor bzw. Editor-Scripting</w:t>
+            </w:r>
+          </w:p>
+        </w:tc>
+      </w:tr>
+      <w:tr>
+        <w:trPr/>
+        <w:tc>
+          <w:tcPr>
+            <w:tcW w:w="4512" w:type="dxa"/>
+            <w:tcBorders>
+              <w:top w:val="single" w:sz="4" w:space="0" w:color="999999"/>
+              <w:start w:val="single" w:sz="4" w:space="0" w:color="999999"/>
+              <w:bottom w:val="single" w:sz="4" w:space="0" w:color="999999"/>
+              <w:end w:val="single" w:sz="4" w:space="0" w:color="999999"/>
+            </w:tcBorders>
+          </w:tcPr>
+          <w:p>
+            <w:pPr>
+              <w:pStyle w:val="Normal"/>
+              <w:spacing w:before="40" w:after="40"/>
+              <w:rPr/>
+            </w:pPr>
+            <w:r>
+              <w:rPr/>
+              <w:t>Input → Output ohne manuelle Schritte</w:t>
+            </w:r>
+          </w:p>
+        </w:tc>
+        <w:tc>
+          <w:tcPr>
+            <w:tcW w:w="4514" w:type="dxa"/>
+            <w:tcBorders>
+              <w:top w:val="single" w:sz="4" w:space="0" w:color="999999"/>
+              <w:start w:val="single" w:sz="4" w:space="0" w:color="999999"/>
+              <w:bottom w:val="single" w:sz="4" w:space="0" w:color="999999"/>
+              <w:end w:val="single" w:sz="4" w:space="0" w:color="999999"/>
+            </w:tcBorders>
+          </w:tcPr>
+          <w:p>
+            <w:pPr>
+              <w:pStyle w:val="Normal"/>
+              <w:spacing w:before="40" w:after="40"/>
+              <w:rPr/>
+            </w:pPr>
+            <w:r>
+              <w:rPr/>
+              <w:t>µCSS™</w:t>
+            </w:r>
+          </w:p>
+        </w:tc>
+      </w:tr>
+    </w:tbl>
+    <w:p>
+      <w:pPr>
+        <w:pStyle w:val="Normal"/>
+        <w:spacing w:before="0" w:after="60"/>
+        <w:rPr/>
+      </w:pPr>
+      <w:r>
+        <w:rPr/>
+      </w:r>
+    </w:p>
+    <w:p>
+      <w:pPr>
+        <w:pStyle w:val="Normal"/>
+        <w:spacing w:before="0" w:after="120"/>
+        <w:jc w:val="both"/>
+        <w:rPr/>
+      </w:pPr>
+      <w:r>
+        <w:rPr/>
+        <w:t>Wenn die Bildverarbeitung zwischen Eingabe und Ausgabe keine Benutzerinteraktion braucht, braucht sie wahrscheinlich auch keinen Desktop-Bildeditor. µCSS™ ist genau für diese vollautomatischen Abläufe gebaut. Es ersetzt Photoshop, Photon Studio oder andere Desktop-Editoren nicht.</w:t>
+      </w:r>
+    </w:p>
+    <w:p>
+      <w:pPr>
+        <w:pStyle w:val="Normal"/>
+        <w:spacing w:before="0" w:after="120"/>
+        <w:jc w:val="both"/>
+        <w:rPr/>
+      </w:pPr>
+      <w:r>
+        <w:rPr/>
+        <w:t>Drei Ebenen:</w:t>
+      </w:r>
+    </w:p>
+    <w:p>
+      <w:pPr>
+        <w:pStyle w:val="Normal"/>
+        <w:spacing w:before="0" w:after="60"/>
+        <w:ind w:start="360"/>
+        <w:rPr/>
+      </w:pPr>
       <w:r>
         <w:rPr>
           <w:b/>
           <w:bCs/>
         </w:rPr>
-        <w:t>beliebigem Editor</w:t>
-      </w:r>
-      <w:r>
-        <w:rPr/>
-        <w:t xml:space="preserve"> — der Build ist identisch. </w:t>
-      </w:r>
+        <w:t>1. Interaktive Bearbeitung</w:t>
+      </w:r>
+      <w:r>
+        <w:rPr/>
+        <w:t xml:space="preserve"> — Adobe Photoshop, Affinity, Photon Studio, Photopea: visuelle Arbeit, manuelle Entscheidungen und Zwischenschritte.</w:t>
+      </w:r>
+    </w:p>
+    <w:p>
+      <w:pPr>
+        <w:pStyle w:val="Normal"/>
+        <w:spacing w:before="0" w:after="60"/>
+        <w:ind w:start="360"/>
+        <w:rPr/>
+      </w:pPr>
       <w:r>
         <w:rPr>
           <w:b/>
           <w:bCs/>
         </w:rPr>
-        <w:t>Affinity</w:t>
-      </w:r>
-      <w:r>
-        <w:rPr/>
-        <w:t xml:space="preserve"> und </w:t>
+        <w:t>2. Editor-Scripting</w:t>
+      </w:r>
+      <w:r>
+        <w:rPr/>
+        <w:t xml:space="preserve"> — Automatisierung *innerhalb* eines Desktop-Editors (ExtendScript, Aktionen und Vergleichbares). Weiterhin an diese Anwendung, ihr Dokumentmodell und typischerweise GUI und Start gebunden. Photon Studio ist ein neuer interaktiver Editor; eine öffentliche Scripting-API ist in diesem Projekt </w:t>
       </w:r>
       <w:r>
         <w:rPr>
           <w:b/>
           <w:bCs/>
         </w:rPr>
-        <w:t>Photopea</w:t>
-      </w:r>
-      <w:r>
-        <w:rPr/>
-        <w:t xml:space="preserve"> sind gängige kostenlose Optionen; </w:t>
+        <w:t>nicht</w:t>
+      </w:r>
+      <w:r>
+        <w:rPr/>
+        <w:t xml:space="preserve"> dokumentiert und </w:t>
       </w:r>
       <w:r>
         <w:rPr>
           <w:b/>
           <w:bCs/>
         </w:rPr>
+        <w:t>nicht</w:t>
+      </w:r>
+      <w:r>
+        <w:rPr/>
+        <w:t xml:space="preserve"> integriert. Falls eine später erscheint, bleibt Photon Studio plus Scripting *editorbasierte* Automatisierung.</w:t>
+      </w:r>
+    </w:p>
+    <w:p>
+      <w:pPr>
+        <w:pStyle w:val="Normal"/>
+        <w:spacing w:before="0" w:after="60"/>
+        <w:ind w:start="360"/>
+        <w:rPr/>
+      </w:pPr>
+      <w:r>
+        <w:rPr>
+          <w:b/>
+          <w:bCs/>
+        </w:rPr>
+        <w:t>3. Headless Pipeline (µCSS™ / µPS)</w:t>
+      </w:r>
+      <w:r>
+        <w:rPr/>
+        <w:t xml:space="preserve"> — vollautomatische Verarbeitung in Node/Gulp: keine GUI, keine Desktop-Anwendung, keine manuellen Zwischenschritte. Nativer Einsatz für Batch-Arbeit und CI/CD.</w:t>
+      </w:r>
+    </w:p>
+    <w:p>
+      <w:pPr>
+        <w:pStyle w:val="Normal"/>
+        <w:spacing w:before="0" w:after="120"/>
+        <w:jc w:val="both"/>
+        <w:rPr/>
+      </w:pPr>
+      <w:r>
+        <w:rPr/>
+        <w:t>Die Werkzeuge können sich überschneiden; sie adressieren unterschiedliche Ablaufarten. Performance ist eine Folge dieser Architektur: vollautomatischer Ablauf → kein Editor nötig → kein Start-/UI-/Anwendungs-Overhead → potentiell deutlich schnellere Verarbeitung. Dieses Handbuch enthält keine Vergleichsbenchmarks gegen Editoren.</w:t>
+      </w:r>
+    </w:p>
+    <w:p>
+      <w:pPr>
+        <w:pStyle w:val="Normal"/>
+        <w:spacing w:before="0" w:after="120"/>
+        <w:jc w:val="both"/>
+        <w:rPr/>
+      </w:pPr>
+      <w:r>
+        <w:rPr/>
+        <w:t xml:space="preserve">Geschichtete PSD-Entwürfe pflegt man mit </w:t>
+      </w:r>
+      <w:r>
+        <w:rPr>
+          <w:b/>
+          <w:bCs/>
+        </w:rPr>
+        <w:t>beliebigem Editor</w:t>
+      </w:r>
+      <w:r>
+        <w:rPr/>
+        <w:t xml:space="preserve">, der PSD schreibt. </w:t>
+      </w:r>
+      <w:r>
+        <w:rPr>
+          <w:b/>
+          <w:bCs/>
+        </w:rPr>
+        <w:t>Affinity</w:t>
+      </w:r>
+      <w:r>
+        <w:rPr/>
+        <w:t xml:space="preserve">, </w:t>
+      </w:r>
+      <w:r>
+        <w:rPr>
+          <w:b/>
+          <w:bCs/>
+        </w:rPr>
+        <w:t>Photopea</w:t>
+      </w:r>
+      <w:r>
+        <w:rPr/>
+        <w:t xml:space="preserve"> und </w:t>
+      </w:r>
+      <w:r>
+        <w:rPr>
+          <w:b/>
+          <w:bCs/>
+        </w:rPr>
         <w:t>Adobe Photoshop</w:t>
       </w:r>
       <w:r>
         <w:rPr/>
-        <w:t xml:space="preserve"> funktioniert ebenfalls (</w:t>
-      </w:r>
-      <w:r>
-        <w:rPr>
-          <w:rFonts w:eastAsia="Consolas" w:cs="Consolas" w:ascii="Consolas" w:hAnsi="Consolas"/>
-          <w:sz w:val="18"/>
-          <w:szCs w:val="18"/>
-          <w:shd w:fill="F2F2F2" w:val="clear"/>
-        </w:rPr>
-        <w:t>.psd</w:t>
-      </w:r>
-      <w:r>
-        <w:rPr/>
-        <w:t xml:space="preserve">-Verknüpfung oder Pfad zur </w:t>
-      </w:r>
-      <w:r>
-        <w:rPr>
-          <w:rFonts w:eastAsia="Consolas" w:cs="Consolas" w:ascii="Consolas" w:hAnsi="Consolas"/>
-          <w:sz w:val="18"/>
-          <w:szCs w:val="18"/>
-          <w:shd w:fill="F2F2F2" w:val="clear"/>
-        </w:rPr>
-        <w:t>.exe</w:t>
-      </w:r>
-      <w:r>
-        <w:rPr/>
-        <w:t>). Als PSD speichern; µPS liest dieselbe Ebenenstruktur. Bei µCSS™ 1 hingen Kompilierung und Bitmap-Erzeugung an einer lizenzierten Desktop-Bildbearbeitung — laufende Kosten, die für viele Teams entfallen.</w:t>
+        <w:t xml:space="preserve"> sind gängige Optionen; Photon Studio kann ebenso für interaktive Arbeit genutzt werden. Als PSD speichern; µPS liest dieselbe Ebenenstruktur. Kompilierung und Rendering bleiben in Node.</w:t>
       </w:r>
     </w:p>
     <w:p>
@@ -3105,7 +3399,7 @@
         <w:outlineLvl w:val="1"/>
         <w:rPr/>
       </w:pPr>
-      <w:bookmarkStart w:id="3" w:name="__RefHeading___Toc5450_2460123423"/>
+      <w:bookmarkStart w:id="3" w:name="__RefHeading___Toc5494_759348175"/>
       <w:bookmarkEnd w:id="3"/>
       <w:r>
         <w:rPr/>
@@ -3676,7 +3970,7 @@
             </w:pPr>
             <w:r>
               <w:rPr/>
-              <w:t>Ihr Editor (Affinity, Photoshop, Photopea, …)</w:t>
+              <w:t>Ihr Editor (Affinity, Photoshop, Photopea, Photon Studio, …)</w:t>
             </w:r>
           </w:p>
         </w:tc>
@@ -4075,7 +4369,7 @@
         <w:outlineLvl w:val="2"/>
         <w:rPr/>
       </w:pPr>
-      <w:bookmarkStart w:id="4" w:name="__RefHeading___Toc5452_2460123423"/>
+      <w:bookmarkStart w:id="4" w:name="__RefHeading___Toc5496_759348175"/>
       <w:bookmarkEnd w:id="4"/>
       <w:r>
         <w:rPr/>
@@ -4315,7 +4609,7 @@
         <w:outlineLvl w:val="1"/>
         <w:rPr/>
       </w:pPr>
-      <w:bookmarkStart w:id="5" w:name="__RefHeading___Toc5454_2460123423"/>
+      <w:bookmarkStart w:id="5" w:name="__RefHeading___Toc5498_759348175"/>
       <w:bookmarkEnd w:id="5"/>
       <w:r>
         <w:rPr/>
@@ -4964,7 +5258,7 @@
         <w:outlineLvl w:val="0"/>
         <w:rPr/>
       </w:pPr>
-      <w:bookmarkStart w:id="6" w:name="__RefHeading___Toc5456_2460123423"/>
+      <w:bookmarkStart w:id="6" w:name="__RefHeading___Toc5500_759348175"/>
       <w:bookmarkEnd w:id="6"/>
       <w:r>
         <w:rPr/>
@@ -5290,7 +5584,7 @@
         <w:outlineLvl w:val="0"/>
         <w:rPr/>
       </w:pPr>
-      <w:bookmarkStart w:id="7" w:name="__RefHeading___Toc5458_2460123423"/>
+      <w:bookmarkStart w:id="7" w:name="__RefHeading___Toc5502_759348175"/>
       <w:bookmarkEnd w:id="7"/>
       <w:r>
         <w:rPr/>
@@ -5320,7 +5614,7 @@
         <w:outlineLvl w:val="1"/>
         <w:rPr/>
       </w:pPr>
-      <w:bookmarkStart w:id="8" w:name="__RefHeading___Toc5460_2460123423"/>
+      <w:bookmarkStart w:id="8" w:name="__RefHeading___Toc5504_759348175"/>
       <w:bookmarkEnd w:id="8"/>
       <w:r>
         <w:rPr/>
@@ -5977,7 +6271,7 @@
         <w:outlineLvl w:val="1"/>
         <w:rPr/>
       </w:pPr>
-      <w:bookmarkStart w:id="9" w:name="__RefHeading___Toc5462_2460123423"/>
+      <w:bookmarkStart w:id="9" w:name="__RefHeading___Toc5506_759348175"/>
       <w:bookmarkEnd w:id="9"/>
       <w:r>
         <w:rPr/>
@@ -6355,7 +6649,7 @@
         <w:outlineLvl w:val="1"/>
         <w:rPr/>
       </w:pPr>
-      <w:bookmarkStart w:id="10" w:name="__RefHeading___Toc5464_2460123423"/>
+      <w:bookmarkStart w:id="10" w:name="__RefHeading___Toc5508_759348175"/>
       <w:bookmarkEnd w:id="10"/>
       <w:r>
         <w:rPr/>
@@ -6673,7 +6967,7 @@
         <w:outlineLvl w:val="1"/>
         <w:rPr/>
       </w:pPr>
-      <w:bookmarkStart w:id="11" w:name="__RefHeading___Toc5466_2460123423"/>
+      <w:bookmarkStart w:id="11" w:name="__RefHeading___Toc5510_759348175"/>
       <w:bookmarkEnd w:id="11"/>
       <w:r>
         <w:rPr/>
@@ -7305,7 +7599,7 @@
         <w:outlineLvl w:val="1"/>
         <w:rPr/>
       </w:pPr>
-      <w:bookmarkStart w:id="12" w:name="__RefHeading___Toc5468_2460123423"/>
+      <w:bookmarkStart w:id="12" w:name="__RefHeading___Toc5512_759348175"/>
       <w:bookmarkEnd w:id="12"/>
       <w:r>
         <w:rPr/>
@@ -8436,7 +8730,7 @@
         <w:outlineLvl w:val="1"/>
         <w:rPr/>
       </w:pPr>
-      <w:bookmarkStart w:id="13" w:name="__RefHeading___Toc5470_2460123423"/>
+      <w:bookmarkStart w:id="13" w:name="__RefHeading___Toc5514_759348175"/>
       <w:bookmarkEnd w:id="13"/>
       <w:r>
         <w:rPr/>
@@ -8612,7 +8906,7 @@
         <w:outlineLvl w:val="1"/>
         <w:rPr/>
       </w:pPr>
-      <w:bookmarkStart w:id="14" w:name="__RefHeading___Toc5472_2460123423"/>
+      <w:bookmarkStart w:id="14" w:name="__RefHeading___Toc5516_759348175"/>
       <w:bookmarkEnd w:id="14"/>
       <w:r>
         <w:rPr/>
@@ -8977,7 +9271,7 @@
         <w:outlineLvl w:val="1"/>
         <w:rPr/>
       </w:pPr>
-      <w:bookmarkStart w:id="15" w:name="__RefHeading___Toc5474_2460123423"/>
+      <w:bookmarkStart w:id="15" w:name="__RefHeading___Toc5518_759348175"/>
       <w:bookmarkEnd w:id="15"/>
       <w:r>
         <w:rPr/>
@@ -9196,7 +9490,7 @@
         <w:outlineLvl w:val="2"/>
         <w:rPr/>
       </w:pPr>
-      <w:bookmarkStart w:id="16" w:name="__RefHeading___Toc5476_2460123423"/>
+      <w:bookmarkStart w:id="16" w:name="__RefHeading___Toc5520_759348175"/>
       <w:bookmarkEnd w:id="16"/>
       <w:r>
         <w:rPr/>
@@ -10041,7 +10335,7 @@
         <w:outlineLvl w:val="0"/>
         <w:rPr/>
       </w:pPr>
-      <w:bookmarkStart w:id="17" w:name="__RefHeading___Toc5478_2460123423"/>
+      <w:bookmarkStart w:id="17" w:name="__RefHeading___Toc5522_759348175"/>
       <w:bookmarkEnd w:id="17"/>
       <w:r>
         <w:rPr/>
@@ -10092,115 +10386,115 @@
       </w:r>
       <w:r>
         <w:rPr/>
-        <w:t xml:space="preserve">) übernimmt die bildverarbeitenden Funktionen des alten Adobe-Workflows — </w:t>
+        <w:t xml:space="preserve">) ist die headless Bildverarbeitung: PNG-Serien und Sprite-Atlanten aus geschichteten PSD-Entwürfen. µCSS™ bindet µPS über </w:t>
+      </w:r>
+      <w:r>
+        <w:rPr>
+          <w:rFonts w:eastAsia="Consolas" w:cs="Consolas" w:ascii="Consolas" w:hAnsi="Consolas"/>
+          <w:sz w:val="18"/>
+          <w:szCs w:val="18"/>
+          <w:shd w:fill="F2F2F2" w:val="clear"/>
+        </w:rPr>
+        <w:t>media</w:t>
+      </w:r>
+      <w:r>
+        <w:rPr/>
+        <w:t xml:space="preserve">-Steps und Sprite-/Cursor-Direktiven ein; µPS ist auch </w:t>
       </w:r>
       <w:r>
         <w:rPr>
           <w:b/>
           <w:bCs/>
         </w:rPr>
-        <w:t>ohne Adobe-Abhängigkeit</w:t>
-      </w:r>
-      <w:r>
-        <w:rPr/>
-        <w:t xml:space="preserve">. µCSS™ bindet µPS über </w:t>
-      </w:r>
-      <w:r>
-        <w:rPr>
-          <w:rFonts w:eastAsia="Consolas" w:cs="Consolas" w:ascii="Consolas" w:hAnsi="Consolas"/>
-          <w:sz w:val="18"/>
-          <w:szCs w:val="18"/>
-          <w:shd w:fill="F2F2F2" w:val="clear"/>
-        </w:rPr>
-        <w:t>media</w:t>
-      </w:r>
-      <w:r>
-        <w:rPr/>
-        <w:t xml:space="preserve">-Steps und Sprite-/Cursor-Direktiven ein; µPS ist auch </w:t>
+        <w:t>standalone</w:t>
+      </w:r>
+      <w:r>
+        <w:rPr/>
+        <w:t xml:space="preserve"> per </w:t>
+      </w:r>
+      <w:r>
+        <w:rPr>
+          <w:rFonts w:eastAsia="Consolas" w:cs="Consolas" w:ascii="Consolas" w:hAnsi="Consolas"/>
+          <w:sz w:val="18"/>
+          <w:szCs w:val="18"/>
+          <w:shd w:fill="F2F2F2" w:val="clear"/>
+        </w:rPr>
+        <w:t>npm install gulp-mu-ps</w:t>
+      </w:r>
+      <w:r>
+        <w:rPr/>
+        <w:t xml:space="preserve"> nutzbar.</w:t>
+      </w:r>
+    </w:p>
+    <w:p>
+      <w:pPr>
+        <w:pStyle w:val="Normal"/>
+        <w:spacing w:before="0" w:after="120"/>
+        <w:jc w:val="both"/>
+        <w:rPr/>
+      </w:pPr>
+      <w:r>
+        <w:rPr/>
+        <w:t xml:space="preserve">PSD-Quellen liest µPS über </w:t>
+      </w:r>
+      <w:r>
+        <w:rPr>
+          <w:rFonts w:eastAsia="Consolas" w:cs="Consolas" w:ascii="Consolas" w:hAnsi="Consolas"/>
+          <w:sz w:val="18"/>
+          <w:szCs w:val="18"/>
+          <w:shd w:fill="F2F2F2" w:val="clear"/>
+        </w:rPr>
+        <w:t>ag-psd</w:t>
+      </w:r>
+      <w:r>
+        <w:rPr/>
+        <w:t xml:space="preserve">, Bildverarbeitung läuft über </w:t>
+      </w:r>
+      <w:r>
+        <w:rPr>
+          <w:rFonts w:eastAsia="Consolas" w:cs="Consolas" w:ascii="Consolas" w:hAnsi="Consolas"/>
+          <w:sz w:val="18"/>
+          <w:szCs w:val="18"/>
+          <w:shd w:fill="F2F2F2" w:val="clear"/>
+        </w:rPr>
+        <w:t>sharp</w:t>
+      </w:r>
+      <w:r>
+        <w:rPr/>
+        <w:t xml:space="preserve">. Für den Build wird kein Desktop-Editor gestartet. Interaktives Authoring bleibt in </w:t>
       </w:r>
       <w:r>
         <w:rPr>
           <w:b/>
           <w:bCs/>
         </w:rPr>
-        <w:t>standalone</w:t>
-      </w:r>
-      <w:r>
-        <w:rPr/>
-        <w:t xml:space="preserve"> per </w:t>
-      </w:r>
-      <w:r>
-        <w:rPr>
-          <w:rFonts w:eastAsia="Consolas" w:cs="Consolas" w:ascii="Consolas" w:hAnsi="Consolas"/>
-          <w:sz w:val="18"/>
-          <w:szCs w:val="18"/>
-          <w:shd w:fill="F2F2F2" w:val="clear"/>
-        </w:rPr>
-        <w:t>npm install gulp-mu-ps</w:t>
-      </w:r>
-      <w:r>
-        <w:rPr/>
-        <w:t xml:space="preserve"> nutzbar.</w:t>
-      </w:r>
-    </w:p>
-    <w:p>
-      <w:pPr>
-        <w:pStyle w:val="Normal"/>
-        <w:spacing w:before="0" w:after="120"/>
-        <w:jc w:val="both"/>
-        <w:rPr/>
-      </w:pPr>
-      <w:r>
-        <w:rPr/>
-        <w:t xml:space="preserve">PSD-Quellen liest µPS über </w:t>
-      </w:r>
-      <w:r>
-        <w:rPr>
-          <w:rFonts w:eastAsia="Consolas" w:cs="Consolas" w:ascii="Consolas" w:hAnsi="Consolas"/>
-          <w:sz w:val="18"/>
-          <w:szCs w:val="18"/>
-          <w:shd w:fill="F2F2F2" w:val="clear"/>
-        </w:rPr>
-        <w:t>ag-psd</w:t>
-      </w:r>
-      <w:r>
-        <w:rPr/>
-        <w:t xml:space="preserve">, Bildverarbeitung läuft über </w:t>
-      </w:r>
-      <w:r>
-        <w:rPr>
-          <w:rFonts w:eastAsia="Consolas" w:cs="Consolas" w:ascii="Consolas" w:hAnsi="Consolas"/>
-          <w:sz w:val="18"/>
-          <w:szCs w:val="18"/>
-          <w:shd w:fill="F2F2F2" w:val="clear"/>
-        </w:rPr>
-        <w:t>sharp</w:t>
-      </w:r>
-      <w:r>
-        <w:rPr/>
-        <w:t xml:space="preserve">. Geschichtete Entwürfe bearbeitet man in </w:t>
+        <w:t>[Affinity](https://affinity.studio/download)</w:t>
+      </w:r>
+      <w:r>
+        <w:rPr/>
+        <w:t xml:space="preserve">, </w:t>
       </w:r>
       <w:r>
         <w:rPr>
           <w:b/>
           <w:bCs/>
         </w:rPr>
-        <w:t>[Affinity](https://affinity.studio/download)</w:t>
-      </w:r>
-      <w:r>
-        <w:rPr/>
-        <w:t xml:space="preserve"> oder </w:t>
+        <w:t>[Photopea](https://www.photopea.com/)</w:t>
+      </w:r>
+      <w:r>
+        <w:rPr/>
+        <w:t xml:space="preserve"> (Browser, volle PSD), Adobe Photoshop, Photon Studio oder einem anderen Editor. Es gibt </w:t>
       </w:r>
       <w:r>
         <w:rPr>
           <w:b/>
           <w:bCs/>
         </w:rPr>
-        <w:t>[Photopea](https://www.photopea.com/)</w:t>
-      </w:r>
-      <w:r>
-        <w:rPr/>
-        <w:t xml:space="preserve"> (Browser, volle PSD). Die wichtigsten Fülloptionen sind nachgebildet (Schlagschatten, Verläufe, Schein, Relief, </w:t>
+        <w:t>keine Photon-Studio-Integration</w:t>
+      </w:r>
+      <w:r>
+        <w:rPr/>
+        <w:t xml:space="preserve"> und keine angenommene öffentliche Scripting-API. Die wichtigsten Fülloptionen sind nachgebildet (Schlagschatten, Verläufe, Schein, Relief, </w:t>
       </w:r>
       <w:r>
         <w:rPr>
@@ -10236,7 +10530,7 @@
         <w:outlineLvl w:val="1"/>
         <w:rPr/>
       </w:pPr>
-      <w:bookmarkStart w:id="18" w:name="__RefHeading___Toc5480_2460123423"/>
+      <w:bookmarkStart w:id="18" w:name="__RefHeading___Toc5524_759348175"/>
       <w:bookmarkEnd w:id="18"/>
       <w:r>
         <w:rPr/>
@@ -11548,7 +11842,7 @@
         <w:outlineLvl w:val="1"/>
         <w:rPr/>
       </w:pPr>
-      <w:bookmarkStart w:id="19" w:name="__RefHeading___Toc5482_2460123423"/>
+      <w:bookmarkStart w:id="19" w:name="__RefHeading___Toc5526_759348175"/>
       <w:bookmarkEnd w:id="19"/>
       <w:r>
         <w:rPr/>
@@ -12705,7 +12999,7 @@
         <w:outlineLvl w:val="2"/>
         <w:rPr/>
       </w:pPr>
-      <w:bookmarkStart w:id="20" w:name="__RefHeading___Toc5484_2460123423"/>
+      <w:bookmarkStart w:id="20" w:name="__RefHeading___Toc5528_759348175"/>
       <w:bookmarkEnd w:id="20"/>
       <w:r>
         <w:rPr/>
@@ -12944,7 +13238,7 @@
         <w:outlineLvl w:val="1"/>
         <w:rPr/>
       </w:pPr>
-      <w:bookmarkStart w:id="21" w:name="__RefHeading___Toc5486_2460123423"/>
+      <w:bookmarkStart w:id="21" w:name="__RefHeading___Toc5530_759348175"/>
       <w:bookmarkEnd w:id="21"/>
       <w:r>
         <w:rPr/>
@@ -13570,7 +13864,7 @@
         <w:outlineLvl w:val="1"/>
         <w:rPr/>
       </w:pPr>
-      <w:bookmarkStart w:id="22" w:name="__RefHeading___Toc5488_2460123423"/>
+      <w:bookmarkStart w:id="22" w:name="__RefHeading___Toc5532_759348175"/>
       <w:bookmarkEnd w:id="22"/>
       <w:r>
         <w:rPr/>
@@ -13635,7 +13929,7 @@
         <w:outlineLvl w:val="1"/>
         <w:rPr/>
       </w:pPr>
-      <w:bookmarkStart w:id="23" w:name="__RefHeading___Toc5490_2460123423"/>
+      <w:bookmarkStart w:id="23" w:name="__RefHeading___Toc5534_759348175"/>
       <w:bookmarkEnd w:id="23"/>
       <w:r>
         <w:rPr/>
@@ -14044,7 +14338,7 @@
         <w:outlineLvl w:val="2"/>
         <w:rPr/>
       </w:pPr>
-      <w:bookmarkStart w:id="24" w:name="__RefHeading___Toc5492_2460123423"/>
+      <w:bookmarkStart w:id="24" w:name="__RefHeading___Toc5536_759348175"/>
       <w:bookmarkEnd w:id="24"/>
       <w:r>
         <w:rPr/>
@@ -14342,7 +14636,7 @@
         <w:outlineLvl w:val="2"/>
         <w:rPr/>
       </w:pPr>
-      <w:bookmarkStart w:id="25" w:name="__RefHeading___Toc5494_2460123423"/>
+      <w:bookmarkStart w:id="25" w:name="__RefHeading___Toc5538_759348175"/>
       <w:bookmarkEnd w:id="25"/>
       <w:r>
         <w:rPr/>
@@ -14506,7 +14800,7 @@
         <w:outlineLvl w:val="1"/>
         <w:rPr/>
       </w:pPr>
-      <w:bookmarkStart w:id="26" w:name="__RefHeading___Toc5496_2460123423"/>
+      <w:bookmarkStart w:id="26" w:name="__RefHeading___Toc5540_759348175"/>
       <w:bookmarkEnd w:id="26"/>
       <w:r>
         <w:rPr/>
@@ -15440,7 +15734,7 @@
         <w:outlineLvl w:val="1"/>
         <w:rPr/>
       </w:pPr>
-      <w:bookmarkStart w:id="27" w:name="__RefHeading___Toc5498_2460123423"/>
+      <w:bookmarkStart w:id="27" w:name="__RefHeading___Toc5542_759348175"/>
       <w:bookmarkEnd w:id="27"/>
       <w:r>
         <w:rPr/>
@@ -15492,7 +15786,7 @@
         <w:outlineLvl w:val="2"/>
         <w:rPr/>
       </w:pPr>
-      <w:bookmarkStart w:id="28" w:name="__RefHeading___Toc5500_2460123423"/>
+      <w:bookmarkStart w:id="28" w:name="__RefHeading___Toc5544_759348175"/>
       <w:bookmarkEnd w:id="28"/>
       <w:r>
         <w:rPr/>
@@ -15815,7 +16109,7 @@
         <w:outlineLvl w:val="2"/>
         <w:rPr/>
       </w:pPr>
-      <w:bookmarkStart w:id="29" w:name="__RefHeading___Toc5502_2460123423"/>
+      <w:bookmarkStart w:id="29" w:name="__RefHeading___Toc5546_759348175"/>
       <w:bookmarkEnd w:id="29"/>
       <w:r>
         <w:rPr/>
@@ -16456,7 +16750,7 @@
         <w:outlineLvl w:val="2"/>
         <w:rPr/>
       </w:pPr>
-      <w:bookmarkStart w:id="30" w:name="__RefHeading___Toc5504_2460123423"/>
+      <w:bookmarkStart w:id="30" w:name="__RefHeading___Toc5548_759348175"/>
       <w:bookmarkEnd w:id="30"/>
       <w:r>
         <w:rPr/>
@@ -16930,7 +17224,7 @@
         <w:outlineLvl w:val="2"/>
         <w:rPr/>
       </w:pPr>
-      <w:bookmarkStart w:id="31" w:name="__RefHeading___Toc5506_2460123423"/>
+      <w:bookmarkStart w:id="31" w:name="__RefHeading___Toc5550_759348175"/>
       <w:bookmarkEnd w:id="31"/>
       <w:r>
         <w:rPr/>
@@ -17305,7 +17599,7 @@
         <w:outlineLvl w:val="2"/>
         <w:rPr/>
       </w:pPr>
-      <w:bookmarkStart w:id="32" w:name="__RefHeading___Toc5508_2460123423"/>
+      <w:bookmarkStart w:id="32" w:name="__RefHeading___Toc5552_759348175"/>
       <w:bookmarkEnd w:id="32"/>
       <w:r>
         <w:rPr/>
@@ -17696,7 +17990,7 @@
         <w:outlineLvl w:val="2"/>
         <w:rPr/>
       </w:pPr>
-      <w:bookmarkStart w:id="33" w:name="__RefHeading___Toc5510_2460123423"/>
+      <w:bookmarkStart w:id="33" w:name="__RefHeading___Toc5554_759348175"/>
       <w:bookmarkEnd w:id="33"/>
       <w:r>
         <w:rPr/>
@@ -18093,7 +18387,7 @@
         <w:outlineLvl w:val="1"/>
         <w:rPr/>
       </w:pPr>
-      <w:bookmarkStart w:id="34" w:name="__RefHeading___Toc5512_2460123423"/>
+      <w:bookmarkStart w:id="34" w:name="__RefHeading___Toc5556_759348175"/>
       <w:bookmarkEnd w:id="34"/>
       <w:r>
         <w:rPr/>
@@ -19149,7 +19443,7 @@
         <w:outlineLvl w:val="1"/>
         <w:rPr/>
       </w:pPr>
-      <w:bookmarkStart w:id="35" w:name="__RefHeading___Toc5514_2460123423"/>
+      <w:bookmarkStart w:id="35" w:name="__RefHeading___Toc5558_759348175"/>
       <w:bookmarkEnd w:id="35"/>
       <w:r>
         <w:rPr/>
@@ -20352,7 +20646,7 @@
         <w:outlineLvl w:val="1"/>
         <w:rPr/>
       </w:pPr>
-      <w:bookmarkStart w:id="36" w:name="__RefHeading___Toc5516_2460123423"/>
+      <w:bookmarkStart w:id="36" w:name="__RefHeading___Toc5560_759348175"/>
       <w:bookmarkEnd w:id="36"/>
       <w:r>
         <w:rPr/>
@@ -20481,7 +20775,7 @@
         <w:outlineLvl w:val="2"/>
         <w:rPr/>
       </w:pPr>
-      <w:bookmarkStart w:id="37" w:name="__RefHeading___Toc5518_2460123423"/>
+      <w:bookmarkStart w:id="37" w:name="__RefHeading___Toc5562_759348175"/>
       <w:bookmarkEnd w:id="37"/>
       <w:r>
         <w:rPr/>
@@ -23106,7 +23400,7 @@
         <w:outlineLvl w:val="2"/>
         <w:rPr/>
       </w:pPr>
-      <w:bookmarkStart w:id="38" w:name="__RefHeading___Toc5520_2460123423"/>
+      <w:bookmarkStart w:id="38" w:name="__RefHeading___Toc5564_759348175"/>
       <w:bookmarkEnd w:id="38"/>
       <w:r>
         <w:rPr/>
@@ -23578,7 +23872,7 @@
         <w:outlineLvl w:val="2"/>
         <w:rPr/>
       </w:pPr>
-      <w:bookmarkStart w:id="39" w:name="__RefHeading___Toc5522_2460123423"/>
+      <w:bookmarkStart w:id="39" w:name="__RefHeading___Toc5566_759348175"/>
       <w:bookmarkEnd w:id="39"/>
       <w:r>
         <w:rPr/>
@@ -24011,7 +24305,7 @@
         <w:outlineLvl w:val="2"/>
         <w:rPr/>
       </w:pPr>
-      <w:bookmarkStart w:id="40" w:name="__RefHeading___Toc5524_2460123423"/>
+      <w:bookmarkStart w:id="40" w:name="__RefHeading___Toc5568_759348175"/>
       <w:bookmarkEnd w:id="40"/>
       <w:r>
         <w:rPr/>
@@ -24985,7 +25279,7 @@
         <w:outlineLvl w:val="2"/>
         <w:rPr/>
       </w:pPr>
-      <w:bookmarkStart w:id="41" w:name="__RefHeading___Toc5526_2460123423"/>
+      <w:bookmarkStart w:id="41" w:name="__RefHeading___Toc5570_759348175"/>
       <w:bookmarkEnd w:id="41"/>
       <w:r>
         <w:rPr/>
@@ -25088,7 +25382,7 @@
         <w:outlineLvl w:val="1"/>
         <w:rPr/>
       </w:pPr>
-      <w:bookmarkStart w:id="42" w:name="__RefHeading___Toc5528_2460123423"/>
+      <w:bookmarkStart w:id="42" w:name="__RefHeading___Toc5572_759348175"/>
       <w:bookmarkEnd w:id="42"/>
       <w:r>
         <w:rPr/>
@@ -25390,7 +25684,7 @@
         <w:outlineLvl w:val="2"/>
         <w:rPr/>
       </w:pPr>
-      <w:bookmarkStart w:id="43" w:name="__RefHeading___Toc5530_2460123423"/>
+      <w:bookmarkStart w:id="43" w:name="__RefHeading___Toc5574_759348175"/>
       <w:bookmarkEnd w:id="43"/>
       <w:r>
         <w:rPr/>
@@ -25652,7 +25946,7 @@
         <w:outlineLvl w:val="0"/>
         <w:rPr/>
       </w:pPr>
-      <w:bookmarkStart w:id="44" w:name="__RefHeading___Toc5532_2460123423"/>
+      <w:bookmarkStart w:id="44" w:name="__RefHeading___Toc5576_759348175"/>
       <w:bookmarkEnd w:id="44"/>
       <w:r>
         <w:rPr/>
@@ -25798,7 +26092,7 @@
         <w:outlineLvl w:val="1"/>
         <w:rPr/>
       </w:pPr>
-      <w:bookmarkStart w:id="45" w:name="__RefHeading___Toc5534_2460123423"/>
+      <w:bookmarkStart w:id="45" w:name="__RefHeading___Toc5578_759348175"/>
       <w:bookmarkEnd w:id="45"/>
       <w:r>
         <w:rPr/>
@@ -26083,7 +26377,7 @@
         <w:outlineLvl w:val="1"/>
         <w:rPr/>
       </w:pPr>
-      <w:bookmarkStart w:id="46" w:name="__RefHeading___Toc5536_2460123423"/>
+      <w:bookmarkStart w:id="46" w:name="__RefHeading___Toc5580_759348175"/>
       <w:bookmarkEnd w:id="46"/>
       <w:r>
         <w:rPr/>
@@ -27116,7 +27410,7 @@
         <w:outlineLvl w:val="2"/>
         <w:rPr/>
       </w:pPr>
-      <w:bookmarkStart w:id="47" w:name="__RefHeading___Toc5538_2460123423"/>
+      <w:bookmarkStart w:id="47" w:name="__RefHeading___Toc5582_759348175"/>
       <w:bookmarkEnd w:id="47"/>
       <w:r>
         <w:rPr/>
@@ -27181,7 +27475,7 @@
         <w:outlineLvl w:val="2"/>
         <w:rPr/>
       </w:pPr>
-      <w:bookmarkStart w:id="48" w:name="__RefHeading___Toc5540_2460123423"/>
+      <w:bookmarkStart w:id="48" w:name="__RefHeading___Toc5584_759348175"/>
       <w:bookmarkEnd w:id="48"/>
       <w:r>
         <w:rPr/>
@@ -27275,7 +27569,7 @@
         <w:outlineLvl w:val="2"/>
         <w:rPr/>
       </w:pPr>
-      <w:bookmarkStart w:id="49" w:name="__RefHeading___Toc5542_2460123423"/>
+      <w:bookmarkStart w:id="49" w:name="__RefHeading___Toc5586_759348175"/>
       <w:bookmarkEnd w:id="49"/>
       <w:r>
         <w:rPr/>
@@ -27342,7 +27636,7 @@
         <w:outlineLvl w:val="1"/>
         <w:rPr/>
       </w:pPr>
-      <w:bookmarkStart w:id="50" w:name="__RefHeading___Toc5544_2460123423"/>
+      <w:bookmarkStart w:id="50" w:name="__RefHeading___Toc5588_759348175"/>
       <w:bookmarkEnd w:id="50"/>
       <w:r>
         <w:rPr/>
@@ -27678,7 +27972,7 @@
         <w:outlineLvl w:val="2"/>
         <w:rPr/>
       </w:pPr>
-      <w:bookmarkStart w:id="51" w:name="__RefHeading___Toc5546_2460123423"/>
+      <w:bookmarkStart w:id="51" w:name="__RefHeading___Toc5590_759348175"/>
       <w:bookmarkEnd w:id="51"/>
       <w:r>
         <w:rPr/>
@@ -28371,7 +28665,7 @@
         <w:outlineLvl w:val="0"/>
         <w:rPr/>
       </w:pPr>
-      <w:bookmarkStart w:id="52" w:name="__RefHeading___Toc5548_2460123423"/>
+      <w:bookmarkStart w:id="52" w:name="__RefHeading___Toc5592_759348175"/>
       <w:bookmarkEnd w:id="52"/>
       <w:r>
         <w:rPr/>
@@ -28418,7 +28712,7 @@
       </w:r>
       <w:r>
         <w:rPr/>
-        <w:t xml:space="preserve"> — automatisiert wie IcoMoon, ohne Adobe/IcoMoon-Abhängigkeit — und verpackt </w:t>
+        <w:t xml:space="preserve"> — automatisiert wie IcoMoon, ohne Desktop-Font-App oder IcoMoon — und verpackt </w:t>
       </w:r>
       <w:r>
         <w:rPr>
@@ -28555,7 +28849,7 @@
         <w:outlineLvl w:val="1"/>
         <w:rPr/>
       </w:pPr>
-      <w:bookmarkStart w:id="53" w:name="__RefHeading___Toc5550_2460123423"/>
+      <w:bookmarkStart w:id="53" w:name="__RefHeading___Toc5594_759348175"/>
       <w:bookmarkEnd w:id="53"/>
       <w:r>
         <w:rPr/>
@@ -28709,7 +29003,7 @@
         <w:outlineLvl w:val="1"/>
         <w:rPr/>
       </w:pPr>
-      <w:bookmarkStart w:id="54" w:name="__RefHeading___Toc5552_2460123423"/>
+      <w:bookmarkStart w:id="54" w:name="__RefHeading___Toc5596_759348175"/>
       <w:bookmarkEnd w:id="54"/>
       <w:r>
         <w:rPr/>
@@ -30170,7 +30464,7 @@
         <w:outlineLvl w:val="1"/>
         <w:rPr/>
       </w:pPr>
-      <w:bookmarkStart w:id="55" w:name="__RefHeading___Toc5554_2460123423"/>
+      <w:bookmarkStart w:id="55" w:name="__RefHeading___Toc5598_759348175"/>
       <w:bookmarkEnd w:id="55"/>
       <w:r>
         <w:rPr/>
@@ -30598,7 +30892,7 @@
         <w:outlineLvl w:val="1"/>
         <w:rPr/>
       </w:pPr>
-      <w:bookmarkStart w:id="56" w:name="__RefHeading___Toc5556_2460123423"/>
+      <w:bookmarkStart w:id="56" w:name="__RefHeading___Toc5600_759348175"/>
       <w:bookmarkEnd w:id="56"/>
       <w:r>
         <w:rPr/>
@@ -30875,7 +31169,7 @@
         <w:outlineLvl w:val="1"/>
         <w:rPr/>
       </w:pPr>
-      <w:bookmarkStart w:id="57" w:name="__RefHeading___Toc5558_2460123423"/>
+      <w:bookmarkStart w:id="57" w:name="__RefHeading___Toc5602_759348175"/>
       <w:bookmarkEnd w:id="57"/>
       <w:r>
         <w:rPr/>
@@ -31171,7 +31465,7 @@
         <w:outlineLvl w:val="0"/>
         <w:rPr/>
       </w:pPr>
-      <w:bookmarkStart w:id="58" w:name="__RefHeading___Toc5560_2460123423"/>
+      <w:bookmarkStart w:id="58" w:name="__RefHeading___Toc5604_759348175"/>
       <w:bookmarkEnd w:id="58"/>
       <w:r>
         <w:rPr/>
@@ -31300,7 +31594,7 @@
         <w:outlineLvl w:val="1"/>
         <w:rPr/>
       </w:pPr>
-      <w:bookmarkStart w:id="59" w:name="__RefHeading___Toc5562_2460123423"/>
+      <w:bookmarkStart w:id="59" w:name="__RefHeading___Toc5606_759348175"/>
       <w:bookmarkEnd w:id="59"/>
       <w:r>
         <w:rPr/>
@@ -31595,7 +31889,7 @@
         <w:outlineLvl w:val="1"/>
         <w:rPr/>
       </w:pPr>
-      <w:bookmarkStart w:id="60" w:name="__RefHeading___Toc5564_2460123423"/>
+      <w:bookmarkStart w:id="60" w:name="__RefHeading___Toc5608_759348175"/>
       <w:bookmarkEnd w:id="60"/>
       <w:r>
         <w:rPr/>
@@ -31750,7 +32044,7 @@
         <w:outlineLvl w:val="1"/>
         <w:rPr/>
       </w:pPr>
-      <w:bookmarkStart w:id="61" w:name="__RefHeading___Toc5566_2460123423"/>
+      <w:bookmarkStart w:id="61" w:name="__RefHeading___Toc5610_759348175"/>
       <w:bookmarkEnd w:id="61"/>
       <w:r>
         <w:rPr/>
@@ -31996,7 +32290,7 @@
         <w:outlineLvl w:val="0"/>
         <w:rPr/>
       </w:pPr>
-      <w:bookmarkStart w:id="62" w:name="__RefHeading___Toc5568_2460123423"/>
+      <w:bookmarkStart w:id="62" w:name="__RefHeading___Toc5612_759348175"/>
       <w:bookmarkEnd w:id="62"/>
       <w:r>
         <w:rPr/>
@@ -32014,7 +32308,7 @@
         <w:outlineLvl w:val="1"/>
         <w:rPr/>
       </w:pPr>
-      <w:bookmarkStart w:id="63" w:name="__RefHeading___Toc5570_2460123423"/>
+      <w:bookmarkStart w:id="63" w:name="__RefHeading___Toc5614_759348175"/>
       <w:bookmarkEnd w:id="63"/>
       <w:r>
         <w:rPr/>
@@ -32221,7 +32515,7 @@
         <w:outlineLvl w:val="1"/>
         <w:rPr/>
       </w:pPr>
-      <w:bookmarkStart w:id="64" w:name="__RefHeading___Toc5572_2460123423"/>
+      <w:bookmarkStart w:id="64" w:name="__RefHeading___Toc5616_759348175"/>
       <w:bookmarkEnd w:id="64"/>
       <w:r>
         <w:rPr/>
@@ -32507,7 +32801,7 @@
         <w:outlineLvl w:val="1"/>
         <w:rPr/>
       </w:pPr>
-      <w:bookmarkStart w:id="65" w:name="__RefHeading___Toc5574_2460123423"/>
+      <w:bookmarkStart w:id="65" w:name="__RefHeading___Toc5618_759348175"/>
       <w:bookmarkEnd w:id="65"/>
       <w:r>
         <w:rPr/>
@@ -32836,7 +33130,7 @@
         <w:outlineLvl w:val="1"/>
         <w:rPr/>
       </w:pPr>
-      <w:bookmarkStart w:id="66" w:name="__RefHeading___Toc5576_2460123423"/>
+      <w:bookmarkStart w:id="66" w:name="__RefHeading___Toc5620_759348175"/>
       <w:bookmarkEnd w:id="66"/>
       <w:r>
         <w:rPr/>
@@ -33508,7 +33802,7 @@
         <w:outlineLvl w:val="1"/>
         <w:rPr/>
       </w:pPr>
-      <w:bookmarkStart w:id="67" w:name="__RefHeading___Toc5578_2460123423"/>
+      <w:bookmarkStart w:id="67" w:name="__RefHeading___Toc5622_759348175"/>
       <w:bookmarkEnd w:id="67"/>
       <w:r>
         <w:rPr/>
@@ -33719,7 +34013,7 @@
         <w:outlineLvl w:val="0"/>
         <w:rPr/>
       </w:pPr>
-      <w:bookmarkStart w:id="68" w:name="__RefHeading___Toc5580_2460123423"/>
+      <w:bookmarkStart w:id="68" w:name="__RefHeading___Toc5624_759348175"/>
       <w:bookmarkEnd w:id="68"/>
       <w:r>
         <w:rPr/>
@@ -33762,7 +34056,7 @@
         <w:outlineLvl w:val="1"/>
         <w:rPr/>
       </w:pPr>
-      <w:bookmarkStart w:id="69" w:name="__RefHeading___Toc5582_2460123423"/>
+      <w:bookmarkStart w:id="69" w:name="__RefHeading___Toc5626_759348175"/>
       <w:bookmarkEnd w:id="69"/>
       <w:r>
         <w:rPr/>
@@ -34162,7 +34456,7 @@
         <w:outlineLvl w:val="1"/>
         <w:rPr/>
       </w:pPr>
-      <w:bookmarkStart w:id="70" w:name="__RefHeading___Toc5584_2460123423"/>
+      <w:bookmarkStart w:id="70" w:name="__RefHeading___Toc5628_759348175"/>
       <w:bookmarkEnd w:id="70"/>
       <w:r>
         <w:rPr/>
@@ -34413,7 +34707,7 @@
         <w:outlineLvl w:val="1"/>
         <w:rPr/>
       </w:pPr>
-      <w:bookmarkStart w:id="71" w:name="__RefHeading___Toc5586_2460123423"/>
+      <w:bookmarkStart w:id="71" w:name="__RefHeading___Toc5630_759348175"/>
       <w:bookmarkEnd w:id="71"/>
       <w:r>
         <w:rPr/>
@@ -34669,7 +34963,7 @@
         <w:outlineLvl w:val="1"/>
         <w:rPr/>
       </w:pPr>
-      <w:bookmarkStart w:id="72" w:name="__RefHeading___Toc5588_2460123423"/>
+      <w:bookmarkStart w:id="72" w:name="__RefHeading___Toc5632_759348175"/>
       <w:bookmarkEnd w:id="72"/>
       <w:r>
         <w:rPr/>
@@ -35119,7 +35413,7 @@
         <w:outlineLvl w:val="0"/>
         <w:rPr/>
       </w:pPr>
-      <w:bookmarkStart w:id="73" w:name="__RefHeading___Toc5590_2460123423"/>
+      <w:bookmarkStart w:id="73" w:name="__RefHeading___Toc5634_759348175"/>
       <w:bookmarkEnd w:id="73"/>
       <w:r>
         <w:rPr/>
@@ -35158,7 +35452,7 @@
         <w:outlineLvl w:val="1"/>
         <w:rPr/>
       </w:pPr>
-      <w:bookmarkStart w:id="74" w:name="__RefHeading___Toc5592_2460123423"/>
+      <w:bookmarkStart w:id="74" w:name="__RefHeading___Toc5636_759348175"/>
       <w:bookmarkEnd w:id="74"/>
       <w:r>
         <w:rPr/>
@@ -35256,7 +35550,7 @@
         <w:outlineLvl w:val="1"/>
         <w:rPr/>
       </w:pPr>
-      <w:bookmarkStart w:id="75" w:name="__RefHeading___Toc5594_2460123423"/>
+      <w:bookmarkStart w:id="75" w:name="__RefHeading___Toc5638_759348175"/>
       <w:bookmarkEnd w:id="75"/>
       <w:r>
         <w:rPr/>
@@ -35429,7 +35723,7 @@
         <w:outlineLvl w:val="1"/>
         <w:rPr/>
       </w:pPr>
-      <w:bookmarkStart w:id="76" w:name="__RefHeading___Toc5596_2460123423"/>
+      <w:bookmarkStart w:id="76" w:name="__RefHeading___Toc5640_759348175"/>
       <w:bookmarkEnd w:id="76"/>
       <w:r>
         <w:rPr/>
@@ -36046,7 +36340,7 @@
         <w:outlineLvl w:val="1"/>
         <w:rPr/>
       </w:pPr>
-      <w:bookmarkStart w:id="77" w:name="__RefHeading___Toc5598_2460123423"/>
+      <w:bookmarkStart w:id="77" w:name="__RefHeading___Toc5642_759348175"/>
       <w:bookmarkEnd w:id="77"/>
       <w:r>
         <w:rPr/>
@@ -37070,7 +37364,7 @@
         <w:outlineLvl w:val="1"/>
         <w:rPr/>
       </w:pPr>
-      <w:bookmarkStart w:id="78" w:name="__RefHeading___Toc5600_2460123423"/>
+      <w:bookmarkStart w:id="78" w:name="__RefHeading___Toc5644_759348175"/>
       <w:bookmarkEnd w:id="78"/>
       <w:r>
         <w:rPr/>
@@ -37443,7 +37737,7 @@
         <w:outlineLvl w:val="1"/>
         <w:rPr/>
       </w:pPr>
-      <w:bookmarkStart w:id="79" w:name="__RefHeading___Toc5602_2460123423"/>
+      <w:bookmarkStart w:id="79" w:name="__RefHeading___Toc5646_759348175"/>
       <w:bookmarkEnd w:id="79"/>
       <w:r>
         <w:rPr/>
@@ -38642,7 +38936,7 @@
         <w:outlineLvl w:val="1"/>
         <w:rPr/>
       </w:pPr>
-      <w:bookmarkStart w:id="80" w:name="__RefHeading___Toc5604_2460123423"/>
+      <w:bookmarkStart w:id="80" w:name="__RefHeading___Toc5648_759348175"/>
       <w:bookmarkEnd w:id="80"/>
       <w:r>
         <w:rPr/>
@@ -39204,7 +39498,7 @@
         <w:outlineLvl w:val="1"/>
         <w:rPr/>
       </w:pPr>
-      <w:bookmarkStart w:id="81" w:name="__RefHeading___Toc5606_2460123423"/>
+      <w:bookmarkStart w:id="81" w:name="__RefHeading___Toc5650_759348175"/>
       <w:bookmarkEnd w:id="81"/>
       <w:r>
         <w:rPr/>
@@ -40044,7 +40338,7 @@
         <w:outlineLvl w:val="1"/>
         <w:rPr/>
       </w:pPr>
-      <w:bookmarkStart w:id="82" w:name="__RefHeading___Toc5608_2460123423"/>
+      <w:bookmarkStart w:id="82" w:name="__RefHeading___Toc5652_759348175"/>
       <w:bookmarkEnd w:id="82"/>
       <w:r>
         <w:rPr/>
@@ -41532,7 +41826,7 @@
         <w:outlineLvl w:val="1"/>
         <w:rPr/>
       </w:pPr>
-      <w:bookmarkStart w:id="83" w:name="__RefHeading___Toc5610_2460123423"/>
+      <w:bookmarkStart w:id="83" w:name="__RefHeading___Toc5654_759348175"/>
       <w:bookmarkEnd w:id="83"/>
       <w:r>
         <w:rPr/>
@@ -41696,7 +41990,7 @@
         <w:outlineLvl w:val="0"/>
         <w:rPr/>
       </w:pPr>
-      <w:bookmarkStart w:id="84" w:name="__RefHeading___Toc5612_2460123423"/>
+      <w:bookmarkStart w:id="84" w:name="__RefHeading___Toc5656_759348175"/>
       <w:bookmarkEnd w:id="84"/>
       <w:r>
         <w:rPr/>
@@ -41765,7 +42059,7 @@
         <w:outlineLvl w:val="1"/>
         <w:rPr/>
       </w:pPr>
-      <w:bookmarkStart w:id="85" w:name="__RefHeading___Toc5614_2460123423"/>
+      <w:bookmarkStart w:id="85" w:name="__RefHeading___Toc5658_759348175"/>
       <w:bookmarkEnd w:id="85"/>
       <w:r>
         <w:rPr/>
@@ -41846,7 +42140,7 @@
         <w:outlineLvl w:val="1"/>
         <w:rPr/>
       </w:pPr>
-      <w:bookmarkStart w:id="86" w:name="__RefHeading___Toc5616_2460123423"/>
+      <w:bookmarkStart w:id="86" w:name="__RefHeading___Toc5660_759348175"/>
       <w:bookmarkEnd w:id="86"/>
       <w:r>
         <w:rPr/>
@@ -42456,7 +42750,7 @@
         <w:outlineLvl w:val="1"/>
         <w:rPr/>
       </w:pPr>
-      <w:bookmarkStart w:id="87" w:name="__RefHeading___Toc5618_2460123423"/>
+      <w:bookmarkStart w:id="87" w:name="__RefHeading___Toc5662_759348175"/>
       <w:bookmarkEnd w:id="87"/>
       <w:r>
         <w:rPr/>
@@ -43039,7 +43333,7 @@
         <w:outlineLvl w:val="1"/>
         <w:rPr/>
       </w:pPr>
-      <w:bookmarkStart w:id="88" w:name="__RefHeading___Toc5620_2460123423"/>
+      <w:bookmarkStart w:id="88" w:name="__RefHeading___Toc5664_759348175"/>
       <w:bookmarkEnd w:id="88"/>
       <w:r>
         <w:rPr/>
@@ -43820,7 +44114,7 @@
         <w:outlineLvl w:val="1"/>
         <w:rPr/>
       </w:pPr>
-      <w:bookmarkStart w:id="89" w:name="__RefHeading___Toc5622_2460123423"/>
+      <w:bookmarkStart w:id="89" w:name="__RefHeading___Toc5666_759348175"/>
       <w:bookmarkEnd w:id="89"/>
       <w:r>
         <w:rPr/>
@@ -43915,7 +44209,7 @@
         <w:outlineLvl w:val="1"/>
         <w:rPr/>
       </w:pPr>
-      <w:bookmarkStart w:id="90" w:name="__RefHeading___Toc5624_2460123423"/>
+      <w:bookmarkStart w:id="90" w:name="__RefHeading___Toc5668_759348175"/>
       <w:bookmarkEnd w:id="90"/>
       <w:r>
         <w:rPr/>
@@ -44084,7 +44378,7 @@
         <w:outlineLvl w:val="1"/>
         <w:rPr/>
       </w:pPr>
-      <w:bookmarkStart w:id="91" w:name="__RefHeading___Toc5626_2460123423"/>
+      <w:bookmarkStart w:id="91" w:name="__RefHeading___Toc5670_759348175"/>
       <w:bookmarkEnd w:id="91"/>
       <w:r>
         <w:rPr/>
@@ -44548,7 +44842,7 @@
         <w:outlineLvl w:val="1"/>
         <w:rPr/>
       </w:pPr>
-      <w:bookmarkStart w:id="92" w:name="__RefHeading___Toc5628_2460123423"/>
+      <w:bookmarkStart w:id="92" w:name="__RefHeading___Toc5672_759348175"/>
       <w:bookmarkEnd w:id="92"/>
       <w:r>
         <w:rPr/>
@@ -45086,7 +45380,7 @@
         <w:outlineLvl w:val="0"/>
         <w:rPr/>
       </w:pPr>
-      <w:bookmarkStart w:id="93" w:name="__RefHeading___Toc5630_2460123423"/>
+      <w:bookmarkStart w:id="93" w:name="__RefHeading___Toc5674_759348175"/>
       <w:bookmarkEnd w:id="93"/>
       <w:r>
         <w:rPr/>
@@ -45104,7 +45398,7 @@
         <w:outlineLvl w:val="1"/>
         <w:rPr/>
       </w:pPr>
-      <w:bookmarkStart w:id="94" w:name="__RefHeading___Toc5632_2460123423"/>
+      <w:bookmarkStart w:id="94" w:name="__RefHeading___Toc5676_759348175"/>
       <w:bookmarkEnd w:id="94"/>
       <w:r>
         <w:rPr/>
@@ -45525,7 +45819,7 @@
         <w:outlineLvl w:val="1"/>
         <w:rPr/>
       </w:pPr>
-      <w:bookmarkStart w:id="95" w:name="__RefHeading___Toc5634_2460123423"/>
+      <w:bookmarkStart w:id="95" w:name="__RefHeading___Toc5678_759348175"/>
       <w:bookmarkEnd w:id="95"/>
       <w:r>
         <w:rPr/>
@@ -45808,7 +46102,7 @@
         <w:outlineLvl w:val="1"/>
         <w:rPr/>
       </w:pPr>
-      <w:bookmarkStart w:id="96" w:name="__RefHeading___Toc5636_2460123423"/>
+      <w:bookmarkStart w:id="96" w:name="__RefHeading___Toc5680_759348175"/>
       <w:bookmarkEnd w:id="96"/>
       <w:r>
         <w:rPr/>
@@ -46061,7 +46355,7 @@
         <w:outlineLvl w:val="0"/>
         <w:rPr/>
       </w:pPr>
-      <w:bookmarkStart w:id="97" w:name="__RefHeading___Toc5638_2460123423"/>
+      <w:bookmarkStart w:id="97" w:name="__RefHeading___Toc5682_759348175"/>
       <w:bookmarkEnd w:id="97"/>
       <w:r>
         <w:rPr/>
@@ -47392,7 +47686,7 @@
         <w:outlineLvl w:val="1"/>
         <w:rPr/>
       </w:pPr>
-      <w:bookmarkStart w:id="98" w:name="__RefHeading___Toc5640_2460123423"/>
+      <w:bookmarkStart w:id="98" w:name="__RefHeading___Toc5684_759348175"/>
       <w:bookmarkEnd w:id="98"/>
       <w:r>
         <w:rPr/>
@@ -48143,7 +48437,7 @@
         <w:outlineLvl w:val="0"/>
         <w:rPr/>
       </w:pPr>
-      <w:bookmarkStart w:id="99" w:name="__RefHeading___Toc5642_2460123423"/>
+      <w:bookmarkStart w:id="99" w:name="__RefHeading___Toc5686_759348175"/>
       <w:bookmarkEnd w:id="99"/>
       <w:r>
         <w:rPr/>
@@ -48659,7 +48953,7 @@
         <w:outlineLvl w:val="0"/>
         <w:rPr/>
       </w:pPr>
-      <w:bookmarkStart w:id="100" w:name="__RefHeading___Toc5644_2460123423"/>
+      <w:bookmarkStart w:id="100" w:name="__RefHeading___Toc5688_759348175"/>
       <w:bookmarkEnd w:id="100"/>
       <w:r>
         <w:rPr/>
@@ -49882,7 +50176,7 @@
         <w:outlineLvl w:val="0"/>
         <w:rPr/>
       </w:pPr>
-      <w:bookmarkStart w:id="101" w:name="__RefHeading___Toc5646_2460123423"/>
+      <w:bookmarkStart w:id="101" w:name="__RefHeading___Toc5690_759348175"/>
       <w:bookmarkEnd w:id="101"/>
       <w:r>
         <w:rPr/>
@@ -51949,6 +52243,75 @@
           </w:p>
         </w:tc>
       </w:tr>
+      <w:tr>
+        <w:trPr/>
+        <w:tc>
+          <w:tcPr>
+            <w:tcW w:w="3008" w:type="dxa"/>
+            <w:tcBorders>
+              <w:top w:val="single" w:sz="4" w:space="0" w:color="999999"/>
+              <w:start w:val="single" w:sz="4" w:space="0" w:color="999999"/>
+              <w:bottom w:val="single" w:sz="4" w:space="0" w:color="999999"/>
+              <w:end w:val="single" w:sz="4" w:space="0" w:color="999999"/>
+            </w:tcBorders>
+          </w:tcPr>
+          <w:p>
+            <w:pPr>
+              <w:pStyle w:val="Normal"/>
+              <w:spacing w:before="40" w:after="40"/>
+              <w:rPr/>
+            </w:pPr>
+            <w:r>
+              <w:rPr/>
+              <w:t>2026-10</w:t>
+            </w:r>
+          </w:p>
+        </w:tc>
+        <w:tc>
+          <w:tcPr>
+            <w:tcW w:w="3009" w:type="dxa"/>
+            <w:tcBorders>
+              <w:top w:val="single" w:sz="4" w:space="0" w:color="999999"/>
+              <w:start w:val="single" w:sz="4" w:space="0" w:color="999999"/>
+              <w:bottom w:val="single" w:sz="4" w:space="0" w:color="999999"/>
+              <w:end w:val="single" w:sz="4" w:space="0" w:color="999999"/>
+            </w:tcBorders>
+          </w:tcPr>
+          <w:p>
+            <w:pPr>
+              <w:pStyle w:val="Normal"/>
+              <w:spacing w:before="40" w:after="40"/>
+              <w:rPr/>
+            </w:pPr>
+            <w:r>
+              <w:rPr/>
+              <w:t>2.5.19</w:t>
+            </w:r>
+          </w:p>
+        </w:tc>
+        <w:tc>
+          <w:tcPr>
+            <w:tcW w:w="3009" w:type="dxa"/>
+            <w:tcBorders>
+              <w:top w:val="single" w:sz="4" w:space="0" w:color="999999"/>
+              <w:start w:val="single" w:sz="4" w:space="0" w:color="999999"/>
+              <w:bottom w:val="single" w:sz="4" w:space="0" w:color="999999"/>
+              <w:end w:val="single" w:sz="4" w:space="0" w:color="999999"/>
+            </w:tcBorders>
+          </w:tcPr>
+          <w:p>
+            <w:pPr>
+              <w:pStyle w:val="Normal"/>
+              <w:spacing w:before="40" w:after="40"/>
+              <w:rPr/>
+            </w:pPr>
+            <w:r>
+              <w:rPr/>
+              <w:t>Doku/READMEs: µCSS als vollautomatische Pipeline (keine manuellen Schritte) gegenüber interaktiven Editoren und Editor-Scripting; Photon Studio ohne angenommene Scripting-API oder Integration.</w:t>
+            </w:r>
+          </w:p>
+        </w:tc>
+      </w:tr>
     </w:tbl>
     <w:p>
       <w:pPr>
@@ -51974,7 +52337,7 @@
         <w:outlineLvl w:val="0"/>
         <w:rPr/>
       </w:pPr>
-      <w:bookmarkStart w:id="102" w:name="__RefHeading___Toc5648_2460123423"/>
+      <w:bookmarkStart w:id="102" w:name="__RefHeading___Toc5692_759348175"/>
       <w:bookmarkEnd w:id="102"/>
       <w:r>
         <w:rPr/>
@@ -52016,7 +52379,7 @@
         <w:outlineLvl w:val="1"/>
         <w:rPr/>
       </w:pPr>
-      <w:bookmarkStart w:id="103" w:name="__RefHeading___Toc5650_2460123423"/>
+      <w:bookmarkStart w:id="103" w:name="__RefHeading___Toc5694_759348175"/>
       <w:bookmarkEnd w:id="103"/>
       <w:r>
         <w:rPr/>
@@ -52070,7 +52433,7 @@
         <w:outlineLvl w:val="1"/>
         <w:rPr/>
       </w:pPr>
-      <w:bookmarkStart w:id="104" w:name="__RefHeading___Toc5652_2460123423"/>
+      <w:bookmarkStart w:id="104" w:name="__RefHeading___Toc5696_759348175"/>
       <w:bookmarkEnd w:id="104"/>
       <w:r>
         <w:rPr/>
@@ -52086,7 +52449,7 @@
       </w:pPr>
       <w:r>
         <w:rPr/>
-        <w:t>Photoshop ist eine eingetragene Marke von Adobe Inc.; Affinity Photo ist eine Marke von Serif (Europe) Ltd. Photopea ist ein unabhängiger Online-Fotoeditor ([photopea.com](https://www.photopea.com/)). Die Nennung von Namen und Produkten dient ausschließlich der Information und stellt keinen Missbrauch der jeweiligen Handelsnamen oder Marken dar.</w:t>
+        <w:t>Photoshop ist eine eingetragene Marke von Adobe Inc.; Affinity Photo ist eine Marke von Serif (Europe) Ltd. Photopea ist ein unabhängiger Online-Fotoeditor ([photopea.com](https://www.photopea.com/)). Photon Studio wird als Desktop-Bildeditor nur zur Identifikation genannt. Die Nennung von Namen und Produkten dient ausschließlich der Information und stellt keinen Missbrauch der jeweiligen Handelsnamen oder Marken dar.</w:t>
       </w:r>
     </w:p>
     <w:p>
@@ -52100,7 +52463,7 @@
         <w:outlineLvl w:val="1"/>
         <w:rPr/>
       </w:pPr>
-      <w:bookmarkStart w:id="105" w:name="__RefHeading___Toc5654_2460123423"/>
+      <w:bookmarkStart w:id="105" w:name="__RefHeading___Toc5698_759348175"/>
       <w:bookmarkEnd w:id="105"/>
       <w:r>
         <w:rPr/>

</xml_diff>

<commit_message>
Release gulp-mu-css 2.5.20: link Photon Studio in READMEs.
</commit_message>
<xml_diff>
--- a/gulp-mu-css/docs/microCSS-de.docx
+++ b/gulp-mu-css/docs/microCSS-de.docx
@@ -136,7 +136,7 @@
           <w:sz w:val="24"/>
           <w:szCs w:val="24"/>
         </w:rPr>
-        <w:t>Version 2.5.19</w:t>
+        <w:t>Version 2.5.20</w:t>
       </w:r>
     </w:p>
     <w:p>
@@ -215,7 +215,7 @@
             </w:rPr>
             <w:fldChar w:fldCharType="separate"/>
           </w:r>
-          <w:hyperlink w:anchor="__RefHeading___Toc5488_759348175" w:tooltip="1 Einführung">
+          <w:hyperlink w:anchor="__RefHeading___Toc5497_3214599740" w:tooltip="1 Einführung">
             <w:r>
               <w:rPr>
                 <w:rStyle w:val="Verzeichnissprung"/>
@@ -235,7 +235,7 @@
             </w:tabs>
             <w:rPr/>
           </w:pPr>
-          <w:hyperlink w:anchor="__RefHeading___Toc5490_759348175" w:tooltip="1.1 Paketversionen und µGulp ready">
+          <w:hyperlink w:anchor="__RefHeading___Toc5499_3214599740" w:tooltip="1.1 Paketversionen und µGulp ready">
             <w:r>
               <w:rPr>
                 <w:rStyle w:val="Verzeichnissprung"/>
@@ -255,7 +255,7 @@
             </w:tabs>
             <w:rPr/>
           </w:pPr>
-          <w:hyperlink w:anchor="__RefHeading___Toc5492_759348175" w:tooltip="1.2 Einsatzebenen: interaktive Editoren vs. headless Pipeline">
+          <w:hyperlink w:anchor="__RefHeading___Toc5501_3214599740" w:tooltip="1.2 Einsatzebenen: interaktive Editoren vs. headless Pipeline">
             <w:r>
               <w:rPr>
                 <w:rStyle w:val="Verzeichnissprung"/>
@@ -275,7 +275,7 @@
             </w:tabs>
             <w:rPr/>
           </w:pPr>
-          <w:hyperlink w:anchor="__RefHeading___Toc5494_759348175" w:tooltip="1.3 Draft-Workflow (Authoring + Watch)">
+          <w:hyperlink w:anchor="__RefHeading___Toc5503_3214599740" w:tooltip="1.3 Draft-Workflow (Authoring + Watch)">
             <w:r>
               <w:rPr>
                 <w:rStyle w:val="Verzeichnissprung"/>
@@ -295,7 +295,7 @@
             </w:tabs>
             <w:rPr/>
           </w:pPr>
-          <w:hyperlink w:anchor="__RefHeading___Toc5496_759348175" w:tooltip="1.3.1 Photopea (Browser, optional)">
+          <w:hyperlink w:anchor="__RefHeading___Toc5505_3214599740" w:tooltip="1.3.1 Photopea (Browser, optional)">
             <w:r>
               <w:rPr>
                 <w:rStyle w:val="Verzeichnissprung"/>
@@ -315,7 +315,7 @@
             </w:tabs>
             <w:rPr/>
           </w:pPr>
-          <w:hyperlink w:anchor="__RefHeading___Toc5498_759348175" w:tooltip="1.4 Einordnung: Warum µCSS™?">
+          <w:hyperlink w:anchor="__RefHeading___Toc5507_3214599740" w:tooltip="1.4 Einordnung: Warum µCSS™?">
             <w:r>
               <w:rPr>
                 <w:rStyle w:val="Verzeichnissprung"/>
@@ -335,7 +335,7 @@
             </w:tabs>
             <w:rPr/>
           </w:pPr>
-          <w:hyperlink w:anchor="__RefHeading___Toc5500_759348175" w:tooltip="2 Installation und Start">
+          <w:hyperlink w:anchor="__RefHeading___Toc5509_3214599740" w:tooltip="2 Installation und Start">
             <w:r>
               <w:rPr>
                 <w:rStyle w:val="Verzeichnissprung"/>
@@ -355,7 +355,7 @@
             </w:tabs>
             <w:rPr/>
           </w:pPr>
-          <w:hyperlink w:anchor="__RefHeading___Toc5502_759348175" w:tooltip="3 Anwendungsfälle">
+          <w:hyperlink w:anchor="__RefHeading___Toc5511_3214599740" w:tooltip="3 Anwendungsfälle">
             <w:r>
               <w:rPr>
                 <w:rStyle w:val="Verzeichnissprung"/>
@@ -375,7 +375,7 @@
             </w:tabs>
             <w:rPr/>
           </w:pPr>
-          <w:hyperlink w:anchor="__RefHeading___Toc5504_759348175" w:tooltip="3.1 Benannte Eigenschaften (Variablen)">
+          <w:hyperlink w:anchor="__RefHeading___Toc5513_3214599740" w:tooltip="3.1 Benannte Eigenschaften (Variablen)">
             <w:r>
               <w:rPr>
                 <w:rStyle w:val="Verzeichnissprung"/>
@@ -395,7 +395,7 @@
             </w:tabs>
             <w:rPr/>
           </w:pPr>
-          <w:hyperlink w:anchor="__RefHeading___Toc5506_759348175" w:tooltip="3.2 Berechnungen und Ausdrücke">
+          <w:hyperlink w:anchor="__RefHeading___Toc5515_3214599740" w:tooltip="3.2 Berechnungen und Ausdrücke">
             <w:r>
               <w:rPr>
                 <w:rStyle w:val="Verzeichnissprung"/>
@@ -415,7 +415,7 @@
             </w:tabs>
             <w:rPr/>
           </w:pPr>
-          <w:hyperlink w:anchor="__RefHeading___Toc5508_759348175" w:tooltip="3.3 Mehrere Layouts über Skin-Manifeste">
+          <w:hyperlink w:anchor="__RefHeading___Toc5517_3214599740" w:tooltip="3.3 Mehrere Layouts über Skin-Manifeste">
             <w:r>
               <w:rPr>
                 <w:rStyle w:val="Verzeichnissprung"/>
@@ -435,7 +435,7 @@
             </w:tabs>
             <w:rPr/>
           </w:pPr>
-          <w:hyperlink w:anchor="__RefHeading___Toc5510_759348175" w:tooltip="3.4 Automatische Sprite-Generierung">
+          <w:hyperlink w:anchor="__RefHeading___Toc5519_3214599740" w:tooltip="3.4 Automatische Sprite-Generierung">
             <w:r>
               <w:rPr>
                 <w:rStyle w:val="Verzeichnissprung"/>
@@ -455,7 +455,7 @@
             </w:tabs>
             <w:rPr/>
           </w:pPr>
-          <w:hyperlink w:anchor="__RefHeading___Toc5512_759348175" w:tooltip="3.5 Data-URI-Inlining (DataUri)">
+          <w:hyperlink w:anchor="__RefHeading___Toc5521_3214599740" w:tooltip="3.5 Data-URI-Inlining (DataUri)">
             <w:r>
               <w:rPr>
                 <w:rStyle w:val="Verzeichnissprung"/>
@@ -475,7 +475,7 @@
             </w:tabs>
             <w:rPr/>
           </w:pPr>
-          <w:hyperlink w:anchor="__RefHeading___Toc5514_759348175" w:tooltip="3.6 Bilder vorladen (Preload)">
+          <w:hyperlink w:anchor="__RefHeading___Toc5523_3214599740" w:tooltip="3.6 Bilder vorladen (Preload)">
             <w:r>
               <w:rPr>
                 <w:rStyle w:val="Verzeichnissprung"/>
@@ -495,7 +495,7 @@
             </w:tabs>
             <w:rPr/>
           </w:pPr>
-          <w:hyperlink w:anchor="__RefHeading___Toc5516_759348175" w:tooltip="3.7 Cursor mit Hotspot und Fallback">
+          <w:hyperlink w:anchor="__RefHeading___Toc5525_3214599740" w:tooltip="3.7 Cursor mit Hotspot und Fallback">
             <w:r>
               <w:rPr>
                 <w:rStyle w:val="Verzeichnissprung"/>
@@ -515,7 +515,7 @@
             </w:tabs>
             <w:rPr/>
           </w:pPr>
-          <w:hyperlink w:anchor="__RefHeading___Toc5518_759348175" w:tooltip="3.8 Automatische Bilderzeugung (media-Steps)">
+          <w:hyperlink w:anchor="__RefHeading___Toc5527_3214599740" w:tooltip="3.8 Automatische Bilderzeugung (media-Steps)">
             <w:r>
               <w:rPr>
                 <w:rStyle w:val="Verzeichnissprung"/>
@@ -535,7 +535,7 @@
             </w:tabs>
             <w:rPr/>
           </w:pPr>
-          <w:hyperlink w:anchor="__RefHeading___Toc5520_759348175" w:tooltip="3.8.1 Eigene media-Steps (Plugins)">
+          <w:hyperlink w:anchor="__RefHeading___Toc5529_3214599740" w:tooltip="3.8.1 Eigene media-Steps (Plugins)">
             <w:r>
               <w:rPr>
                 <w:rStyle w:val="Verzeichnissprung"/>
@@ -555,7 +555,7 @@
             </w:tabs>
             <w:rPr/>
           </w:pPr>
-          <w:hyperlink w:anchor="__RefHeading___Toc5522_759348175" w:tooltip="4 microPS (µPS) — Bildgeneratoren">
+          <w:hyperlink w:anchor="__RefHeading___Toc5531_3214599740" w:tooltip="4 microPS (µPS) — Bildgeneratoren">
             <w:r>
               <w:rPr>
                 <w:rStyle w:val="Verzeichnissprung"/>
@@ -575,7 +575,7 @@
             </w:tabs>
             <w:rPr/>
           </w:pPr>
-          <w:hyperlink w:anchor="__RefHeading___Toc5524_759348175" w:tooltip="4.1 API-Übersicht">
+          <w:hyperlink w:anchor="__RefHeading___Toc5533_3214599740" w:tooltip="4.1 API-Übersicht">
             <w:r>
               <w:rPr>
                 <w:rStyle w:val="Verzeichnissprung"/>
@@ -595,7 +595,7 @@
             </w:tabs>
             <w:rPr/>
           </w:pPr>
-          <w:hyperlink w:anchor="__RefHeading___Toc5526_759348175" w:tooltip="4.2 ButtonAndIconCreator">
+          <w:hyperlink w:anchor="__RefHeading___Toc5535_3214599740" w:tooltip="4.2 ButtonAndIconCreator">
             <w:r>
               <w:rPr>
                 <w:rStyle w:val="Verzeichnissprung"/>
@@ -615,7 +615,7 @@
             </w:tabs>
             <w:rPr/>
           </w:pPr>
-          <w:hyperlink w:anchor="__RefHeading___Toc5528_759348175" w:tooltip="4.2.1 CreateByTopLayerSets — ein Bild pro Gruppe">
+          <w:hyperlink w:anchor="__RefHeading___Toc5537_3214599740" w:tooltip="4.2.1 CreateByTopLayerSets — ein Bild pro Gruppe">
             <w:r>
               <w:rPr>
                 <w:rStyle w:val="Verzeichnissprung"/>
@@ -635,7 +635,7 @@
             </w:tabs>
             <w:rPr/>
           </w:pPr>
-          <w:hyperlink w:anchor="__RefHeading___Toc5530_759348175" w:tooltip="4.3 AppIconMaker">
+          <w:hyperlink w:anchor="__RefHeading___Toc5539_3214599740" w:tooltip="4.3 AppIconMaker">
             <w:r>
               <w:rPr>
                 <w:rStyle w:val="Verzeichnissprung"/>
@@ -655,7 +655,7 @@
             </w:tabs>
             <w:rPr/>
           </w:pPr>
-          <w:hyperlink w:anchor="__RefHeading___Toc5532_759348175" w:tooltip="4.4 SpriteAtlas und TileSheet">
+          <w:hyperlink w:anchor="__RefHeading___Toc5541_3214599740" w:tooltip="4.4 SpriteAtlas und TileSheet">
             <w:r>
               <w:rPr>
                 <w:rStyle w:val="Verzeichnissprung"/>
@@ -675,7 +675,7 @@
             </w:tabs>
             <w:rPr/>
           </w:pPr>
-          <w:hyperlink w:anchor="__RefHeading___Toc5534_759348175" w:tooltip="4.5 SequenceStrip und DSD-Format">
+          <w:hyperlink w:anchor="__RefHeading___Toc5543_3214599740" w:tooltip="4.5 SequenceStrip und DSD-Format">
             <w:r>
               <w:rPr>
                 <w:rStyle w:val="Verzeichnissprung"/>
@@ -695,7 +695,7 @@
             </w:tabs>
             <w:rPr/>
           </w:pPr>
-          <w:hyperlink w:anchor="__RefHeading___Toc5536_759348175" w:tooltip="4.5.1 DSD erzeugen (`CreateDsdFromImages`)">
+          <w:hyperlink w:anchor="__RefHeading___Toc5545_3214599740" w:tooltip="4.5.1 DSD erzeugen (`CreateDsdFromImages`)">
             <w:r>
               <w:rPr>
                 <w:rStyle w:val="Verzeichnissprung"/>
@@ -715,7 +715,7 @@
             </w:tabs>
             <w:rPr/>
           </w:pPr>
-          <w:hyperlink w:anchor="__RefHeading___Toc5538_759348175" w:tooltip="4.5.2 PSD-Sequenzgruppen">
+          <w:hyperlink w:anchor="__RefHeading___Toc5547_3214599740" w:tooltip="4.5.2 PSD-Sequenzgruppen">
             <w:r>
               <w:rPr>
                 <w:rStyle w:val="Verzeichnissprung"/>
@@ -735,7 +735,7 @@
             </w:tabs>
             <w:rPr/>
           </w:pPr>
-          <w:hyperlink w:anchor="__RefHeading___Toc5540_759348175" w:tooltip="4.6 Raster-Modell, I/O und Arbeitsblatt">
+          <w:hyperlink w:anchor="__RefHeading___Toc5549_3214599740" w:tooltip="4.6 Raster-Modell, I/O und Arbeitsblatt">
             <w:r>
               <w:rPr>
                 <w:rStyle w:val="Verzeichnissprung"/>
@@ -755,7 +755,7 @@
             </w:tabs>
             <w:rPr/>
           </w:pPr>
-          <w:hyperlink w:anchor="__RefHeading___Toc5542_759348175" w:tooltip="4.7 Bildanpassungen und Masken">
+          <w:hyperlink w:anchor="__RefHeading___Toc5551_3214599740" w:tooltip="4.7 Bildanpassungen und Masken">
             <w:r>
               <w:rPr>
                 <w:rStyle w:val="Verzeichnissprung"/>
@@ -775,7 +775,7 @@
             </w:tabs>
             <w:rPr/>
           </w:pPr>
-          <w:hyperlink w:anchor="__RefHeading___Toc5544_759348175" w:tooltip="4.7.1 Masken">
+          <w:hyperlink w:anchor="__RefHeading___Toc5553_3214599740" w:tooltip="4.7.1 Masken">
             <w:r>
               <w:rPr>
                 <w:rStyle w:val="Verzeichnissprung"/>
@@ -795,7 +795,7 @@
             </w:tabs>
             <w:rPr/>
           </w:pPr>
-          <w:hyperlink w:anchor="__RefHeading___Toc5546_759348175" w:tooltip="4.7.2 Auswahl-Engine">
+          <w:hyperlink w:anchor="__RefHeading___Toc5555_3214599740" w:tooltip="4.7.2 Auswahl-Engine">
             <w:r>
               <w:rPr>
                 <w:rStyle w:val="Verzeichnissprung"/>
@@ -815,7 +815,7 @@
             </w:tabs>
             <w:rPr/>
           </w:pPr>
-          <w:hyperlink w:anchor="__RefHeading___Toc5548_759348175" w:tooltip="4.7.3 ApplyGamma">
+          <w:hyperlink w:anchor="__RefHeading___Toc5557_3214599740" w:tooltip="4.7.3 ApplyGamma">
             <w:r>
               <w:rPr>
                 <w:rStyle w:val="Verzeichnissprung"/>
@@ -835,7 +835,7 @@
             </w:tabs>
             <w:rPr/>
           </w:pPr>
-          <w:hyperlink w:anchor="__RefHeading___Toc5550_759348175" w:tooltip="4.7.4 ApplyBrightnessContrast">
+          <w:hyperlink w:anchor="__RefHeading___Toc5559_3214599740" w:tooltip="4.7.4 ApplyBrightnessContrast">
             <w:r>
               <w:rPr>
                 <w:rStyle w:val="Verzeichnissprung"/>
@@ -855,7 +855,7 @@
             </w:tabs>
             <w:rPr/>
           </w:pPr>
-          <w:hyperlink w:anchor="__RefHeading___Toc5552_759348175" w:tooltip="4.7.5 ApplyHueSaturation">
+          <w:hyperlink w:anchor="__RefHeading___Toc5561_3214599740" w:tooltip="4.7.5 ApplyHueSaturation">
             <w:r>
               <w:rPr>
                 <w:rStyle w:val="Verzeichnissprung"/>
@@ -875,7 +875,7 @@
             </w:tabs>
             <w:rPr/>
           </w:pPr>
-          <w:hyperlink w:anchor="__RefHeading___Toc5554_759348175" w:tooltip="4.7.6 ApplyAdjustmentStack">
+          <w:hyperlink w:anchor="__RefHeading___Toc5563_3214599740" w:tooltip="4.7.6 ApplyAdjustmentStack">
             <w:r>
               <w:rPr>
                 <w:rStyle w:val="Verzeichnissprung"/>
@@ -895,7 +895,7 @@
             </w:tabs>
             <w:rPr/>
           </w:pPr>
-          <w:hyperlink w:anchor="__RefHeading___Toc5556_759348175" w:tooltip="4.8 Raster-Transformationen">
+          <w:hyperlink w:anchor="__RefHeading___Toc5565_3214599740" w:tooltip="4.8 Raster-Transformationen">
             <w:r>
               <w:rPr>
                 <w:rStyle w:val="Verzeichnissprung"/>
@@ -915,7 +915,7 @@
             </w:tabs>
             <w:rPr/>
           </w:pPr>
-          <w:hyperlink w:anchor="__RefHeading___Toc5558_759348175" w:tooltip="4.9 ExtendScript-Einstieg (`MuPsDoc`)">
+          <w:hyperlink w:anchor="__RefHeading___Toc5567_3214599740" w:tooltip="4.9 ExtendScript-Einstieg (`MuPsDoc`)">
             <w:r>
               <w:rPr>
                 <w:rStyle w:val="Verzeichnissprung"/>
@@ -935,7 +935,7 @@
             </w:tabs>
             <w:rPr/>
           </w:pPr>
-          <w:hyperlink w:anchor="__RefHeading___Toc5560_759348175" w:tooltip="4.10 PSD-Compositor und Ebenenzusammenführung">
+          <w:hyperlink w:anchor="__RefHeading___Toc5569_3214599740" w:tooltip="4.10 PSD-Compositor und Ebenenzusammenführung">
             <w:r>
               <w:rPr>
                 <w:rStyle w:val="Verzeichnissprung"/>
@@ -955,7 +955,7 @@
             </w:tabs>
             <w:rPr/>
           </w:pPr>
-          <w:hyperlink w:anchor="__RefHeading___Toc5562_759348175" w:tooltip="4.10.1 Nachgebildete Fülloptionen (Layer Styles)">
+          <w:hyperlink w:anchor="__RefHeading___Toc5571_3214599740" w:tooltip="4.10.1 Nachgebildete Fülloptionen (Layer Styles)">
             <w:r>
               <w:rPr>
                 <w:rStyle w:val="Verzeichnissprung"/>
@@ -975,7 +975,7 @@
             </w:tabs>
             <w:rPr/>
           </w:pPr>
-          <w:hyperlink w:anchor="__RefHeading___Toc5564_759348175" w:tooltip="4.10.2 Stilübertragung (ButtonAndIconCreator) vs. Ebenenverknüpfung">
+          <w:hyperlink w:anchor="__RefHeading___Toc5573_3214599740" w:tooltip="4.10.2 Stilübertragung (ButtonAndIconCreator) vs. Ebenenverknüpfung">
             <w:r>
               <w:rPr>
                 <w:rStyle w:val="Verzeichnissprung"/>
@@ -995,7 +995,7 @@
             </w:tabs>
             <w:rPr/>
           </w:pPr>
-          <w:hyperlink w:anchor="__RefHeading___Toc5566_759348175" w:tooltip="4.10.3 Deckkraft-Modell (drei getrennte Stellschrauben)">
+          <w:hyperlink w:anchor="__RefHeading___Toc5575_3214599740" w:tooltip="4.10.3 Deckkraft-Modell (drei getrennte Stellschrauben)">
             <w:r>
               <w:rPr>
                 <w:rStyle w:val="Verzeichnissprung"/>
@@ -1015,7 +1015,7 @@
             </w:tabs>
             <w:rPr/>
           </w:pPr>
-          <w:hyperlink w:anchor="__RefHeading___Toc5568_759348175" w:tooltip="4.10.4 Referenz-PSD und Adobe-Ground-Truth">
+          <w:hyperlink w:anchor="__RefHeading___Toc5577_3214599740" w:tooltip="4.10.4 Referenz-PSD und Adobe-Ground-Truth">
             <w:r>
               <w:rPr>
                 <w:rStyle w:val="Verzeichnissprung"/>
@@ -1035,7 +1035,7 @@
             </w:tabs>
             <w:rPr/>
           </w:pPr>
-          <w:hyperlink w:anchor="__RefHeading___Toc5570_759348175" w:tooltip="4.10.5 Werkzeuge (µPS-Entwicklung)">
+          <w:hyperlink w:anchor="__RefHeading___Toc5579_3214599740" w:tooltip="4.10.5 Werkzeuge (µPS-Entwicklung)">
             <w:r>
               <w:rPr>
                 <w:rStyle w:val="Verzeichnissprung"/>
@@ -1055,7 +1055,7 @@
             </w:tabs>
             <w:rPr/>
           </w:pPr>
-          <w:hyperlink w:anchor="__RefHeading___Toc5572_759348175" w:tooltip="4.11 Draft-Workflow (Authoring + Watch)">
+          <w:hyperlink w:anchor="__RefHeading___Toc5581_3214599740" w:tooltip="4.11 Draft-Workflow (Authoring + Watch)">
             <w:r>
               <w:rPr>
                 <w:rStyle w:val="Verzeichnissprung"/>
@@ -1075,7 +1075,7 @@
             </w:tabs>
             <w:rPr/>
           </w:pPr>
-          <w:hyperlink w:anchor="__RefHeading___Toc5574_759348175" w:tooltip="4.11.1 Zwischenschritte raw → final (`outputBase`)">
+          <w:hyperlink w:anchor="__RefHeading___Toc5583_3214599740" w:tooltip="4.11.1 Zwischenschritte raw → final (`outputBase`)">
             <w:r>
               <w:rPr>
                 <w:rStyle w:val="Verzeichnissprung"/>
@@ -1095,7 +1095,7 @@
             </w:tabs>
             <w:rPr/>
           </w:pPr>
-          <w:hyperlink w:anchor="__RefHeading___Toc5576_759348175" w:tooltip="5 microAU (µAU) — Sound-Atlas">
+          <w:hyperlink w:anchor="__RefHeading___Toc5585_3214599740" w:tooltip="5 microAU (µAU) — Sound-Atlas">
             <w:r>
               <w:rPr>
                 <w:rStyle w:val="Verzeichnissprung"/>
@@ -1115,7 +1115,7 @@
             </w:tabs>
             <w:rPr/>
           </w:pPr>
-          <w:hyperlink w:anchor="__RefHeading___Toc5578_759348175" w:tooltip="5.1 API-Übersicht">
+          <w:hyperlink w:anchor="__RefHeading___Toc5587_3214599740" w:tooltip="5.1 API-Übersicht">
             <w:r>
               <w:rPr>
                 <w:rStyle w:val="Verzeichnissprung"/>
@@ -1135,7 +1135,7 @@
             </w:tabs>
             <w:rPr/>
           </w:pPr>
-          <w:hyperlink w:anchor="__RefHeading___Toc5580_759348175" w:tooltip="5.2 SoundAtlasMaker">
+          <w:hyperlink w:anchor="__RefHeading___Toc5589_3214599740" w:tooltip="5.2 SoundAtlasMaker">
             <w:r>
               <w:rPr>
                 <w:rStyle w:val="Verzeichnissprung"/>
@@ -1155,7 +1155,7 @@
             </w:tabs>
             <w:rPr/>
           </w:pPr>
-          <w:hyperlink w:anchor="__RefHeading___Toc5582_759348175" w:tooltip="5.2.1 Loop-Punkte im Dateinamen">
+          <w:hyperlink w:anchor="__RefHeading___Toc5591_3214599740" w:tooltip="5.2.1 Loop-Punkte im Dateinamen">
             <w:r>
               <w:rPr>
                 <w:rStyle w:val="Verzeichnissprung"/>
@@ -1175,7 +1175,7 @@
             </w:tabs>
             <w:rPr/>
           </w:pPr>
-          <w:hyperlink w:anchor="__RefHeading___Toc5584_759348175" w:tooltip="5.2.2 JSON-Format">
+          <w:hyperlink w:anchor="__RefHeading___Toc5593_3214599740" w:tooltip="5.2.2 JSON-Format">
             <w:r>
               <w:rPr>
                 <w:rStyle w:val="Verzeichnissprung"/>
@@ -1195,7 +1195,7 @@
             </w:tabs>
             <w:rPr/>
           </w:pPr>
-          <w:hyperlink w:anchor="__RefHeading___Toc5586_759348175" w:tooltip="5.2.3 MP3-Eingaben">
+          <w:hyperlink w:anchor="__RefHeading___Toc5595_3214599740" w:tooltip="5.2.3 MP3-Eingaben">
             <w:r>
               <w:rPr>
                 <w:rStyle w:val="Verzeichnissprung"/>
@@ -1215,7 +1215,7 @@
             </w:tabs>
             <w:rPr/>
           </w:pPr>
-          <w:hyperlink w:anchor="__RefHeading___Toc5588_759348175" w:tooltip="5.3 Anbindung an µCSS™ (Manifest `sounds`)">
+          <w:hyperlink w:anchor="__RefHeading___Toc5597_3214599740" w:tooltip="5.3 Anbindung an µCSS™ (Manifest `sounds`)">
             <w:r>
               <w:rPr>
                 <w:rStyle w:val="Verzeichnissprung"/>
@@ -1235,7 +1235,7 @@
             </w:tabs>
             <w:rPr/>
           </w:pPr>
-          <w:hyperlink w:anchor="__RefHeading___Toc5590_759348175" w:tooltip="5.3.1 Geplant: CSS-Sounds, Auto-Wiring &amp; Handler-Overrides">
+          <w:hyperlink w:anchor="__RefHeading___Toc5599_3214599740" w:tooltip="5.3.1 Geplant: CSS-Sounds, Auto-Wiring &amp; Handler-Overrides">
             <w:r>
               <w:rPr>
                 <w:rStyle w:val="Verzeichnissprung"/>
@@ -1255,7 +1255,7 @@
             </w:tabs>
             <w:rPr/>
           </w:pPr>
-          <w:hyperlink w:anchor="__RefHeading___Toc5592_759348175" w:tooltip="6 microFT (µFT) — Icon-Font">
+          <w:hyperlink w:anchor="__RefHeading___Toc5601_3214599740" w:tooltip="6 microFT (µFT) — Icon-Font">
             <w:r>
               <w:rPr>
                 <w:rStyle w:val="Verzeichnissprung"/>
@@ -1275,7 +1275,7 @@
             </w:tabs>
             <w:rPr/>
           </w:pPr>
-          <w:hyperlink w:anchor="__RefHeading___Toc5594_759348175" w:tooltip="6.1 Glyphen-Benennung">
+          <w:hyperlink w:anchor="__RefHeading___Toc5603_3214599740" w:tooltip="6.1 Glyphen-Benennung">
             <w:r>
               <w:rPr>
                 <w:rStyle w:val="Verzeichnissprung"/>
@@ -1295,7 +1295,7 @@
             </w:tabs>
             <w:rPr/>
           </w:pPr>
-          <w:hyperlink w:anchor="__RefHeading___Toc5596_759348175" w:tooltip="6.2 FontGenerator">
+          <w:hyperlink w:anchor="__RefHeading___Toc5605_3214599740" w:tooltip="6.2 FontGenerator">
             <w:r>
               <w:rPr>
                 <w:rStyle w:val="Verzeichnissprung"/>
@@ -1315,7 +1315,7 @@
             </w:tabs>
             <w:rPr/>
           </w:pPr>
-          <w:hyperlink w:anchor="__RefHeading___Toc5598_759348175" w:tooltip="6.3 API-Bausteine">
+          <w:hyperlink w:anchor="__RefHeading___Toc5607_3214599740" w:tooltip="6.3 API-Bausteine">
             <w:r>
               <w:rPr>
                 <w:rStyle w:val="Verzeichnissprung"/>
@@ -1335,7 +1335,7 @@
             </w:tabs>
             <w:rPr/>
           </w:pPr>
-          <w:hyperlink w:anchor="__RefHeading___Toc5600_759348175" w:tooltip="6.4 Color Fonts und Emoji-Fonts">
+          <w:hyperlink w:anchor="__RefHeading___Toc5609_3214599740" w:tooltip="6.4 Color Fonts und Emoji-Fonts">
             <w:r>
               <w:rPr>
                 <w:rStyle w:val="Verzeichnissprung"/>
@@ -1355,7 +1355,7 @@
             </w:tabs>
             <w:rPr/>
           </w:pPr>
-          <w:hyperlink w:anchor="__RefHeading___Toc5602_759348175" w:tooltip="6.5 Anbindung an µCSS™">
+          <w:hyperlink w:anchor="__RefHeading___Toc5611_3214599740" w:tooltip="6.5 Anbindung an µCSS™">
             <w:r>
               <w:rPr>
                 <w:rStyle w:val="Verzeichnissprung"/>
@@ -1375,7 +1375,7 @@
             </w:tabs>
             <w:rPr/>
           </w:pPr>
-          <w:hyperlink w:anchor="__RefHeading___Toc5604_759348175" w:tooltip="7 Vue und Komponenten-Co-Location">
+          <w:hyperlink w:anchor="__RefHeading___Toc5613_3214599740" w:tooltip="7 Vue und Komponenten-Co-Location">
             <w:r>
               <w:rPr>
                 <w:rStyle w:val="Verzeichnissprung"/>
@@ -1395,7 +1395,7 @@
             </w:tabs>
             <w:rPr/>
           </w:pPr>
-          <w:hyperlink w:anchor="__RefHeading___Toc5606_759348175" w:tooltip="7.1 Ablauf">
+          <w:hyperlink w:anchor="__RefHeading___Toc5615_3214599740" w:tooltip="7.1 Ablauf">
             <w:r>
               <w:rPr>
                 <w:rStyle w:val="Verzeichnissprung"/>
@@ -1415,7 +1415,7 @@
             </w:tabs>
             <w:rPr/>
           </w:pPr>
-          <w:hyperlink w:anchor="__RefHeading___Toc5608_759348175" w:tooltip="7.2 Namespaces und globale State-Klassen">
+          <w:hyperlink w:anchor="__RefHeading___Toc5617_3214599740" w:tooltip="7.2 Namespaces und globale State-Klassen">
             <w:r>
               <w:rPr>
                 <w:rStyle w:val="Verzeichnissprung"/>
@@ -1435,7 +1435,7 @@
             </w:tabs>
             <w:rPr/>
           </w:pPr>
-          <w:hyperlink w:anchor="__RefHeading___Toc5610_759348175" w:tooltip="7.3 Bestehende Vue-SFCs migrieren">
+          <w:hyperlink w:anchor="__RefHeading___Toc5619_3214599740" w:tooltip="7.3 Bestehende Vue-SFCs migrieren">
             <w:r>
               <w:rPr>
                 <w:rStyle w:val="Verzeichnissprung"/>
@@ -1455,7 +1455,7 @@
             </w:tabs>
             <w:rPr/>
           </w:pPr>
-          <w:hyperlink w:anchor="__RefHeading___Toc5612_759348175" w:tooltip="8 Grundideen von µCSS™">
+          <w:hyperlink w:anchor="__RefHeading___Toc5621_3214599740" w:tooltip="8 Grundideen von µCSS™">
             <w:r>
               <w:rPr>
                 <w:rStyle w:val="Verzeichnissprung"/>
@@ -1475,7 +1475,7 @@
             </w:tabs>
             <w:rPr/>
           </w:pPr>
-          <w:hyperlink w:anchor="__RefHeading___Toc5614_759348175" w:tooltip="8.1 Das .µ.css-Format">
+          <w:hyperlink w:anchor="__RefHeading___Toc5623_3214599740" w:tooltip="8.1 Das .µ.css-Format">
             <w:r>
               <w:rPr>
                 <w:rStyle w:val="Verzeichnissprung"/>
@@ -1495,7 +1495,7 @@
             </w:tabs>
             <w:rPr/>
           </w:pPr>
-          <w:hyperlink w:anchor="__RefHeading___Toc5616_759348175" w:tooltip="8.2 Werte-Interpolation µ(Ausdruck)">
+          <w:hyperlink w:anchor="__RefHeading___Toc5625_3214599740" w:tooltip="8.2 Werte-Interpolation µ(Ausdruck)">
             <w:r>
               <w:rPr>
                 <w:rStyle w:val="Verzeichnissprung"/>
@@ -1515,7 +1515,7 @@
             </w:tabs>
             <w:rPr/>
           </w:pPr>
-          <w:hyperlink w:anchor="__RefHeading___Toc5618_759348175" w:tooltip="8.3 Direktiven -µ: Ausdruck">
+          <w:hyperlink w:anchor="__RefHeading___Toc5627_3214599740" w:tooltip="8.3 Direktiven -µ: Ausdruck">
             <w:r>
               <w:rPr>
                 <w:rStyle w:val="Verzeichnissprung"/>
@@ -1535,7 +1535,7 @@
             </w:tabs>
             <w:rPr/>
           </w:pPr>
-          <w:hyperlink w:anchor="__RefHeading___Toc5620_759348175" w:tooltip="8.4 Das Skin-Manifest">
+          <w:hyperlink w:anchor="__RefHeading___Toc5629_3214599740" w:tooltip="8.4 Das Skin-Manifest">
             <w:r>
               <w:rPr>
                 <w:rStyle w:val="Verzeichnissprung"/>
@@ -1555,7 +1555,7 @@
             </w:tabs>
             <w:rPr/>
           </w:pPr>
-          <w:hyperlink w:anchor="__RefHeading___Toc5622_759348175" w:tooltip="8.5 JavaScript ohne Ersatzzeichen">
+          <w:hyperlink w:anchor="__RefHeading___Toc5631_3214599740" w:tooltip="8.5 JavaScript ohne Ersatzzeichen">
             <w:r>
               <w:rPr>
                 <w:rStyle w:val="Verzeichnissprung"/>
@@ -1575,7 +1575,7 @@
             </w:tabs>
             <w:rPr/>
           </w:pPr>
-          <w:hyperlink w:anchor="__RefHeading___Toc5624_759348175" w:tooltip="9 Build-Ablauf und Gulp-Integration">
+          <w:hyperlink w:anchor="__RefHeading___Toc5633_3214599740" w:tooltip="9 Build-Ablauf und Gulp-Integration">
             <w:r>
               <w:rPr>
                 <w:rStyle w:val="Verzeichnissprung"/>
@@ -1595,7 +1595,7 @@
             </w:tabs>
             <w:rPr/>
           </w:pPr>
-          <w:hyperlink w:anchor="__RefHeading___Toc5626_759348175" w:tooltip="9.1 Verzeichniskonventionen">
+          <w:hyperlink w:anchor="__RefHeading___Toc5635_3214599740" w:tooltip="9.1 Verzeichniskonventionen">
             <w:r>
               <w:rPr>
                 <w:rStyle w:val="Verzeichnissprung"/>
@@ -1615,7 +1615,7 @@
             </w:tabs>
             <w:rPr/>
           </w:pPr>
-          <w:hyperlink w:anchor="__RefHeading___Toc5628_759348175" w:tooltip="9.2 Kompilierungs-Ablauf">
+          <w:hyperlink w:anchor="__RefHeading___Toc5637_3214599740" w:tooltip="9.2 Kompilierungs-Ablauf">
             <w:r>
               <w:rPr>
                 <w:rStyle w:val="Verzeichnissprung"/>
@@ -1635,7 +1635,7 @@
             </w:tabs>
             <w:rPr/>
           </w:pPr>
-          <w:hyperlink w:anchor="__RefHeading___Toc5630_759348175" w:tooltip="9.3 Inkrementeller Build und Cache">
+          <w:hyperlink w:anchor="__RefHeading___Toc5639_3214599740" w:tooltip="9.3 Inkrementeller Build und Cache">
             <w:r>
               <w:rPr>
                 <w:rStyle w:val="Verzeichnissprung"/>
@@ -1655,7 +1655,7 @@
             </w:tabs>
             <w:rPr/>
           </w:pPr>
-          <w:hyperlink w:anchor="__RefHeading___Toc5632_759348175" w:tooltip="9.4 Gulp-Tasks und Watch">
+          <w:hyperlink w:anchor="__RefHeading___Toc5641_3214599740" w:tooltip="9.4 Gulp-Tasks und Watch">
             <w:r>
               <w:rPr>
                 <w:rStyle w:val="Verzeichnissprung"/>
@@ -1675,7 +1675,7 @@
             </w:tabs>
             <w:rPr/>
           </w:pPr>
-          <w:hyperlink w:anchor="__RefHeading___Toc5634_759348175" w:tooltip="10 Manifest-Referenz (DefineSkin)">
+          <w:hyperlink w:anchor="__RefHeading___Toc5643_3214599740" w:tooltip="10 Manifest-Referenz (DefineSkin)">
             <w:r>
               <w:rPr>
                 <w:rStyle w:val="Verzeichnissprung"/>
@@ -1695,7 +1695,7 @@
             </w:tabs>
             <w:rPr/>
           </w:pPr>
-          <w:hyperlink w:anchor="__RefHeading___Toc5636_759348175" w:tooltip="10.1 vars">
+          <w:hyperlink w:anchor="__RefHeading___Toc5645_3214599740" w:tooltip="10.1 vars">
             <w:r>
               <w:rPr>
                 <w:rStyle w:val="Verzeichnissprung"/>
@@ -1715,7 +1715,7 @@
             </w:tabs>
             <w:rPr/>
           </w:pPr>
-          <w:hyperlink w:anchor="__RefHeading___Toc5638_759348175" w:tooltip="10.2 helpers">
+          <w:hyperlink w:anchor="__RefHeading___Toc5647_3214599740" w:tooltip="10.2 helpers">
             <w:r>
               <w:rPr>
                 <w:rStyle w:val="Verzeichnissprung"/>
@@ -1735,7 +1735,7 @@
             </w:tabs>
             <w:rPr/>
           </w:pPr>
-          <w:hyperlink w:anchor="__RefHeading___Toc5640_759348175" w:tooltip="10.3 cursors">
+          <w:hyperlink w:anchor="__RefHeading___Toc5649_3214599740" w:tooltip="10.3 cursors">
             <w:r>
               <w:rPr>
                 <w:rStyle w:val="Verzeichnissprung"/>
@@ -1755,7 +1755,7 @@
             </w:tabs>
             <w:rPr/>
           </w:pPr>
-          <w:hyperlink w:anchor="__RefHeading___Toc5642_759348175" w:tooltip="10.4 media">
+          <w:hyperlink w:anchor="__RefHeading___Toc5651_3214599740" w:tooltip="10.4 media">
             <w:r>
               <w:rPr>
                 <w:rStyle w:val="Verzeichnissprung"/>
@@ -1775,7 +1775,7 @@
             </w:tabs>
             <w:rPr/>
           </w:pPr>
-          <w:hyperlink w:anchor="__RefHeading___Toc5644_759348175" w:tooltip="10.5 imageFormat">
+          <w:hyperlink w:anchor="__RefHeading___Toc5653_3214599740" w:tooltip="10.5 imageFormat">
             <w:r>
               <w:rPr>
                 <w:rStyle w:val="Verzeichnissprung"/>
@@ -1795,7 +1795,7 @@
             </w:tabs>
             <w:rPr/>
           </w:pPr>
-          <w:hyperlink w:anchor="__RefHeading___Toc5646_759348175" w:tooltip="10.6 sprites">
+          <w:hyperlink w:anchor="__RefHeading___Toc5655_3214599740" w:tooltip="10.6 sprites">
             <w:r>
               <w:rPr>
                 <w:rStyle w:val="Verzeichnissprung"/>
@@ -1815,7 +1815,7 @@
             </w:tabs>
             <w:rPr/>
           </w:pPr>
-          <w:hyperlink w:anchor="__RefHeading___Toc5648_759348175" w:tooltip="10.7 minify">
+          <w:hyperlink w:anchor="__RefHeading___Toc5657_3214599740" w:tooltip="10.7 minify">
             <w:r>
               <w:rPr>
                 <w:rStyle w:val="Verzeichnissprung"/>
@@ -1835,7 +1835,7 @@
             </w:tabs>
             <w:rPr/>
           </w:pPr>
-          <w:hyperlink w:anchor="__RefHeading___Toc5650_759348175" w:tooltip="10.8 sounds">
+          <w:hyperlink w:anchor="__RefHeading___Toc5659_3214599740" w:tooltip="10.8 sounds">
             <w:r>
               <w:rPr>
                 <w:rStyle w:val="Verzeichnissprung"/>
@@ -1855,7 +1855,7 @@
             </w:tabs>
             <w:rPr/>
           </w:pPr>
-          <w:hyperlink w:anchor="__RefHeading___Toc5652_759348175" w:tooltip="10.9 font">
+          <w:hyperlink w:anchor="__RefHeading___Toc5661_3214599740" w:tooltip="10.9 font">
             <w:r>
               <w:rPr>
                 <w:rStyle w:val="Verzeichnissprung"/>
@@ -1875,7 +1875,7 @@
             </w:tabs>
             <w:rPr/>
           </w:pPr>
-          <w:hyperlink w:anchor="__RefHeading___Toc5654_759348175" w:tooltip="10.10 files">
+          <w:hyperlink w:anchor="__RefHeading___Toc5663_3214599740" w:tooltip="10.10 files">
             <w:r>
               <w:rPr>
                 <w:rStyle w:val="Verzeichnissprung"/>
@@ -1895,7 +1895,7 @@
             </w:tabs>
             <w:rPr/>
           </w:pPr>
-          <w:hyperlink w:anchor="__RefHeading___Toc5656_759348175" w:tooltip="11 µ-Auswertungskontext (Referenz)">
+          <w:hyperlink w:anchor="__RefHeading___Toc5665_3214599740" w:tooltip="11 µ-Auswertungskontext (Referenz)">
             <w:r>
               <w:rPr>
                 <w:rStyle w:val="Verzeichnissprung"/>
@@ -1915,7 +1915,7 @@
             </w:tabs>
             <w:rPr/>
           </w:pPr>
-          <w:hyperlink w:anchor="__RefHeading___Toc5658_759348175" w:tooltip="11.1 Das $-Objekt">
+          <w:hyperlink w:anchor="__RefHeading___Toc5667_3214599740" w:tooltip="11.1 Das $-Objekt">
             <w:r>
               <w:rPr>
                 <w:rStyle w:val="Verzeichnissprung"/>
@@ -1935,7 +1935,7 @@
             </w:tabs>
             <w:rPr/>
           </w:pPr>
-          <w:hyperlink w:anchor="__RefHeading___Toc5660_759348175" w:tooltip="11.2 Farb- und Wert-Funktionen">
+          <w:hyperlink w:anchor="__RefHeading___Toc5669_3214599740" w:tooltip="11.2 Farb- und Wert-Funktionen">
             <w:r>
               <w:rPr>
                 <w:rStyle w:val="Verzeichnissprung"/>
@@ -1955,7 +1955,7 @@
             </w:tabs>
             <w:rPr/>
           </w:pPr>
-          <w:hyperlink w:anchor="__RefHeading___Toc5662_759348175" w:tooltip="11.3 Regel- und Dokument-Methoden">
+          <w:hyperlink w:anchor="__RefHeading___Toc5671_3214599740" w:tooltip="11.3 Regel- und Dokument-Methoden">
             <w:r>
               <w:rPr>
                 <w:rStyle w:val="Verzeichnissprung"/>
@@ -1975,7 +1975,7 @@
             </w:tabs>
             <w:rPr/>
           </w:pPr>
-          <w:hyperlink w:anchor="__RefHeading___Toc5664_759348175" w:tooltip="11.4 Sprite()">
+          <w:hyperlink w:anchor="__RefHeading___Toc5673_3214599740" w:tooltip="11.4 Sprite()">
             <w:r>
               <w:rPr>
                 <w:rStyle w:val="Verzeichnissprung"/>
@@ -1995,7 +1995,7 @@
             </w:tabs>
             <w:rPr/>
           </w:pPr>
-          <w:hyperlink w:anchor="__RefHeading___Toc5666_759348175" w:tooltip="11.5 Cursor()">
+          <w:hyperlink w:anchor="__RefHeading___Toc5675_3214599740" w:tooltip="11.5 Cursor()">
             <w:r>
               <w:rPr>
                 <w:rStyle w:val="Verzeichnissprung"/>
@@ -2015,7 +2015,7 @@
             </w:tabs>
             <w:rPr/>
           </w:pPr>
-          <w:hyperlink w:anchor="__RefHeading___Toc5668_759348175" w:tooltip="11.6 DataUri()">
+          <w:hyperlink w:anchor="__RefHeading___Toc5677_3214599740" w:tooltip="11.6 DataUri()">
             <w:r>
               <w:rPr>
                 <w:rStyle w:val="Verzeichnissprung"/>
@@ -2035,7 +2035,7 @@
             </w:tabs>
             <w:rPr/>
           </w:pPr>
-          <w:hyperlink w:anchor="__RefHeading___Toc5670_759348175" w:tooltip="11.7 Helper-Funktionen und this-Bindung">
+          <w:hyperlink w:anchor="__RefHeading___Toc5679_3214599740" w:tooltip="11.7 Helper-Funktionen und this-Bindung">
             <w:r>
               <w:rPr>
                 <w:rStyle w:val="Verzeichnissprung"/>
@@ -2055,7 +2055,7 @@
             </w:tabs>
             <w:rPr/>
           </w:pPr>
-          <w:hyperlink w:anchor="__RefHeading___Toc5672_759348175" w:tooltip="11.8 afterWork-Hooks">
+          <w:hyperlink w:anchor="__RefHeading___Toc5681_3214599740" w:tooltip="11.8 afterWork-Hooks">
             <w:r>
               <w:rPr>
                 <w:rStyle w:val="Verzeichnissprung"/>
@@ -2075,7 +2075,7 @@
             </w:tabs>
             <w:rPr/>
           </w:pPr>
-          <w:hyperlink w:anchor="__RefHeading___Toc5674_759348175" w:tooltip="12 Arbeiten mit Farben">
+          <w:hyperlink w:anchor="__RefHeading___Toc5683_3214599740" w:tooltip="12 Arbeiten mit Farben">
             <w:r>
               <w:rPr>
                 <w:rStyle w:val="Verzeichnissprung"/>
@@ -2095,7 +2095,7 @@
             </w:tabs>
             <w:rPr/>
           </w:pPr>
-          <w:hyperlink w:anchor="__RefHeading___Toc5676_759348175" w:tooltip="12.1 Farben definieren">
+          <w:hyperlink w:anchor="__RefHeading___Toc5685_3214599740" w:tooltip="12.1 Farben definieren">
             <w:r>
               <w:rPr>
                 <w:rStyle w:val="Verzeichnissprung"/>
@@ -2115,7 +2115,7 @@
             </w:tabs>
             <w:rPr/>
           </w:pPr>
-          <w:hyperlink w:anchor="__RefHeading___Toc5678_759348175" w:tooltip="12.2 Alpha-Werte">
+          <w:hyperlink w:anchor="__RefHeading___Toc5687_3214599740" w:tooltip="12.2 Alpha-Werte">
             <w:r>
               <w:rPr>
                 <w:rStyle w:val="Verzeichnissprung"/>
@@ -2135,7 +2135,7 @@
             </w:tabs>
             <w:rPr/>
           </w:pPr>
-          <w:hyperlink w:anchor="__RefHeading___Toc5680_759348175" w:tooltip="12.3 Farbberechnungen">
+          <w:hyperlink w:anchor="__RefHeading___Toc5689_3214599740" w:tooltip="12.3 Farbberechnungen">
             <w:r>
               <w:rPr>
                 <w:rStyle w:val="Verzeichnissprung"/>
@@ -2155,7 +2155,7 @@
             </w:tabs>
             <w:rPr/>
           </w:pPr>
-          <w:hyperlink w:anchor="__RefHeading___Toc5682_759348175" w:tooltip="13 Node-API">
+          <w:hyperlink w:anchor="__RefHeading___Toc5691_3214599740" w:tooltip="13 Node-API">
             <w:r>
               <w:rPr>
                 <w:rStyle w:val="Verzeichnissprung"/>
@@ -2175,7 +2175,7 @@
             </w:tabs>
             <w:rPr/>
           </w:pPr>
-          <w:hyperlink w:anchor="__RefHeading___Toc5684_759348175" w:tooltip="13.1 Versionshistorie-API (RELEASES.json)">
+          <w:hyperlink w:anchor="__RefHeading___Toc5693_3214599740" w:tooltip="13.1 Versionshistorie-API (RELEASES.json)">
             <w:r>
               <w:rPr>
                 <w:rStyle w:val="Verzeichnissprung"/>
@@ -2195,7 +2195,7 @@
             </w:tabs>
             <w:rPr/>
           </w:pPr>
-          <w:hyperlink w:anchor="__RefHeading___Toc5686_759348175" w:tooltip="14 Fehlerdiagnostik">
+          <w:hyperlink w:anchor="__RefHeading___Toc5695_3214599740" w:tooltip="14 Fehlerdiagnostik">
             <w:r>
               <w:rPr>
                 <w:rStyle w:val="Verzeichnissprung"/>
@@ -2215,7 +2215,7 @@
             </w:tabs>
             <w:rPr/>
           </w:pPr>
-          <w:hyperlink w:anchor="__RefHeading___Toc5688_759348175" w:tooltip="15 Migration von µCSS™">
+          <w:hyperlink w:anchor="__RefHeading___Toc5697_3214599740" w:tooltip="15 Migration von µCSS™">
             <w:r>
               <w:rPr>
                 <w:rStyle w:val="Verzeichnissprung"/>
@@ -2235,7 +2235,7 @@
             </w:tabs>
             <w:rPr/>
           </w:pPr>
-          <w:hyperlink w:anchor="__RefHeading___Toc5690_759348175" w:tooltip="16 Versionshistorie">
+          <w:hyperlink w:anchor="__RefHeading___Toc5699_3214599740" w:tooltip="16 Versionshistorie">
             <w:r>
               <w:rPr>
                 <w:rStyle w:val="Verzeichnissprung"/>
@@ -2255,7 +2255,7 @@
             </w:tabs>
             <w:rPr/>
           </w:pPr>
-          <w:hyperlink w:anchor="__RefHeading___Toc5692_759348175" w:tooltip="17 Rechtliches">
+          <w:hyperlink w:anchor="__RefHeading___Toc5701_3214599740" w:tooltip="17 Rechtliches">
             <w:r>
               <w:rPr>
                 <w:rStyle w:val="Verzeichnissprung"/>
@@ -2275,7 +2275,7 @@
             </w:tabs>
             <w:rPr/>
           </w:pPr>
-          <w:hyperlink w:anchor="__RefHeading___Toc5694_759348175" w:tooltip="17.1 MIT-Lizenz (Originaltext)">
+          <w:hyperlink w:anchor="__RefHeading___Toc5703_3214599740" w:tooltip="17.1 MIT-Lizenz (Originaltext)">
             <w:r>
               <w:rPr>
                 <w:rStyle w:val="Verzeichnissprung"/>
@@ -2295,7 +2295,7 @@
             </w:tabs>
             <w:rPr/>
           </w:pPr>
-          <w:hyperlink w:anchor="__RefHeading___Toc5696_759348175" w:tooltip="17.2 Marken">
+          <w:hyperlink w:anchor="__RefHeading___Toc5705_3214599740" w:tooltip="17.2 Marken">
             <w:r>
               <w:rPr>
                 <w:rStyle w:val="Verzeichnissprung"/>
@@ -2315,7 +2315,7 @@
             </w:tabs>
             <w:rPr/>
           </w:pPr>
-          <w:hyperlink w:anchor="__RefHeading___Toc5698_759348175" w:tooltip="17.3 Verwendete Bibliotheken">
+          <w:hyperlink w:anchor="__RefHeading___Toc5707_3214599740" w:tooltip="17.3 Verwendete Bibliotheken">
             <w:r>
               <w:rPr>
                 <w:rStyle w:val="Verzeichnissprung"/>
@@ -2366,7 +2366,7 @@
         <w:outlineLvl w:val="0"/>
         <w:rPr/>
       </w:pPr>
-      <w:bookmarkStart w:id="0" w:name="__RefHeading___Toc5488_759348175"/>
+      <w:bookmarkStart w:id="0" w:name="__RefHeading___Toc5497_3214599740"/>
       <w:bookmarkEnd w:id="0"/>
       <w:r>
         <w:rPr/>
@@ -2871,7 +2871,7 @@
         <w:outlineLvl w:val="1"/>
         <w:rPr/>
       </w:pPr>
-      <w:bookmarkStart w:id="1" w:name="__RefHeading___Toc5490_759348175"/>
+      <w:bookmarkStart w:id="1" w:name="__RefHeading___Toc5499_3214599740"/>
       <w:bookmarkEnd w:id="1"/>
       <w:r>
         <w:rPr/>
@@ -2887,7 +2887,7 @@
       </w:pPr>
       <w:r>
         <w:rPr/>
-        <w:t>Diese Ausgabe beschreibt µCSS 2.5.19, µPS 1.3.6, µFT 0.2.0 und µAU 0.1.8.</w:t>
+        <w:t>Diese Ausgabe beschreibt µCSS 2.5.20, µPS 1.3.6, µFT 0.2.0 und µAU 0.1.8.</w:t>
       </w:r>
     </w:p>
     <w:p>
@@ -3004,7 +3004,7 @@
         <w:outlineLvl w:val="1"/>
         <w:rPr/>
       </w:pPr>
-      <w:bookmarkStart w:id="2" w:name="__RefHeading___Toc5492_759348175"/>
+      <w:bookmarkStart w:id="2" w:name="__RefHeading___Toc5501_3214599740"/>
       <w:bookmarkEnd w:id="2"/>
       <w:r>
         <w:rPr/>
@@ -3257,7 +3257,7 @@
       </w:r>
       <w:r>
         <w:rPr/>
-        <w:t xml:space="preserve"> — Adobe Photoshop, Affinity, Photon Studio, Photopea: visuelle Arbeit, manuelle Entscheidungen und Zwischenschritte.</w:t>
+        <w:t xml:space="preserve"> — Adobe Photoshop, [Affinity](https://affinity.studio/download), [Photon Studio](https://tenzen.studio/photon/), [Photopea](https://www.photopea.com/): visuelle Arbeit, manuelle Entscheidungen und Zwischenschritte.</w:t>
       </w:r>
     </w:p>
     <w:p>
@@ -3399,7 +3399,7 @@
         <w:outlineLvl w:val="1"/>
         <w:rPr/>
       </w:pPr>
-      <w:bookmarkStart w:id="3" w:name="__RefHeading___Toc5494_759348175"/>
+      <w:bookmarkStart w:id="3" w:name="__RefHeading___Toc5503_3214599740"/>
       <w:bookmarkEnd w:id="3"/>
       <w:r>
         <w:rPr/>
@@ -4369,7 +4369,7 @@
         <w:outlineLvl w:val="2"/>
         <w:rPr/>
       </w:pPr>
-      <w:bookmarkStart w:id="4" w:name="__RefHeading___Toc5496_759348175"/>
+      <w:bookmarkStart w:id="4" w:name="__RefHeading___Toc5505_3214599740"/>
       <w:bookmarkEnd w:id="4"/>
       <w:r>
         <w:rPr/>
@@ -4609,7 +4609,7 @@
         <w:outlineLvl w:val="1"/>
         <w:rPr/>
       </w:pPr>
-      <w:bookmarkStart w:id="5" w:name="__RefHeading___Toc5498_759348175"/>
+      <w:bookmarkStart w:id="5" w:name="__RefHeading___Toc5507_3214599740"/>
       <w:bookmarkEnd w:id="5"/>
       <w:r>
         <w:rPr/>
@@ -5258,7 +5258,7 @@
         <w:outlineLvl w:val="0"/>
         <w:rPr/>
       </w:pPr>
-      <w:bookmarkStart w:id="6" w:name="__RefHeading___Toc5500_759348175"/>
+      <w:bookmarkStart w:id="6" w:name="__RefHeading___Toc5509_3214599740"/>
       <w:bookmarkEnd w:id="6"/>
       <w:r>
         <w:rPr/>
@@ -5584,7 +5584,7 @@
         <w:outlineLvl w:val="0"/>
         <w:rPr/>
       </w:pPr>
-      <w:bookmarkStart w:id="7" w:name="__RefHeading___Toc5502_759348175"/>
+      <w:bookmarkStart w:id="7" w:name="__RefHeading___Toc5511_3214599740"/>
       <w:bookmarkEnd w:id="7"/>
       <w:r>
         <w:rPr/>
@@ -5614,7 +5614,7 @@
         <w:outlineLvl w:val="1"/>
         <w:rPr/>
       </w:pPr>
-      <w:bookmarkStart w:id="8" w:name="__RefHeading___Toc5504_759348175"/>
+      <w:bookmarkStart w:id="8" w:name="__RefHeading___Toc5513_3214599740"/>
       <w:bookmarkEnd w:id="8"/>
       <w:r>
         <w:rPr/>
@@ -6271,7 +6271,7 @@
         <w:outlineLvl w:val="1"/>
         <w:rPr/>
       </w:pPr>
-      <w:bookmarkStart w:id="9" w:name="__RefHeading___Toc5506_759348175"/>
+      <w:bookmarkStart w:id="9" w:name="__RefHeading___Toc5515_3214599740"/>
       <w:bookmarkEnd w:id="9"/>
       <w:r>
         <w:rPr/>
@@ -6649,7 +6649,7 @@
         <w:outlineLvl w:val="1"/>
         <w:rPr/>
       </w:pPr>
-      <w:bookmarkStart w:id="10" w:name="__RefHeading___Toc5508_759348175"/>
+      <w:bookmarkStart w:id="10" w:name="__RefHeading___Toc5517_3214599740"/>
       <w:bookmarkEnd w:id="10"/>
       <w:r>
         <w:rPr/>
@@ -6967,7 +6967,7 @@
         <w:outlineLvl w:val="1"/>
         <w:rPr/>
       </w:pPr>
-      <w:bookmarkStart w:id="11" w:name="__RefHeading___Toc5510_759348175"/>
+      <w:bookmarkStart w:id="11" w:name="__RefHeading___Toc5519_3214599740"/>
       <w:bookmarkEnd w:id="11"/>
       <w:r>
         <w:rPr/>
@@ -7599,7 +7599,7 @@
         <w:outlineLvl w:val="1"/>
         <w:rPr/>
       </w:pPr>
-      <w:bookmarkStart w:id="12" w:name="__RefHeading___Toc5512_759348175"/>
+      <w:bookmarkStart w:id="12" w:name="__RefHeading___Toc5521_3214599740"/>
       <w:bookmarkEnd w:id="12"/>
       <w:r>
         <w:rPr/>
@@ -8730,7 +8730,7 @@
         <w:outlineLvl w:val="1"/>
         <w:rPr/>
       </w:pPr>
-      <w:bookmarkStart w:id="13" w:name="__RefHeading___Toc5514_759348175"/>
+      <w:bookmarkStart w:id="13" w:name="__RefHeading___Toc5523_3214599740"/>
       <w:bookmarkEnd w:id="13"/>
       <w:r>
         <w:rPr/>
@@ -8906,7 +8906,7 @@
         <w:outlineLvl w:val="1"/>
         <w:rPr/>
       </w:pPr>
-      <w:bookmarkStart w:id="14" w:name="__RefHeading___Toc5516_759348175"/>
+      <w:bookmarkStart w:id="14" w:name="__RefHeading___Toc5525_3214599740"/>
       <w:bookmarkEnd w:id="14"/>
       <w:r>
         <w:rPr/>
@@ -9271,7 +9271,7 @@
         <w:outlineLvl w:val="1"/>
         <w:rPr/>
       </w:pPr>
-      <w:bookmarkStart w:id="15" w:name="__RefHeading___Toc5518_759348175"/>
+      <w:bookmarkStart w:id="15" w:name="__RefHeading___Toc5527_3214599740"/>
       <w:bookmarkEnd w:id="15"/>
       <w:r>
         <w:rPr/>
@@ -9490,7 +9490,7 @@
         <w:outlineLvl w:val="2"/>
         <w:rPr/>
       </w:pPr>
-      <w:bookmarkStart w:id="16" w:name="__RefHeading___Toc5520_759348175"/>
+      <w:bookmarkStart w:id="16" w:name="__RefHeading___Toc5529_3214599740"/>
       <w:bookmarkEnd w:id="16"/>
       <w:r>
         <w:rPr/>
@@ -10335,7 +10335,7 @@
         <w:outlineLvl w:val="0"/>
         <w:rPr/>
       </w:pPr>
-      <w:bookmarkStart w:id="17" w:name="__RefHeading___Toc5522_759348175"/>
+      <w:bookmarkStart w:id="17" w:name="__RefHeading___Toc5531_3214599740"/>
       <w:bookmarkEnd w:id="17"/>
       <w:r>
         <w:rPr/>
@@ -10530,7 +10530,7 @@
         <w:outlineLvl w:val="1"/>
         <w:rPr/>
       </w:pPr>
-      <w:bookmarkStart w:id="18" w:name="__RefHeading___Toc5524_759348175"/>
+      <w:bookmarkStart w:id="18" w:name="__RefHeading___Toc5533_3214599740"/>
       <w:bookmarkEnd w:id="18"/>
       <w:r>
         <w:rPr/>
@@ -11842,7 +11842,7 @@
         <w:outlineLvl w:val="1"/>
         <w:rPr/>
       </w:pPr>
-      <w:bookmarkStart w:id="19" w:name="__RefHeading___Toc5526_759348175"/>
+      <w:bookmarkStart w:id="19" w:name="__RefHeading___Toc5535_3214599740"/>
       <w:bookmarkEnd w:id="19"/>
       <w:r>
         <w:rPr/>
@@ -12999,7 +12999,7 @@
         <w:outlineLvl w:val="2"/>
         <w:rPr/>
       </w:pPr>
-      <w:bookmarkStart w:id="20" w:name="__RefHeading___Toc5528_759348175"/>
+      <w:bookmarkStart w:id="20" w:name="__RefHeading___Toc5537_3214599740"/>
       <w:bookmarkEnd w:id="20"/>
       <w:r>
         <w:rPr/>
@@ -13238,7 +13238,7 @@
         <w:outlineLvl w:val="1"/>
         <w:rPr/>
       </w:pPr>
-      <w:bookmarkStart w:id="21" w:name="__RefHeading___Toc5530_759348175"/>
+      <w:bookmarkStart w:id="21" w:name="__RefHeading___Toc5539_3214599740"/>
       <w:bookmarkEnd w:id="21"/>
       <w:r>
         <w:rPr/>
@@ -13864,7 +13864,7 @@
         <w:outlineLvl w:val="1"/>
         <w:rPr/>
       </w:pPr>
-      <w:bookmarkStart w:id="22" w:name="__RefHeading___Toc5532_759348175"/>
+      <w:bookmarkStart w:id="22" w:name="__RefHeading___Toc5541_3214599740"/>
       <w:bookmarkEnd w:id="22"/>
       <w:r>
         <w:rPr/>
@@ -13929,7 +13929,7 @@
         <w:outlineLvl w:val="1"/>
         <w:rPr/>
       </w:pPr>
-      <w:bookmarkStart w:id="23" w:name="__RefHeading___Toc5534_759348175"/>
+      <w:bookmarkStart w:id="23" w:name="__RefHeading___Toc5543_3214599740"/>
       <w:bookmarkEnd w:id="23"/>
       <w:r>
         <w:rPr/>
@@ -14338,7 +14338,7 @@
         <w:outlineLvl w:val="2"/>
         <w:rPr/>
       </w:pPr>
-      <w:bookmarkStart w:id="24" w:name="__RefHeading___Toc5536_759348175"/>
+      <w:bookmarkStart w:id="24" w:name="__RefHeading___Toc5545_3214599740"/>
       <w:bookmarkEnd w:id="24"/>
       <w:r>
         <w:rPr/>
@@ -14636,7 +14636,7 @@
         <w:outlineLvl w:val="2"/>
         <w:rPr/>
       </w:pPr>
-      <w:bookmarkStart w:id="25" w:name="__RefHeading___Toc5538_759348175"/>
+      <w:bookmarkStart w:id="25" w:name="__RefHeading___Toc5547_3214599740"/>
       <w:bookmarkEnd w:id="25"/>
       <w:r>
         <w:rPr/>
@@ -14800,7 +14800,7 @@
         <w:outlineLvl w:val="1"/>
         <w:rPr/>
       </w:pPr>
-      <w:bookmarkStart w:id="26" w:name="__RefHeading___Toc5540_759348175"/>
+      <w:bookmarkStart w:id="26" w:name="__RefHeading___Toc5549_3214599740"/>
       <w:bookmarkEnd w:id="26"/>
       <w:r>
         <w:rPr/>
@@ -15734,7 +15734,7 @@
         <w:outlineLvl w:val="1"/>
         <w:rPr/>
       </w:pPr>
-      <w:bookmarkStart w:id="27" w:name="__RefHeading___Toc5542_759348175"/>
+      <w:bookmarkStart w:id="27" w:name="__RefHeading___Toc5551_3214599740"/>
       <w:bookmarkEnd w:id="27"/>
       <w:r>
         <w:rPr/>
@@ -15786,7 +15786,7 @@
         <w:outlineLvl w:val="2"/>
         <w:rPr/>
       </w:pPr>
-      <w:bookmarkStart w:id="28" w:name="__RefHeading___Toc5544_759348175"/>
+      <w:bookmarkStart w:id="28" w:name="__RefHeading___Toc5553_3214599740"/>
       <w:bookmarkEnd w:id="28"/>
       <w:r>
         <w:rPr/>
@@ -16109,7 +16109,7 @@
         <w:outlineLvl w:val="2"/>
         <w:rPr/>
       </w:pPr>
-      <w:bookmarkStart w:id="29" w:name="__RefHeading___Toc5546_759348175"/>
+      <w:bookmarkStart w:id="29" w:name="__RefHeading___Toc5555_3214599740"/>
       <w:bookmarkEnd w:id="29"/>
       <w:r>
         <w:rPr/>
@@ -16750,7 +16750,7 @@
         <w:outlineLvl w:val="2"/>
         <w:rPr/>
       </w:pPr>
-      <w:bookmarkStart w:id="30" w:name="__RefHeading___Toc5548_759348175"/>
+      <w:bookmarkStart w:id="30" w:name="__RefHeading___Toc5557_3214599740"/>
       <w:bookmarkEnd w:id="30"/>
       <w:r>
         <w:rPr/>
@@ -17224,7 +17224,7 @@
         <w:outlineLvl w:val="2"/>
         <w:rPr/>
       </w:pPr>
-      <w:bookmarkStart w:id="31" w:name="__RefHeading___Toc5550_759348175"/>
+      <w:bookmarkStart w:id="31" w:name="__RefHeading___Toc5559_3214599740"/>
       <w:bookmarkEnd w:id="31"/>
       <w:r>
         <w:rPr/>
@@ -17599,7 +17599,7 @@
         <w:outlineLvl w:val="2"/>
         <w:rPr/>
       </w:pPr>
-      <w:bookmarkStart w:id="32" w:name="__RefHeading___Toc5552_759348175"/>
+      <w:bookmarkStart w:id="32" w:name="__RefHeading___Toc5561_3214599740"/>
       <w:bookmarkEnd w:id="32"/>
       <w:r>
         <w:rPr/>
@@ -17990,7 +17990,7 @@
         <w:outlineLvl w:val="2"/>
         <w:rPr/>
       </w:pPr>
-      <w:bookmarkStart w:id="33" w:name="__RefHeading___Toc5554_759348175"/>
+      <w:bookmarkStart w:id="33" w:name="__RefHeading___Toc5563_3214599740"/>
       <w:bookmarkEnd w:id="33"/>
       <w:r>
         <w:rPr/>
@@ -18387,7 +18387,7 @@
         <w:outlineLvl w:val="1"/>
         <w:rPr/>
       </w:pPr>
-      <w:bookmarkStart w:id="34" w:name="__RefHeading___Toc5556_759348175"/>
+      <w:bookmarkStart w:id="34" w:name="__RefHeading___Toc5565_3214599740"/>
       <w:bookmarkEnd w:id="34"/>
       <w:r>
         <w:rPr/>
@@ -19443,7 +19443,7 @@
         <w:outlineLvl w:val="1"/>
         <w:rPr/>
       </w:pPr>
-      <w:bookmarkStart w:id="35" w:name="__RefHeading___Toc5558_759348175"/>
+      <w:bookmarkStart w:id="35" w:name="__RefHeading___Toc5567_3214599740"/>
       <w:bookmarkEnd w:id="35"/>
       <w:r>
         <w:rPr/>
@@ -20646,7 +20646,7 @@
         <w:outlineLvl w:val="1"/>
         <w:rPr/>
       </w:pPr>
-      <w:bookmarkStart w:id="36" w:name="__RefHeading___Toc5560_759348175"/>
+      <w:bookmarkStart w:id="36" w:name="__RefHeading___Toc5569_3214599740"/>
       <w:bookmarkEnd w:id="36"/>
       <w:r>
         <w:rPr/>
@@ -20775,7 +20775,7 @@
         <w:outlineLvl w:val="2"/>
         <w:rPr/>
       </w:pPr>
-      <w:bookmarkStart w:id="37" w:name="__RefHeading___Toc5562_759348175"/>
+      <w:bookmarkStart w:id="37" w:name="__RefHeading___Toc5571_3214599740"/>
       <w:bookmarkEnd w:id="37"/>
       <w:r>
         <w:rPr/>
@@ -23400,7 +23400,7 @@
         <w:outlineLvl w:val="2"/>
         <w:rPr/>
       </w:pPr>
-      <w:bookmarkStart w:id="38" w:name="__RefHeading___Toc5564_759348175"/>
+      <w:bookmarkStart w:id="38" w:name="__RefHeading___Toc5573_3214599740"/>
       <w:bookmarkEnd w:id="38"/>
       <w:r>
         <w:rPr/>
@@ -23872,7 +23872,7 @@
         <w:outlineLvl w:val="2"/>
         <w:rPr/>
       </w:pPr>
-      <w:bookmarkStart w:id="39" w:name="__RefHeading___Toc5566_759348175"/>
+      <w:bookmarkStart w:id="39" w:name="__RefHeading___Toc5575_3214599740"/>
       <w:bookmarkEnd w:id="39"/>
       <w:r>
         <w:rPr/>
@@ -24305,7 +24305,7 @@
         <w:outlineLvl w:val="2"/>
         <w:rPr/>
       </w:pPr>
-      <w:bookmarkStart w:id="40" w:name="__RefHeading___Toc5568_759348175"/>
+      <w:bookmarkStart w:id="40" w:name="__RefHeading___Toc5577_3214599740"/>
       <w:bookmarkEnd w:id="40"/>
       <w:r>
         <w:rPr/>
@@ -25279,7 +25279,7 @@
         <w:outlineLvl w:val="2"/>
         <w:rPr/>
       </w:pPr>
-      <w:bookmarkStart w:id="41" w:name="__RefHeading___Toc5570_759348175"/>
+      <w:bookmarkStart w:id="41" w:name="__RefHeading___Toc5579_3214599740"/>
       <w:bookmarkEnd w:id="41"/>
       <w:r>
         <w:rPr/>
@@ -25382,7 +25382,7 @@
         <w:outlineLvl w:val="1"/>
         <w:rPr/>
       </w:pPr>
-      <w:bookmarkStart w:id="42" w:name="__RefHeading___Toc5572_759348175"/>
+      <w:bookmarkStart w:id="42" w:name="__RefHeading___Toc5581_3214599740"/>
       <w:bookmarkEnd w:id="42"/>
       <w:r>
         <w:rPr/>
@@ -25684,7 +25684,7 @@
         <w:outlineLvl w:val="2"/>
         <w:rPr/>
       </w:pPr>
-      <w:bookmarkStart w:id="43" w:name="__RefHeading___Toc5574_759348175"/>
+      <w:bookmarkStart w:id="43" w:name="__RefHeading___Toc5583_3214599740"/>
       <w:bookmarkEnd w:id="43"/>
       <w:r>
         <w:rPr/>
@@ -25946,7 +25946,7 @@
         <w:outlineLvl w:val="0"/>
         <w:rPr/>
       </w:pPr>
-      <w:bookmarkStart w:id="44" w:name="__RefHeading___Toc5576_759348175"/>
+      <w:bookmarkStart w:id="44" w:name="__RefHeading___Toc5585_3214599740"/>
       <w:bookmarkEnd w:id="44"/>
       <w:r>
         <w:rPr/>
@@ -26092,7 +26092,7 @@
         <w:outlineLvl w:val="1"/>
         <w:rPr/>
       </w:pPr>
-      <w:bookmarkStart w:id="45" w:name="__RefHeading___Toc5578_759348175"/>
+      <w:bookmarkStart w:id="45" w:name="__RefHeading___Toc5587_3214599740"/>
       <w:bookmarkEnd w:id="45"/>
       <w:r>
         <w:rPr/>
@@ -26377,7 +26377,7 @@
         <w:outlineLvl w:val="1"/>
         <w:rPr/>
       </w:pPr>
-      <w:bookmarkStart w:id="46" w:name="__RefHeading___Toc5580_759348175"/>
+      <w:bookmarkStart w:id="46" w:name="__RefHeading___Toc5589_3214599740"/>
       <w:bookmarkEnd w:id="46"/>
       <w:r>
         <w:rPr/>
@@ -27410,7 +27410,7 @@
         <w:outlineLvl w:val="2"/>
         <w:rPr/>
       </w:pPr>
-      <w:bookmarkStart w:id="47" w:name="__RefHeading___Toc5582_759348175"/>
+      <w:bookmarkStart w:id="47" w:name="__RefHeading___Toc5591_3214599740"/>
       <w:bookmarkEnd w:id="47"/>
       <w:r>
         <w:rPr/>
@@ -27475,7 +27475,7 @@
         <w:outlineLvl w:val="2"/>
         <w:rPr/>
       </w:pPr>
-      <w:bookmarkStart w:id="48" w:name="__RefHeading___Toc5584_759348175"/>
+      <w:bookmarkStart w:id="48" w:name="__RefHeading___Toc5593_3214599740"/>
       <w:bookmarkEnd w:id="48"/>
       <w:r>
         <w:rPr/>
@@ -27569,7 +27569,7 @@
         <w:outlineLvl w:val="2"/>
         <w:rPr/>
       </w:pPr>
-      <w:bookmarkStart w:id="49" w:name="__RefHeading___Toc5586_759348175"/>
+      <w:bookmarkStart w:id="49" w:name="__RefHeading___Toc5595_3214599740"/>
       <w:bookmarkEnd w:id="49"/>
       <w:r>
         <w:rPr/>
@@ -27636,7 +27636,7 @@
         <w:outlineLvl w:val="1"/>
         <w:rPr/>
       </w:pPr>
-      <w:bookmarkStart w:id="50" w:name="__RefHeading___Toc5588_759348175"/>
+      <w:bookmarkStart w:id="50" w:name="__RefHeading___Toc5597_3214599740"/>
       <w:bookmarkEnd w:id="50"/>
       <w:r>
         <w:rPr/>
@@ -27972,7 +27972,7 @@
         <w:outlineLvl w:val="2"/>
         <w:rPr/>
       </w:pPr>
-      <w:bookmarkStart w:id="51" w:name="__RefHeading___Toc5590_759348175"/>
+      <w:bookmarkStart w:id="51" w:name="__RefHeading___Toc5599_3214599740"/>
       <w:bookmarkEnd w:id="51"/>
       <w:r>
         <w:rPr/>
@@ -28665,7 +28665,7 @@
         <w:outlineLvl w:val="0"/>
         <w:rPr/>
       </w:pPr>
-      <w:bookmarkStart w:id="52" w:name="__RefHeading___Toc5592_759348175"/>
+      <w:bookmarkStart w:id="52" w:name="__RefHeading___Toc5601_3214599740"/>
       <w:bookmarkEnd w:id="52"/>
       <w:r>
         <w:rPr/>
@@ -28849,7 +28849,7 @@
         <w:outlineLvl w:val="1"/>
         <w:rPr/>
       </w:pPr>
-      <w:bookmarkStart w:id="53" w:name="__RefHeading___Toc5594_759348175"/>
+      <w:bookmarkStart w:id="53" w:name="__RefHeading___Toc5603_3214599740"/>
       <w:bookmarkEnd w:id="53"/>
       <w:r>
         <w:rPr/>
@@ -29003,7 +29003,7 @@
         <w:outlineLvl w:val="1"/>
         <w:rPr/>
       </w:pPr>
-      <w:bookmarkStart w:id="54" w:name="__RefHeading___Toc5596_759348175"/>
+      <w:bookmarkStart w:id="54" w:name="__RefHeading___Toc5605_3214599740"/>
       <w:bookmarkEnd w:id="54"/>
       <w:r>
         <w:rPr/>
@@ -30464,7 +30464,7 @@
         <w:outlineLvl w:val="1"/>
         <w:rPr/>
       </w:pPr>
-      <w:bookmarkStart w:id="55" w:name="__RefHeading___Toc5598_759348175"/>
+      <w:bookmarkStart w:id="55" w:name="__RefHeading___Toc5607_3214599740"/>
       <w:bookmarkEnd w:id="55"/>
       <w:r>
         <w:rPr/>
@@ -30892,7 +30892,7 @@
         <w:outlineLvl w:val="1"/>
         <w:rPr/>
       </w:pPr>
-      <w:bookmarkStart w:id="56" w:name="__RefHeading___Toc5600_759348175"/>
+      <w:bookmarkStart w:id="56" w:name="__RefHeading___Toc5609_3214599740"/>
       <w:bookmarkEnd w:id="56"/>
       <w:r>
         <w:rPr/>
@@ -31169,7 +31169,7 @@
         <w:outlineLvl w:val="1"/>
         <w:rPr/>
       </w:pPr>
-      <w:bookmarkStart w:id="57" w:name="__RefHeading___Toc5602_759348175"/>
+      <w:bookmarkStart w:id="57" w:name="__RefHeading___Toc5611_3214599740"/>
       <w:bookmarkEnd w:id="57"/>
       <w:r>
         <w:rPr/>
@@ -31465,7 +31465,7 @@
         <w:outlineLvl w:val="0"/>
         <w:rPr/>
       </w:pPr>
-      <w:bookmarkStart w:id="58" w:name="__RefHeading___Toc5604_759348175"/>
+      <w:bookmarkStart w:id="58" w:name="__RefHeading___Toc5613_3214599740"/>
       <w:bookmarkEnd w:id="58"/>
       <w:r>
         <w:rPr/>
@@ -31594,7 +31594,7 @@
         <w:outlineLvl w:val="1"/>
         <w:rPr/>
       </w:pPr>
-      <w:bookmarkStart w:id="59" w:name="__RefHeading___Toc5606_759348175"/>
+      <w:bookmarkStart w:id="59" w:name="__RefHeading___Toc5615_3214599740"/>
       <w:bookmarkEnd w:id="59"/>
       <w:r>
         <w:rPr/>
@@ -31889,7 +31889,7 @@
         <w:outlineLvl w:val="1"/>
         <w:rPr/>
       </w:pPr>
-      <w:bookmarkStart w:id="60" w:name="__RefHeading___Toc5608_759348175"/>
+      <w:bookmarkStart w:id="60" w:name="__RefHeading___Toc5617_3214599740"/>
       <w:bookmarkEnd w:id="60"/>
       <w:r>
         <w:rPr/>
@@ -32044,7 +32044,7 @@
         <w:outlineLvl w:val="1"/>
         <w:rPr/>
       </w:pPr>
-      <w:bookmarkStart w:id="61" w:name="__RefHeading___Toc5610_759348175"/>
+      <w:bookmarkStart w:id="61" w:name="__RefHeading___Toc5619_3214599740"/>
       <w:bookmarkEnd w:id="61"/>
       <w:r>
         <w:rPr/>
@@ -32290,7 +32290,7 @@
         <w:outlineLvl w:val="0"/>
         <w:rPr/>
       </w:pPr>
-      <w:bookmarkStart w:id="62" w:name="__RefHeading___Toc5612_759348175"/>
+      <w:bookmarkStart w:id="62" w:name="__RefHeading___Toc5621_3214599740"/>
       <w:bookmarkEnd w:id="62"/>
       <w:r>
         <w:rPr/>
@@ -32308,7 +32308,7 @@
         <w:outlineLvl w:val="1"/>
         <w:rPr/>
       </w:pPr>
-      <w:bookmarkStart w:id="63" w:name="__RefHeading___Toc5614_759348175"/>
+      <w:bookmarkStart w:id="63" w:name="__RefHeading___Toc5623_3214599740"/>
       <w:bookmarkEnd w:id="63"/>
       <w:r>
         <w:rPr/>
@@ -32515,7 +32515,7 @@
         <w:outlineLvl w:val="1"/>
         <w:rPr/>
       </w:pPr>
-      <w:bookmarkStart w:id="64" w:name="__RefHeading___Toc5616_759348175"/>
+      <w:bookmarkStart w:id="64" w:name="__RefHeading___Toc5625_3214599740"/>
       <w:bookmarkEnd w:id="64"/>
       <w:r>
         <w:rPr/>
@@ -32801,7 +32801,7 @@
         <w:outlineLvl w:val="1"/>
         <w:rPr/>
       </w:pPr>
-      <w:bookmarkStart w:id="65" w:name="__RefHeading___Toc5618_759348175"/>
+      <w:bookmarkStart w:id="65" w:name="__RefHeading___Toc5627_3214599740"/>
       <w:bookmarkEnd w:id="65"/>
       <w:r>
         <w:rPr/>
@@ -33130,7 +33130,7 @@
         <w:outlineLvl w:val="1"/>
         <w:rPr/>
       </w:pPr>
-      <w:bookmarkStart w:id="66" w:name="__RefHeading___Toc5620_759348175"/>
+      <w:bookmarkStart w:id="66" w:name="__RefHeading___Toc5629_3214599740"/>
       <w:bookmarkEnd w:id="66"/>
       <w:r>
         <w:rPr/>
@@ -33802,7 +33802,7 @@
         <w:outlineLvl w:val="1"/>
         <w:rPr/>
       </w:pPr>
-      <w:bookmarkStart w:id="67" w:name="__RefHeading___Toc5622_759348175"/>
+      <w:bookmarkStart w:id="67" w:name="__RefHeading___Toc5631_3214599740"/>
       <w:bookmarkEnd w:id="67"/>
       <w:r>
         <w:rPr/>
@@ -34013,7 +34013,7 @@
         <w:outlineLvl w:val="0"/>
         <w:rPr/>
       </w:pPr>
-      <w:bookmarkStart w:id="68" w:name="__RefHeading___Toc5624_759348175"/>
+      <w:bookmarkStart w:id="68" w:name="__RefHeading___Toc5633_3214599740"/>
       <w:bookmarkEnd w:id="68"/>
       <w:r>
         <w:rPr/>
@@ -34056,7 +34056,7 @@
         <w:outlineLvl w:val="1"/>
         <w:rPr/>
       </w:pPr>
-      <w:bookmarkStart w:id="69" w:name="__RefHeading___Toc5626_759348175"/>
+      <w:bookmarkStart w:id="69" w:name="__RefHeading___Toc5635_3214599740"/>
       <w:bookmarkEnd w:id="69"/>
       <w:r>
         <w:rPr/>
@@ -34456,7 +34456,7 @@
         <w:outlineLvl w:val="1"/>
         <w:rPr/>
       </w:pPr>
-      <w:bookmarkStart w:id="70" w:name="__RefHeading___Toc5628_759348175"/>
+      <w:bookmarkStart w:id="70" w:name="__RefHeading___Toc5637_3214599740"/>
       <w:bookmarkEnd w:id="70"/>
       <w:r>
         <w:rPr/>
@@ -34707,7 +34707,7 @@
         <w:outlineLvl w:val="1"/>
         <w:rPr/>
       </w:pPr>
-      <w:bookmarkStart w:id="71" w:name="__RefHeading___Toc5630_759348175"/>
+      <w:bookmarkStart w:id="71" w:name="__RefHeading___Toc5639_3214599740"/>
       <w:bookmarkEnd w:id="71"/>
       <w:r>
         <w:rPr/>
@@ -34963,7 +34963,7 @@
         <w:outlineLvl w:val="1"/>
         <w:rPr/>
       </w:pPr>
-      <w:bookmarkStart w:id="72" w:name="__RefHeading___Toc5632_759348175"/>
+      <w:bookmarkStart w:id="72" w:name="__RefHeading___Toc5641_3214599740"/>
       <w:bookmarkEnd w:id="72"/>
       <w:r>
         <w:rPr/>
@@ -35413,7 +35413,7 @@
         <w:outlineLvl w:val="0"/>
         <w:rPr/>
       </w:pPr>
-      <w:bookmarkStart w:id="73" w:name="__RefHeading___Toc5634_759348175"/>
+      <w:bookmarkStart w:id="73" w:name="__RefHeading___Toc5643_3214599740"/>
       <w:bookmarkEnd w:id="73"/>
       <w:r>
         <w:rPr/>
@@ -35452,7 +35452,7 @@
         <w:outlineLvl w:val="1"/>
         <w:rPr/>
       </w:pPr>
-      <w:bookmarkStart w:id="74" w:name="__RefHeading___Toc5636_759348175"/>
+      <w:bookmarkStart w:id="74" w:name="__RefHeading___Toc5645_3214599740"/>
       <w:bookmarkEnd w:id="74"/>
       <w:r>
         <w:rPr/>
@@ -35550,7 +35550,7 @@
         <w:outlineLvl w:val="1"/>
         <w:rPr/>
       </w:pPr>
-      <w:bookmarkStart w:id="75" w:name="__RefHeading___Toc5638_759348175"/>
+      <w:bookmarkStart w:id="75" w:name="__RefHeading___Toc5647_3214599740"/>
       <w:bookmarkEnd w:id="75"/>
       <w:r>
         <w:rPr/>
@@ -35723,7 +35723,7 @@
         <w:outlineLvl w:val="1"/>
         <w:rPr/>
       </w:pPr>
-      <w:bookmarkStart w:id="76" w:name="__RefHeading___Toc5640_759348175"/>
+      <w:bookmarkStart w:id="76" w:name="__RefHeading___Toc5649_3214599740"/>
       <w:bookmarkEnd w:id="76"/>
       <w:r>
         <w:rPr/>
@@ -36340,7 +36340,7 @@
         <w:outlineLvl w:val="1"/>
         <w:rPr/>
       </w:pPr>
-      <w:bookmarkStart w:id="77" w:name="__RefHeading___Toc5642_759348175"/>
+      <w:bookmarkStart w:id="77" w:name="__RefHeading___Toc5651_3214599740"/>
       <w:bookmarkEnd w:id="77"/>
       <w:r>
         <w:rPr/>
@@ -37364,7 +37364,7 @@
         <w:outlineLvl w:val="1"/>
         <w:rPr/>
       </w:pPr>
-      <w:bookmarkStart w:id="78" w:name="__RefHeading___Toc5644_759348175"/>
+      <w:bookmarkStart w:id="78" w:name="__RefHeading___Toc5653_3214599740"/>
       <w:bookmarkEnd w:id="78"/>
       <w:r>
         <w:rPr/>
@@ -37737,7 +37737,7 @@
         <w:outlineLvl w:val="1"/>
         <w:rPr/>
       </w:pPr>
-      <w:bookmarkStart w:id="79" w:name="__RefHeading___Toc5646_759348175"/>
+      <w:bookmarkStart w:id="79" w:name="__RefHeading___Toc5655_3214599740"/>
       <w:bookmarkEnd w:id="79"/>
       <w:r>
         <w:rPr/>
@@ -38936,7 +38936,7 @@
         <w:outlineLvl w:val="1"/>
         <w:rPr/>
       </w:pPr>
-      <w:bookmarkStart w:id="80" w:name="__RefHeading___Toc5648_759348175"/>
+      <w:bookmarkStart w:id="80" w:name="__RefHeading___Toc5657_3214599740"/>
       <w:bookmarkEnd w:id="80"/>
       <w:r>
         <w:rPr/>
@@ -39498,7 +39498,7 @@
         <w:outlineLvl w:val="1"/>
         <w:rPr/>
       </w:pPr>
-      <w:bookmarkStart w:id="81" w:name="__RefHeading___Toc5650_759348175"/>
+      <w:bookmarkStart w:id="81" w:name="__RefHeading___Toc5659_3214599740"/>
       <w:bookmarkEnd w:id="81"/>
       <w:r>
         <w:rPr/>
@@ -40338,7 +40338,7 @@
         <w:outlineLvl w:val="1"/>
         <w:rPr/>
       </w:pPr>
-      <w:bookmarkStart w:id="82" w:name="__RefHeading___Toc5652_759348175"/>
+      <w:bookmarkStart w:id="82" w:name="__RefHeading___Toc5661_3214599740"/>
       <w:bookmarkEnd w:id="82"/>
       <w:r>
         <w:rPr/>
@@ -41826,7 +41826,7 @@
         <w:outlineLvl w:val="1"/>
         <w:rPr/>
       </w:pPr>
-      <w:bookmarkStart w:id="83" w:name="__RefHeading___Toc5654_759348175"/>
+      <w:bookmarkStart w:id="83" w:name="__RefHeading___Toc5663_3214599740"/>
       <w:bookmarkEnd w:id="83"/>
       <w:r>
         <w:rPr/>
@@ -41990,7 +41990,7 @@
         <w:outlineLvl w:val="0"/>
         <w:rPr/>
       </w:pPr>
-      <w:bookmarkStart w:id="84" w:name="__RefHeading___Toc5656_759348175"/>
+      <w:bookmarkStart w:id="84" w:name="__RefHeading___Toc5665_3214599740"/>
       <w:bookmarkEnd w:id="84"/>
       <w:r>
         <w:rPr/>
@@ -42059,7 +42059,7 @@
         <w:outlineLvl w:val="1"/>
         <w:rPr/>
       </w:pPr>
-      <w:bookmarkStart w:id="85" w:name="__RefHeading___Toc5658_759348175"/>
+      <w:bookmarkStart w:id="85" w:name="__RefHeading___Toc5667_3214599740"/>
       <w:bookmarkEnd w:id="85"/>
       <w:r>
         <w:rPr/>
@@ -42140,7 +42140,7 @@
         <w:outlineLvl w:val="1"/>
         <w:rPr/>
       </w:pPr>
-      <w:bookmarkStart w:id="86" w:name="__RefHeading___Toc5660_759348175"/>
+      <w:bookmarkStart w:id="86" w:name="__RefHeading___Toc5669_3214599740"/>
       <w:bookmarkEnd w:id="86"/>
       <w:r>
         <w:rPr/>
@@ -42750,7 +42750,7 @@
         <w:outlineLvl w:val="1"/>
         <w:rPr/>
       </w:pPr>
-      <w:bookmarkStart w:id="87" w:name="__RefHeading___Toc5662_759348175"/>
+      <w:bookmarkStart w:id="87" w:name="__RefHeading___Toc5671_3214599740"/>
       <w:bookmarkEnd w:id="87"/>
       <w:r>
         <w:rPr/>
@@ -43333,7 +43333,7 @@
         <w:outlineLvl w:val="1"/>
         <w:rPr/>
       </w:pPr>
-      <w:bookmarkStart w:id="88" w:name="__RefHeading___Toc5664_759348175"/>
+      <w:bookmarkStart w:id="88" w:name="__RefHeading___Toc5673_3214599740"/>
       <w:bookmarkEnd w:id="88"/>
       <w:r>
         <w:rPr/>
@@ -44114,7 +44114,7 @@
         <w:outlineLvl w:val="1"/>
         <w:rPr/>
       </w:pPr>
-      <w:bookmarkStart w:id="89" w:name="__RefHeading___Toc5666_759348175"/>
+      <w:bookmarkStart w:id="89" w:name="__RefHeading___Toc5675_3214599740"/>
       <w:bookmarkEnd w:id="89"/>
       <w:r>
         <w:rPr/>
@@ -44209,7 +44209,7 @@
         <w:outlineLvl w:val="1"/>
         <w:rPr/>
       </w:pPr>
-      <w:bookmarkStart w:id="90" w:name="__RefHeading___Toc5668_759348175"/>
+      <w:bookmarkStart w:id="90" w:name="__RefHeading___Toc5677_3214599740"/>
       <w:bookmarkEnd w:id="90"/>
       <w:r>
         <w:rPr/>
@@ -44378,7 +44378,7 @@
         <w:outlineLvl w:val="1"/>
         <w:rPr/>
       </w:pPr>
-      <w:bookmarkStart w:id="91" w:name="__RefHeading___Toc5670_759348175"/>
+      <w:bookmarkStart w:id="91" w:name="__RefHeading___Toc5679_3214599740"/>
       <w:bookmarkEnd w:id="91"/>
       <w:r>
         <w:rPr/>
@@ -44842,7 +44842,7 @@
         <w:outlineLvl w:val="1"/>
         <w:rPr/>
       </w:pPr>
-      <w:bookmarkStart w:id="92" w:name="__RefHeading___Toc5672_759348175"/>
+      <w:bookmarkStart w:id="92" w:name="__RefHeading___Toc5681_3214599740"/>
       <w:bookmarkEnd w:id="92"/>
       <w:r>
         <w:rPr/>
@@ -45380,7 +45380,7 @@
         <w:outlineLvl w:val="0"/>
         <w:rPr/>
       </w:pPr>
-      <w:bookmarkStart w:id="93" w:name="__RefHeading___Toc5674_759348175"/>
+      <w:bookmarkStart w:id="93" w:name="__RefHeading___Toc5683_3214599740"/>
       <w:bookmarkEnd w:id="93"/>
       <w:r>
         <w:rPr/>
@@ -45398,7 +45398,7 @@
         <w:outlineLvl w:val="1"/>
         <w:rPr/>
       </w:pPr>
-      <w:bookmarkStart w:id="94" w:name="__RefHeading___Toc5676_759348175"/>
+      <w:bookmarkStart w:id="94" w:name="__RefHeading___Toc5685_3214599740"/>
       <w:bookmarkEnd w:id="94"/>
       <w:r>
         <w:rPr/>
@@ -45819,7 +45819,7 @@
         <w:outlineLvl w:val="1"/>
         <w:rPr/>
       </w:pPr>
-      <w:bookmarkStart w:id="95" w:name="__RefHeading___Toc5678_759348175"/>
+      <w:bookmarkStart w:id="95" w:name="__RefHeading___Toc5687_3214599740"/>
       <w:bookmarkEnd w:id="95"/>
       <w:r>
         <w:rPr/>
@@ -46102,7 +46102,7 @@
         <w:outlineLvl w:val="1"/>
         <w:rPr/>
       </w:pPr>
-      <w:bookmarkStart w:id="96" w:name="__RefHeading___Toc5680_759348175"/>
+      <w:bookmarkStart w:id="96" w:name="__RefHeading___Toc5689_3214599740"/>
       <w:bookmarkEnd w:id="96"/>
       <w:r>
         <w:rPr/>
@@ -46355,7 +46355,7 @@
         <w:outlineLvl w:val="0"/>
         <w:rPr/>
       </w:pPr>
-      <w:bookmarkStart w:id="97" w:name="__RefHeading___Toc5682_759348175"/>
+      <w:bookmarkStart w:id="97" w:name="__RefHeading___Toc5691_3214599740"/>
       <w:bookmarkEnd w:id="97"/>
       <w:r>
         <w:rPr/>
@@ -47686,7 +47686,7 @@
         <w:outlineLvl w:val="1"/>
         <w:rPr/>
       </w:pPr>
-      <w:bookmarkStart w:id="98" w:name="__RefHeading___Toc5684_759348175"/>
+      <w:bookmarkStart w:id="98" w:name="__RefHeading___Toc5693_3214599740"/>
       <w:bookmarkEnd w:id="98"/>
       <w:r>
         <w:rPr/>
@@ -48437,7 +48437,7 @@
         <w:outlineLvl w:val="0"/>
         <w:rPr/>
       </w:pPr>
-      <w:bookmarkStart w:id="99" w:name="__RefHeading___Toc5686_759348175"/>
+      <w:bookmarkStart w:id="99" w:name="__RefHeading___Toc5695_3214599740"/>
       <w:bookmarkEnd w:id="99"/>
       <w:r>
         <w:rPr/>
@@ -48953,7 +48953,7 @@
         <w:outlineLvl w:val="0"/>
         <w:rPr/>
       </w:pPr>
-      <w:bookmarkStart w:id="100" w:name="__RefHeading___Toc5688_759348175"/>
+      <w:bookmarkStart w:id="100" w:name="__RefHeading___Toc5697_3214599740"/>
       <w:bookmarkEnd w:id="100"/>
       <w:r>
         <w:rPr/>
@@ -50176,7 +50176,7 @@
         <w:outlineLvl w:val="0"/>
         <w:rPr/>
       </w:pPr>
-      <w:bookmarkStart w:id="101" w:name="__RefHeading___Toc5690_759348175"/>
+      <w:bookmarkStart w:id="101" w:name="__RefHeading___Toc5699_3214599740"/>
       <w:bookmarkEnd w:id="101"/>
       <w:r>
         <w:rPr/>
@@ -52312,6 +52312,75 @@
           </w:p>
         </w:tc>
       </w:tr>
+      <w:tr>
+        <w:trPr/>
+        <w:tc>
+          <w:tcPr>
+            <w:tcW w:w="3008" w:type="dxa"/>
+            <w:tcBorders>
+              <w:top w:val="single" w:sz="4" w:space="0" w:color="999999"/>
+              <w:start w:val="single" w:sz="4" w:space="0" w:color="999999"/>
+              <w:bottom w:val="single" w:sz="4" w:space="0" w:color="999999"/>
+              <w:end w:val="single" w:sz="4" w:space="0" w:color="999999"/>
+            </w:tcBorders>
+          </w:tcPr>
+          <w:p>
+            <w:pPr>
+              <w:pStyle w:val="Normal"/>
+              <w:spacing w:before="40" w:after="40"/>
+              <w:rPr/>
+            </w:pPr>
+            <w:r>
+              <w:rPr/>
+              <w:t>2026-10</w:t>
+            </w:r>
+          </w:p>
+        </w:tc>
+        <w:tc>
+          <w:tcPr>
+            <w:tcW w:w="3009" w:type="dxa"/>
+            <w:tcBorders>
+              <w:top w:val="single" w:sz="4" w:space="0" w:color="999999"/>
+              <w:start w:val="single" w:sz="4" w:space="0" w:color="999999"/>
+              <w:bottom w:val="single" w:sz="4" w:space="0" w:color="999999"/>
+              <w:end w:val="single" w:sz="4" w:space="0" w:color="999999"/>
+            </w:tcBorders>
+          </w:tcPr>
+          <w:p>
+            <w:pPr>
+              <w:pStyle w:val="Normal"/>
+              <w:spacing w:before="40" w:after="40"/>
+              <w:rPr/>
+            </w:pPr>
+            <w:r>
+              <w:rPr/>
+              <w:t>2.5.20</w:t>
+            </w:r>
+          </w:p>
+        </w:tc>
+        <w:tc>
+          <w:tcPr>
+            <w:tcW w:w="3009" w:type="dxa"/>
+            <w:tcBorders>
+              <w:top w:val="single" w:sz="4" w:space="0" w:color="999999"/>
+              <w:start w:val="single" w:sz="4" w:space="0" w:color="999999"/>
+              <w:bottom w:val="single" w:sz="4" w:space="0" w:color="999999"/>
+              <w:end w:val="single" w:sz="4" w:space="0" w:color="999999"/>
+            </w:tcBorders>
+          </w:tcPr>
+          <w:p>
+            <w:pPr>
+              <w:pStyle w:val="Normal"/>
+              <w:spacing w:before="40" w:after="40"/>
+              <w:rPr/>
+            </w:pPr>
+            <w:r>
+              <w:rPr/>
+              <w:t>Doku/READMEs: Link zu Photon Studio ([tenzen.studio/photon](https://tenzen.studio/photon/)) in Authoring-Tabellen und Projekt-Links.</w:t>
+            </w:r>
+          </w:p>
+        </w:tc>
+      </w:tr>
     </w:tbl>
     <w:p>
       <w:pPr>
@@ -52337,7 +52406,7 @@
         <w:outlineLvl w:val="0"/>
         <w:rPr/>
       </w:pPr>
-      <w:bookmarkStart w:id="102" w:name="__RefHeading___Toc5692_759348175"/>
+      <w:bookmarkStart w:id="102" w:name="__RefHeading___Toc5701_3214599740"/>
       <w:bookmarkEnd w:id="102"/>
       <w:r>
         <w:rPr/>
@@ -52379,7 +52448,7 @@
         <w:outlineLvl w:val="1"/>
         <w:rPr/>
       </w:pPr>
-      <w:bookmarkStart w:id="103" w:name="__RefHeading___Toc5694_759348175"/>
+      <w:bookmarkStart w:id="103" w:name="__RefHeading___Toc5703_3214599740"/>
       <w:bookmarkEnd w:id="103"/>
       <w:r>
         <w:rPr/>
@@ -52433,7 +52502,7 @@
         <w:outlineLvl w:val="1"/>
         <w:rPr/>
       </w:pPr>
-      <w:bookmarkStart w:id="104" w:name="__RefHeading___Toc5696_759348175"/>
+      <w:bookmarkStart w:id="104" w:name="__RefHeading___Toc5705_3214599740"/>
       <w:bookmarkEnd w:id="104"/>
       <w:r>
         <w:rPr/>
@@ -52449,7 +52518,7 @@
       </w:pPr>
       <w:r>
         <w:rPr/>
-        <w:t>Photoshop ist eine eingetragene Marke von Adobe Inc.; Affinity Photo ist eine Marke von Serif (Europe) Ltd. Photopea ist ein unabhängiger Online-Fotoeditor ([photopea.com](https://www.photopea.com/)). Photon Studio wird als Desktop-Bildeditor nur zur Identifikation genannt. Die Nennung von Namen und Produkten dient ausschließlich der Information und stellt keinen Missbrauch der jeweiligen Handelsnamen oder Marken dar.</w:t>
+        <w:t>Photoshop ist eine eingetragene Marke von Adobe Inc.; Affinity Photo ist eine Marke von Serif (Europe) Ltd. Photopea ist ein unabhängiger Online-Fotoeditor ([photopea.com](https://www.photopea.com/)). Photon Studio ist ein kostenloser Desktop-Bildeditor von Tenzen Studio ([tenzen.studio/photon](https://tenzen.studio/photon/)). Die Nennung von Namen und Produkten dient ausschließlich der Information und stellt keinen Missbrauch der jeweiligen Handelsnamen oder Marken dar.</w:t>
       </w:r>
     </w:p>
     <w:p>
@@ -52463,7 +52532,7 @@
         <w:outlineLvl w:val="1"/>
         <w:rPr/>
       </w:pPr>
-      <w:bookmarkStart w:id="105" w:name="__RefHeading___Toc5698_759348175"/>
+      <w:bookmarkStart w:id="105" w:name="__RefHeading___Toc5707_3214599740"/>
       <w:bookmarkEnd w:id="105"/>
       <w:r>
         <w:rPr/>

</xml_diff>